<commit_message>
docs: finalize CodeRogue development report
</commit_message>
<xml_diff>
--- a/CodeRogue-软件开发文档.docx
+++ b/CodeRogue-软件开发文档.docx
@@ -990,7 +990,7 @@
         </w:rPr>
       </w:pPr>
       <w:r>
-        <w:t>每局远征由“追猎迷宫→模块奖励→路线选择→安保中心→模块奖励→维护舱→火控核心→行动完成”组成，玩家依靠 Prepared Firmware 或自行修改固件，在 Debugger、Trace 与资源继承的约束下推进三个连续战斗关卡。其核心价值是让玩家通过调试代码直接改变战斗结果。</w:t>
+        <w:t>每局远征由“追猎迷宫 → 模块奖励 → 路线选择 → 安保中心 → 模块奖励 → 维护舱 → 火控核心 → 行动完成”组成，玩家依靠 Prepared Firmware 或自行修改固件，在 Debugger、Trace 与资源继承的约束下推进三个连续战斗关卡。其核心价值是让玩家通过调试代码直接改变战斗结果。</w:t>
       </w:r>
     </w:p>
     <w:p>
@@ -2301,33 +2301,6 @@
         <w:t>4.2 模块划分</w:t>
       </w:r>
     </w:p>
-    <w:p>
-      <w:pPr>
-        <w:rPr>
-          <w:lang w:eastAsia="zh-CN"/>
-        </w:rPr>
-      </w:pPr>
-      <w:r>
-        <w:rPr>
-          <w:rFonts w:ascii="微软雅黑" w:eastAsia="微软雅黑" w:hAnsi="微软雅黑" w:cs="微软雅黑" w:hint="eastAsia"/>
-          <w:lang w:eastAsia="zh-CN"/>
-        </w:rPr>
-        <w:t>说明软件由哪些模块</w:t>
-      </w:r>
-      <w:r>
-        <w:rPr>
-          <w:lang w:eastAsia="zh-CN"/>
-        </w:rPr>
-        <w:t>/</w:t>
-      </w:r>
-      <w:r>
-        <w:rPr>
-          <w:rFonts w:ascii="微软雅黑" w:eastAsia="微软雅黑" w:hAnsi="微软雅黑" w:cs="微软雅黑" w:hint="eastAsia"/>
-          <w:lang w:eastAsia="zh-CN"/>
-        </w:rPr>
-        <w:t>文件组成，每个模块的职责是什么。</w:t>
-      </w:r>
-    </w:p>
     <w:tbl>
       <w:tblPr>
         <w:tblW w:w="5000" w:type="pct"/>
@@ -2588,31 +2561,31 @@
       <w:tr>
         <w:tc>
           <w:tcPr>
-            <w:tcW w:w="8640" w:type="dxa"/>
-            <w:gridSpan w:val="3"/>
-            <w:tcBorders>
-              <w:top w:val="single" w:sz="6" w:space="0" w:color="E0E0E0"/>
-              <w:left w:val="single" w:sz="6" w:space="0" w:color="E0E0E0"/>
-              <w:bottom w:val="single" w:sz="6" w:space="0" w:color="E0E0E0"/>
-              <w:right w:val="single" w:sz="6" w:space="0" w:color="E0E0E0"/>
-            </w:tcBorders>
-            <w:shd w:val="clear" w:color="auto" w:fill="F7F9FC"/>
-            <w:tcMar>
-              <w:top w:w="120" w:type="dxa"/>
-              <w:left w:w="150" w:type="dxa"/>
-              <w:bottom w:w="120" w:type="dxa"/>
-              <w:right w:w="150" w:type="dxa"/>
-            </w:tcMar>
-            <w:vAlign w:val="center"/>
-          </w:tcPr>
-          <w:p>
-            <w:pPr>
-              <w:spacing w:before="60" w:after="60" w:line="240" w:lineRule="auto"/>
-            </w:pPr>
-            <w:proofErr w:type="spellStart"/>
-            <w:proofErr w:type="spellEnd"/>
-            <w:r>
-              <w:t>Parser、Interpreter、RuntimeHost</w:t>
+            <w:tcW w:type="dxa" w:w="2777"/>
+          </w:tcPr>
+          <w:p>
+            <w:r>
+              <w:t xml:space="preserve">src/language.ts</w:t>
+            </w:r>
+          </w:p>
+        </w:tc>
+        <w:tc>
+          <w:tcPr>
+            <w:tcW w:type="dxa" w:w="2764"/>
+          </w:tcPr>
+          <w:p>
+            <w:r>
+              <w:t xml:space="preserve">RoboC++ 词法/语法/解释执行</w:t>
+            </w:r>
+          </w:p>
+        </w:tc>
+        <w:tc>
+          <w:tcPr>
+            <w:tcW w:type="dxa" w:w="2771"/>
+          </w:tcPr>
+          <w:p>
+            <w:r>
+              <w:t xml:space="preserve">Parser、Interpreter、RuntimeHost</w:t>
             </w:r>
           </w:p>
         </w:tc>
@@ -2709,6 +2682,38 @@
           <w:p>
             <w:r>
               <w:t>runRoomModifiers、FinalRogueRun</w:t>
+            </w:r>
+          </w:p>
+        </w:tc>
+      </w:tr>
+      <w:tr>
+        <w:tc>
+          <w:tcPr>
+            <w:tcW w:type="dxa" w:w="2777"/>
+          </w:tcPr>
+          <w:p>
+            <w:r>
+              <w:t>tests/</w:t>
+            </w:r>
+          </w:p>
+        </w:tc>
+        <w:tc>
+          <w:tcPr>
+            <w:tcW w:type="dxa" w:w="2764"/>
+          </w:tcPr>
+          <w:p>
+            <w:r>
+              <w:t>自动测试与回归保护</w:t>
+            </w:r>
+          </w:p>
+        </w:tc>
+        <w:tc>
+          <w:tcPr>
+            <w:tcW w:type="dxa" w:w="2771"/>
+          </w:tcPr>
+          <w:p>
+            <w:r>
+              <w:t>Vitest 用例</w:t>
             </w:r>
           </w:p>
         </w:tc>
@@ -2887,34 +2892,6 @@
         </w:tc>
       </w:tr>
       <w:tr>
-        <w:tc>
-          <w:tcPr>
-            <w:tcW w:w="2160" w:type="dxa"/>
-            <w:vMerge w:val="restart"/>
-            <w:tcBorders>
-              <w:top w:val="single" w:sz="6" w:space="0" w:color="E0E0E0"/>
-              <w:left w:val="single" w:sz="6" w:space="0" w:color="E0E0E0"/>
-              <w:bottom w:val="single" w:sz="6" w:space="0" w:color="E0E0E0"/>
-              <w:right w:val="single" w:sz="6" w:space="0" w:color="E0E0E0"/>
-            </w:tcBorders>
-            <w:shd w:val="clear" w:color="auto" w:fill="F7F9FC"/>
-            <w:tcMar>
-              <w:top w:w="120" w:type="dxa"/>
-              <w:left w:w="150" w:type="dxa"/>
-              <w:bottom w:w="120" w:type="dxa"/>
-              <w:right w:w="150" w:type="dxa"/>
-            </w:tcMar>
-            <w:vAlign w:val="center"/>
-          </w:tcPr>
-          <w:p>
-            <w:pPr>
-              <w:spacing w:before="60" w:after="60" w:line="240" w:lineRule="auto"/>
-            </w:pPr>
-            <w:r>
-              <w:t>FinalRogueRunState</w:t>
-            </w:r>
-          </w:p>
-        </w:tc>
         <w:tc>
           <w:tcPr>
             <w:tcW w:w="2160" w:type="dxa"/>
@@ -2938,7 +2915,7 @@
               <w:spacing w:before="60" w:after="60" w:line="240" w:lineRule="auto"/>
             </w:pPr>
             <w:r>
-              <w:t>kind / hp / damage / moveEvery / attackEvery / range / active</w:t>
+              <w:t xml:space="preserve">Enemy</w:t>
             </w:r>
           </w:p>
         </w:tc>
@@ -2965,7 +2942,7 @@
               <w:spacing w:before="60" w:after="60" w:line="240" w:lineRule="auto"/>
             </w:pPr>
             <w:r>
-              <w:t>slime | runner | swarm | guard | turret | tank</w:t>
+              <w:t xml:space="preserve">kind / hp / x / y / damage / moveEvery / attackEvery / range / active</w:t>
             </w:r>
           </w:p>
         </w:tc>
@@ -2991,102 +2968,10 @@
             <w:pPr>
               <w:spacing w:before="60" w:after="60" w:line="240" w:lineRule="auto"/>
             </w:pPr>
-            <w:proofErr w:type="spellStart"/>
-            <w:proofErr w:type="spellEnd"/>
-            <w:proofErr w:type="spellStart"/>
-            <w:proofErr w:type="spellEnd"/>
-            <w:r>
-              <w:t>单敌人行为原型；damage 可选覆盖全局 incomingDamage</w:t>
-            </w:r>
-          </w:p>
-        </w:tc>
-      </w:tr>
-      <w:tr>
-        <w:tc>
-          <w:tcPr>
-            <w:tcW w:w="2160" w:type="dxa"/>
-            <w:vMerge/>
-          </w:tcPr>
-          <w:p/>
-        </w:tc>
-        <w:tc>
-          <w:tcPr>
-            <w:tcW w:w="2160" w:type="dxa"/>
-            <w:tcBorders>
-              <w:top w:val="single" w:sz="6" w:space="0" w:color="E0E0E0"/>
-              <w:left w:val="single" w:sz="6" w:space="0" w:color="E0E0E0"/>
-              <w:bottom w:val="single" w:sz="6" w:space="0" w:color="E0E0E0"/>
-              <w:right w:val="single" w:sz="6" w:space="0" w:color="E0E0E0"/>
-            </w:tcBorders>
-            <w:tcMar>
-              <w:top w:w="120" w:type="dxa"/>
-              <w:left w:w="150" w:type="dxa"/>
-              <w:bottom w:w="120" w:type="dxa"/>
-              <w:right w:w="150" w:type="dxa"/>
-            </w:tcMar>
-            <w:vAlign w:val="center"/>
-          </w:tcPr>
-          <w:p>
-            <w:pPr>
-              <w:spacing w:before="60" w:after="60" w:line="240" w:lineRule="auto"/>
-            </w:pPr>
-            <w:r>
-              <w:t>success / ticks / hp / energy / damageTaken / killOrder</w:t>
-            </w:r>
-          </w:p>
-        </w:tc>
-        <w:tc>
-          <w:tcPr>
-            <w:tcW w:w="2160" w:type="dxa"/>
-            <w:tcBorders>
-              <w:top w:val="single" w:sz="6" w:space="0" w:color="E0E0E0"/>
-              <w:left w:val="single" w:sz="6" w:space="0" w:color="E0E0E0"/>
-              <w:bottom w:val="single" w:sz="6" w:space="0" w:color="E0E0E0"/>
-              <w:right w:val="single" w:sz="6" w:space="0" w:color="E0E0E0"/>
-            </w:tcBorders>
-            <w:tcMar>
-              <w:top w:w="120" w:type="dxa"/>
-              <w:left w:w="150" w:type="dxa"/>
-              <w:bottom w:w="120" w:type="dxa"/>
-              <w:right w:w="150" w:type="dxa"/>
-            </w:tcMar>
-            <w:vAlign w:val="center"/>
-          </w:tcPr>
-          <w:p>
-            <w:pPr>
-              <w:spacing w:before="60" w:after="60" w:line="240" w:lineRule="auto"/>
-            </w:pPr>
-            <w:r>
-              <w:t>boolean / number / string[]</w:t>
-            </w:r>
-          </w:p>
-        </w:tc>
-        <w:tc>
-          <w:tcPr>
-            <w:tcW w:w="2160" w:type="dxa"/>
-            <w:tcBorders>
-              <w:top w:val="single" w:sz="6" w:space="0" w:color="E0E0E0"/>
-              <w:left w:val="single" w:sz="6" w:space="0" w:color="E0E0E0"/>
-              <w:bottom w:val="single" w:sz="6" w:space="0" w:color="E0E0E0"/>
-              <w:right w:val="single" w:sz="6" w:space="0" w:color="E0E0E0"/>
-            </w:tcBorders>
-          </w:tcPr>
-          <w:p>
-            <w:proofErr w:type="spellStart"/>
-            <w:proofErr w:type="spellEnd"/>
-            <w:r>
-              <w:t>单场战斗可验证结果</w:t>
-            </w:r>
-          </w:p>
-        </w:tc>
-      </w:tr>
-      <w:tr>
-        <w:tc>
-          <w:tcPr>
-            <w:tcW w:w="2160" w:type="dxa"/>
-            <w:vMerge/>
-          </w:tcPr>
-          <w:p/>
+            <w:r>
+              <w:t xml:space="preserve">slime | runner | swarm | guard | turret | tank</w:t>
+            </w:r>
+          </w:p>
         </w:tc>
         <w:tc>
           <w:tcPr>
@@ -3110,8 +2995,106 @@
             <w:pPr>
               <w:spacing w:before="60" w:after="60" w:line="240" w:lineRule="auto"/>
             </w:pPr>
-            <w:r>
-              <w:t>phase / hp / energy / modules / branch / restChoice / stats</w:t>
+            <w:proofErr w:type="spellStart"/>
+            <w:proofErr w:type="spellEnd"/>
+            <w:proofErr w:type="spellStart"/>
+            <w:proofErr w:type="spellEnd"/>
+            <w:r>
+              <w:t xml:space="preserve">单个敌人的运行状态与行为参数；damage 为 optional override，未提供时使用全局 incomingDamage</w:t>
+            </w:r>
+          </w:p>
+        </w:tc>
+      </w:tr>
+      <w:tr>
+        <w:tc>
+          <w:tcPr>
+            <w:tcW w:w="2160" w:type="dxa"/>
+          </w:tcPr>
+          <w:p>
+            <w:r>
+              <w:t xml:space="preserve">RogueCombatStats</w:t>
+            </w:r>
+          </w:p>
+        </w:tc>
+        <w:tc>
+          <w:tcPr>
+            <w:tcW w:w="2160" w:type="dxa"/>
+            <w:tcBorders>
+              <w:top w:val="single" w:sz="6" w:space="0" w:color="E0E0E0"/>
+              <w:left w:val="single" w:sz="6" w:space="0" w:color="E0E0E0"/>
+              <w:bottom w:val="single" w:sz="6" w:space="0" w:color="E0E0E0"/>
+              <w:right w:val="single" w:sz="6" w:space="0" w:color="E0E0E0"/>
+            </w:tcBorders>
+            <w:tcMar>
+              <w:top w:w="120" w:type="dxa"/>
+              <w:left w:w="150" w:type="dxa"/>
+              <w:bottom w:w="120" w:type="dxa"/>
+              <w:right w:w="150" w:type="dxa"/>
+            </w:tcMar>
+            <w:vAlign w:val="center"/>
+          </w:tcPr>
+          <w:p>
+            <w:pPr>
+              <w:spacing w:before="60" w:after="60" w:line="240" w:lineRule="auto"/>
+            </w:pPr>
+            <w:r>
+              <w:t xml:space="preserve">success / ticks / hp / energy / damageTaken / killOrder / activationTick / maxSimultaneousActive / exposureTicks</w:t>
+            </w:r>
+          </w:p>
+        </w:tc>
+        <w:tc>
+          <w:tcPr>
+            <w:tcW w:w="2160" w:type="dxa"/>
+            <w:tcBorders>
+              <w:top w:val="single" w:sz="6" w:space="0" w:color="E0E0E0"/>
+              <w:left w:val="single" w:sz="6" w:space="0" w:color="E0E0E0"/>
+              <w:bottom w:val="single" w:sz="6" w:space="0" w:color="E0E0E0"/>
+              <w:right w:val="single" w:sz="6" w:space="0" w:color="E0E0E0"/>
+            </w:tcBorders>
+            <w:tcMar>
+              <w:top w:w="120" w:type="dxa"/>
+              <w:left w:w="150" w:type="dxa"/>
+              <w:bottom w:w="120" w:type="dxa"/>
+              <w:right w:w="150" w:type="dxa"/>
+            </w:tcMar>
+            <w:vAlign w:val="center"/>
+          </w:tcPr>
+          <w:p>
+            <w:pPr>
+              <w:spacing w:before="60" w:after="60" w:line="240" w:lineRule="auto"/>
+            </w:pPr>
+            <w:r>
+              <w:t xml:space="preserve">boolean / number / string[]</w:t>
+            </w:r>
+          </w:p>
+        </w:tc>
+        <w:tc>
+          <w:tcPr>
+            <w:tcW w:w="2160" w:type="dxa"/>
+            <w:tcBorders>
+              <w:top w:val="single" w:sz="6" w:space="0" w:color="E0E0E0"/>
+              <w:left w:val="single" w:sz="6" w:space="0" w:color="E0E0E0"/>
+              <w:bottom w:val="single" w:sz="6" w:space="0" w:color="E0E0E0"/>
+              <w:right w:val="single" w:sz="6" w:space="0" w:color="E0E0E0"/>
+            </w:tcBorders>
+          </w:tcPr>
+          <w:p>
+            <w:proofErr w:type="spellStart"/>
+            <w:proofErr w:type="spellEnd"/>
+            <w:r>
+              <w:t xml:space="preserve">单场 Combat 的真实 Simulation 统计结果</w:t>
+            </w:r>
+          </w:p>
+        </w:tc>
+      </w:tr>
+      <w:tr>
+        <w:tc>
+          <w:tcPr>
+            <w:tcW w:w="2160" w:type="dxa"/>
+          </w:tcPr>
+          <w:p>
+            <w:r>
+              <w:t xml:space="preserve">FinalRogueRunState</w:t>
             </w:r>
           </w:p>
         </w:tc>
@@ -3138,7 +3121,7 @@
               <w:spacing w:before="60" w:after="60" w:line="240" w:lineRule="auto"/>
             </w:pPr>
             <w:r>
-              <w:t>枚举 phase 与数值资源</w:t>
+              <w:t xml:space="preserve">phase / hp / energy / modules / branch / restChoice / stats</w:t>
             </w:r>
           </w:p>
         </w:tc>
@@ -3151,17 +3134,24 @@
               <w:bottom w:val="single" w:sz="6" w:space="0" w:color="E0E0E0"/>
               <w:right w:val="single" w:sz="6" w:space="0" w:color="E0E0E0"/>
             </w:tcBorders>
-          </w:tcPr>
-          <w:p>
-            <w:proofErr w:type="spellStart"/>
-            <w:proofErr w:type="spellEnd"/>
-            <w:r>
-              <w:t>Final Rogue 跨房状态与真实资源时间线</w:t>
-            </w:r>
-          </w:p>
-        </w:tc>
-      </w:tr>
-      <w:tr>
+            <w:shd w:val="clear" w:color="auto" w:fill="F7F9FC"/>
+            <w:tcMar>
+              <w:top w:w="120" w:type="dxa"/>
+              <w:left w:w="150" w:type="dxa"/>
+              <w:bottom w:w="120" w:type="dxa"/>
+              <w:right w:w="150" w:type="dxa"/>
+            </w:tcMar>
+            <w:vAlign w:val="center"/>
+          </w:tcPr>
+          <w:p>
+            <w:pPr>
+              <w:spacing w:before="60" w:after="60" w:line="240" w:lineRule="auto"/>
+            </w:pPr>
+            <w:r>
+              <w:t xml:space="preserve">枚举 phase 与数值资源</w:t>
+            </w:r>
+          </w:p>
+        </w:tc>
         <w:tc>
           <w:tcPr>
             <w:tcW w:w="2160" w:type="dxa"/>
@@ -3171,51 +3161,12 @@
               <w:bottom w:val="single" w:sz="6" w:space="0" w:color="E0E0E0"/>
               <w:right w:val="single" w:sz="6" w:space="0" w:color="E0E0E0"/>
             </w:tcBorders>
-            <w:tcMar>
-              <w:top w:w="120" w:type="dxa"/>
-              <w:left w:w="150" w:type="dxa"/>
-              <w:bottom w:w="120" w:type="dxa"/>
-              <w:right w:w="150" w:type="dxa"/>
-            </w:tcMar>
-            <w:vAlign w:val="center"/>
-          </w:tcPr>
-          <w:p>
-            <w:pPr>
-              <w:spacing w:before="60" w:after="60" w:line="240" w:lineRule="auto"/>
-            </w:pPr>
+          </w:tcPr>
+          <w:p>
             <w:proofErr w:type="spellStart"/>
             <w:proofErr w:type="spellEnd"/>
             <w:r>
-              <w:t>Snapshot</w:t>
-            </w:r>
-          </w:p>
-        </w:tc>
-        <w:tc>
-          <w:tcPr>
-            <w:tcW w:w="6480" w:type="dxa"/>
-            <w:gridSpan w:val="3"/>
-            <w:tcBorders>
-              <w:top w:val="single" w:sz="6" w:space="0" w:color="E0E0E0"/>
-              <w:left w:val="single" w:sz="6" w:space="0" w:color="E0E0E0"/>
-              <w:bottom w:val="single" w:sz="6" w:space="0" w:color="E0E0E0"/>
-              <w:right w:val="single" w:sz="6" w:space="0" w:color="E0E0E0"/>
-            </w:tcBorders>
-            <w:tcMar>
-              <w:top w:w="120" w:type="dxa"/>
-              <w:left w:w="150" w:type="dxa"/>
-              <w:bottom w:w="120" w:type="dxa"/>
-              <w:right w:w="150" w:type="dxa"/>
-            </w:tcMar>
-            <w:vAlign w:val="center"/>
-          </w:tcPr>
-          <w:p>
-            <w:pPr>
-              <w:spacing w:before="60" w:after="60" w:line="240" w:lineRule="auto"/>
-            </w:pPr>
-            <w:proofErr w:type="spellStart"/>
-            <w:proofErr w:type="spellEnd"/>
-            <w:r>
-              <w:t>Debugger 快照与 Rollback 恢复</w:t>
+              <w:t xml:space="preserve">保存 Final Rogue 跨节点状态：HP/Energy、已获得模块、路线选择、维护舱选择与累计统计</w:t>
             </w:r>
           </w:p>
         </w:tc>
@@ -3227,7 +3178,7 @@
           </w:tcPr>
           <w:p>
             <w:r>
-              <w:t>RunRecord / MetaProgress</w:t>
+              <w:t xml:space="preserve">Snapshot</w:t>
             </w:r>
           </w:p>
         </w:tc>
@@ -3237,7 +3188,7 @@
           </w:tcPr>
           <w:p>
             <w:r>
-              <w:t>seed / result / nodesCleared / credits</w:t>
+              <w:t xml:space="preserve">robot / enemies / frames / tick / status</w:t>
             </w:r>
           </w:p>
         </w:tc>
@@ -3247,7 +3198,7 @@
           </w:tcPr>
           <w:p>
             <w:r>
-              <w:t>JSON / localStorage</w:t>
+              <w:t xml:space="preserve">完整深拷贝</w:t>
             </w:r>
           </w:p>
         </w:tc>
@@ -3257,7 +3208,49 @@
           </w:tcPr>
           <w:p>
             <w:r>
-              <w:t>远征履历与 meta 跨局经济</w:t>
+              <w:t xml:space="preserve">保存机器人、敌人、位置、HP/Energy、tick、帧与解释器状态，供 Rollback 恢复</w:t>
+            </w:r>
+          </w:p>
+        </w:tc>
+      </w:tr>
+      <w:tr>
+        <w:tc>
+          <w:tcPr>
+            <w:tcW w:type="dxa" w:w="2068"/>
+          </w:tcPr>
+          <w:p>
+            <w:r>
+              <w:t xml:space="preserve">RunRecord / MetaProgress</w:t>
+            </w:r>
+          </w:p>
+        </w:tc>
+        <w:tc>
+          <w:tcPr>
+            <w:tcW w:type="dxa" w:w="2080"/>
+          </w:tcPr>
+          <w:p>
+            <w:r>
+              <w:t xml:space="preserve">seed / result / nodesCleared / credits / upgrades / lastRuns</w:t>
+            </w:r>
+          </w:p>
+        </w:tc>
+        <w:tc>
+          <w:tcPr>
+            <w:tcW w:type="dxa" w:w="2094"/>
+          </w:tcPr>
+          <w:p>
+            <w:r>
+              <w:t xml:space="preserve">JSON / localStorage</w:t>
+            </w:r>
+          </w:p>
+        </w:tc>
+        <w:tc>
+          <w:tcPr>
+            <w:tcW w:type="dxa" w:w="2070"/>
+          </w:tcPr>
+          <w:p>
+            <w:r>
+              <w:t xml:space="preserve">远征履历与跨局 meta 经济</w:t>
             </w:r>
           </w:p>
         </w:tc>
@@ -3466,7 +3459,7 @@
             <w:proofErr w:type="spellStart"/>
             <w:proofErr w:type="spellEnd"/>
             <w:r>
-              <w:t>载入固件→构建→运行→观察 Trace，可在火控核心使用 Snapshot/Rollback/Hot Reload</w:t>
+              <w:t>载入固件 → 构建 → 运行 → 观察 Trace，可在火控核心使用 Snapshot/Rollback/Hot Reload</w:t>
             </w:r>
           </w:p>
         </w:tc>
@@ -4089,7 +4082,7 @@
     <w:p>
       <w:pPr/>
       <w:r>
-        <w:t>Snapshot 对 Simulation 世界状态与解释器状态做深拷贝；Rollback 恢复机器人、敌人、HP/Energy、位置、tick 与帧；Hot Reload 在暂停状态重建解释器并保留当前世界状态。真实验证中，火控核心使用标准策略失败（HP 0，Damage 5，Ticks 30），经 Snapshot→Rollback→Hot Reload 切换自适应策略后成功（HP 1，Damage 4，Ticks 44）。</w:t>
+        <w:t>Snapshot 对 Simulation 世界状态与解释器状态做深拷贝；Rollback 恢复机器人、敌人、HP/Energy、位置、tick 与帧；Hot Reload 在暂停状态重建解释器并保留当前世界状态。真实验证中，火控核心使用标准策略失败（HP 0，Damage 5，Ticks 30），经 Snapshot → Rollback → Hot Reload 切换自适应策略后成功（HP 1，Damage 4，Ticks 44）。</w:t>
       </w:r>
     </w:p>
     <w:p>
@@ -4985,7 +4978,7 @@
         </w:rPr>
       </w:pPr>
       <w:r>
-        <w:t>进入火控核心后可执行标准策略失败→Snapshot→Rollback→Hot Reload 自适应策略的调试对照流程。</w:t>
+        <w:t>进入火控核心后可执行标准策略失败 → Snapshot → Rollback → Hot Reload → 自适应策略的调试对照流程。</w:t>
       </w:r>
     </w:p>
     <w:p>

</xml_diff>

<commit_message>
checkpoint: before demo stabilization
</commit_message>
<xml_diff>
--- a/CodeRogue-软件开发文档.docx
+++ b/CodeRogue-软件开发文档.docx
@@ -9,8 +9,19 @@
           <w:lang w:eastAsia="zh-CN"/>
         </w:rPr>
       </w:pPr>
-      <w:r>
-        <w:t>CodeRogue（代码浪客）项目开发文档</w:t>
+      <w:proofErr w:type="spellStart"/>
+      <w:r>
+        <w:rPr>
+          <w:lang w:eastAsia="zh-CN"/>
+        </w:rPr>
+        <w:t>CodeRogue</w:t>
+      </w:r>
+      <w:proofErr w:type="spellEnd"/>
+      <w:r>
+        <w:rPr>
+          <w:lang w:eastAsia="zh-CN"/>
+        </w:rPr>
+        <w:t>（代码浪客）项目开发文档</w:t>
       </w:r>
     </w:p>
     <w:p>
@@ -25,7 +36,24 @@
         </w:rPr>
       </w:pPr>
       <w:r>
-        <w:t>程序设计实践课 · CodeRogue 项目开发文档</w:t>
+        <w:rPr>
+          <w:lang w:eastAsia="zh-CN"/>
+        </w:rPr>
+        <w:t xml:space="preserve">程序设计实践课 · </w:t>
+      </w:r>
+      <w:proofErr w:type="spellStart"/>
+      <w:r>
+        <w:rPr>
+          <w:lang w:eastAsia="zh-CN"/>
+        </w:rPr>
+        <w:t>CodeRogue</w:t>
+      </w:r>
+      <w:proofErr w:type="spellEnd"/>
+      <w:r>
+        <w:rPr>
+          <w:lang w:eastAsia="zh-CN"/>
+        </w:rPr>
+        <w:t xml:space="preserve"> 项目开发文档</w:t>
       </w:r>
     </w:p>
     <w:p>
@@ -216,8 +244,8 @@
         <w:tblLook w:val="04A0" w:firstRow="1" w:lastRow="0" w:firstColumn="1" w:lastColumn="0" w:noHBand="0" w:noVBand="1"/>
       </w:tblPr>
       <w:tblGrid>
-        <w:gridCol w:w="2714"/>
-        <w:gridCol w:w="5582"/>
+        <w:gridCol w:w="2706"/>
+        <w:gridCol w:w="5590"/>
       </w:tblGrid>
       <w:tr>
         <w:tc>
@@ -336,11 +364,17 @@
           <w:p>
             <w:pPr>
               <w:spacing w:before="60" w:after="60" w:line="240" w:lineRule="auto"/>
+              <w:rPr>
+                <w:rFonts w:eastAsia="宋体" w:hint="eastAsia"/>
+                <w:lang w:eastAsia="zh-CN"/>
+              </w:rPr>
             </w:pPr>
-            <w:proofErr w:type="spellStart"/>
-            <w:proofErr w:type="spellEnd"/>
-            <w:r>
-              <w:t>[待填写]</w:t>
+            <w:r>
+              <w:rPr>
+                <w:rFonts w:eastAsia="宋体" w:hint="eastAsia"/>
+                <w:lang w:eastAsia="zh-CN"/>
+              </w:rPr>
+              <w:t>孙一弘</w:t>
             </w:r>
           </w:p>
         </w:tc>
@@ -398,11 +432,17 @@
           <w:p>
             <w:pPr>
               <w:spacing w:before="60" w:after="60" w:line="240" w:lineRule="auto"/>
+              <w:rPr>
+                <w:rFonts w:eastAsia="宋体" w:hint="eastAsia"/>
+                <w:lang w:eastAsia="zh-CN"/>
+              </w:rPr>
             </w:pPr>
-            <w:proofErr w:type="spellStart"/>
-            <w:proofErr w:type="spellEnd"/>
-            <w:r>
-              <w:t>[待填写]</w:t>
+            <w:r>
+              <w:rPr>
+                <w:rFonts w:eastAsia="宋体" w:hint="eastAsia"/>
+                <w:lang w:eastAsia="zh-CN"/>
+              </w:rPr>
+              <w:t>24374119</w:t>
             </w:r>
           </w:p>
         </w:tc>
@@ -431,6 +471,7 @@
               <w:spacing w:before="60" w:after="60" w:line="240" w:lineRule="auto"/>
             </w:pPr>
             <w:proofErr w:type="spellStart"/>
+            <w:proofErr w:type="gramStart"/>
             <w:r>
               <w:rPr>
                 <w:b/>
@@ -442,7 +483,14 @@
               <w:rPr>
                 <w:b/>
               </w:rPr>
-              <w:t xml:space="preserve">  /  </w:t>
+              <w:t xml:space="preserve">  /</w:t>
+            </w:r>
+            <w:proofErr w:type="gramEnd"/>
+            <w:r>
+              <w:rPr>
+                <w:b/>
+              </w:rPr>
+              <w:t xml:space="preserve">  </w:t>
             </w:r>
             <w:proofErr w:type="spellStart"/>
             <w:r>
@@ -475,13 +523,27 @@
           <w:p>
             <w:pPr>
               <w:spacing w:before="60" w:after="60" w:line="240" w:lineRule="auto"/>
+              <w:rPr>
+                <w:rFonts w:eastAsia="宋体" w:hint="eastAsia"/>
+                <w:lang w:eastAsia="zh-CN"/>
+              </w:rPr>
             </w:pPr>
             <w:proofErr w:type="spellStart"/>
+            <w:proofErr w:type="gramStart"/>
+            <w:r>
+              <w:t>软件工程</w:t>
+            </w:r>
             <w:proofErr w:type="spellEnd"/>
-            <w:proofErr w:type="spellStart"/>
-            <w:proofErr w:type="spellEnd"/>
-            <w:r>
-              <w:t>软件工程  /  [待填写]</w:t>
+            <w:r>
+              <w:t xml:space="preserve">  /</w:t>
+            </w:r>
+            <w:proofErr w:type="gramEnd"/>
+            <w:r>
+              <w:rPr>
+                <w:rFonts w:eastAsia="宋体" w:hint="eastAsia"/>
+                <w:lang w:eastAsia="zh-CN"/>
+              </w:rPr>
+              <w:t xml:space="preserve">  242112</w:t>
             </w:r>
           </w:p>
         </w:tc>
@@ -540,8 +602,6 @@
             <w:pPr>
               <w:spacing w:before="60" w:after="60" w:line="240" w:lineRule="auto"/>
             </w:pPr>
-            <w:proofErr w:type="spellStart"/>
-            <w:proofErr w:type="spellEnd"/>
             <w:r>
               <w:t>程序设计实践</w:t>
             </w:r>
@@ -663,10 +723,6 @@
             <w:pPr>
               <w:spacing w:before="60" w:after="60" w:line="240" w:lineRule="auto"/>
             </w:pPr>
-            <w:proofErr w:type="spellStart"/>
-            <w:proofErr w:type="spellEnd"/>
-            <w:proofErr w:type="spellStart"/>
-            <w:proofErr w:type="spellEnd"/>
             <w:r>
               <w:t>Vue 3 + TypeScript + Vite + HTML/CSS + 自研 RoboC++ 解释器（浏览器端运行）</w:t>
             </w:r>
@@ -728,8 +784,6 @@
             <w:pPr>
               <w:spacing w:before="60" w:after="60" w:line="240" w:lineRule="auto"/>
             </w:pPr>
-            <w:proofErr w:type="spellStart"/>
-            <w:proofErr w:type="spellEnd"/>
             <w:r>
               <w:t>约 5091 行（src 与 tests，2026-09-06 统计）</w:t>
             </w:r>
@@ -794,7 +848,10 @@
               </w:rPr>
             </w:pPr>
             <w:r>
-              <w:t>[待填写：GitHub 仓库 URL]</w:t>
+              <w:rPr>
+                <w:lang w:eastAsia="zh-CN"/>
+              </w:rPr>
+              <w:t>https://github.com/helium0818/CodeRogue</w:t>
             </w:r>
           </w:p>
         </w:tc>
@@ -855,10 +912,6 @@
             <w:pPr>
               <w:spacing w:before="60" w:after="60" w:line="240" w:lineRule="auto"/>
             </w:pPr>
-            <w:proofErr w:type="spellStart"/>
-            <w:proofErr w:type="spellEnd"/>
-            <w:proofErr w:type="spellStart"/>
-            <w:proofErr w:type="spellEnd"/>
             <w:r>
               <w:t>Windows 10 / 11，Node.js + npm，Chrome / Edge 现代浏览器</w:t>
             </w:r>
@@ -899,7 +952,10 @@
         </w:rPr>
       </w:pPr>
       <w:r>
-        <w:t>2.1 项目背景与动机</w:t>
+        <w:t xml:space="preserve">2.1 </w:t>
+      </w:r>
+      <w:r>
+        <w:t>项目背景与动机</w:t>
       </w:r>
     </w:p>
     <w:p>
@@ -909,7 +965,24 @@
         </w:rPr>
       </w:pPr>
       <w:r>
-        <w:t>编程教学通常以独立小题目训练语法，玩家完成题目后仍较难把传感器读取、动作选择和程序状态组合起来，用于解决连续、互相影响的复杂问题。CodeRogue 的起点是把“代码 → 行为 → 观察 → 调试 → 修改 → 新结果”这一程序设计闭环直接变成游戏规则，让玩家在连续战斗中反复使用同一套真实执行环境验证自己的代码。</w:t>
+        <w:rPr>
+          <w:lang w:eastAsia="zh-CN"/>
+        </w:rPr>
+        <w:t>编程教学通常以独立小题目训练语法，玩家完成题目后仍较难把传感器读取、动作选择和程序状态组合起来，用于解决连续、互相影响的复杂问题。</w:t>
+      </w:r>
+      <w:proofErr w:type="spellStart"/>
+      <w:r>
+        <w:rPr>
+          <w:lang w:eastAsia="zh-CN"/>
+        </w:rPr>
+        <w:t>CodeRogue</w:t>
+      </w:r>
+      <w:proofErr w:type="spellEnd"/>
+      <w:r>
+        <w:rPr>
+          <w:lang w:eastAsia="zh-CN"/>
+        </w:rPr>
+        <w:t xml:space="preserve"> 的起点是把“代码 → 行为 → 观察 → 调试 → 修改 → 新结果”这一程序设计闭环直接变成游戏规则，让玩家在连续战斗中反复使用同一套真实执行环境验证自己的代码。</w:t>
       </w:r>
     </w:p>
     <w:p>
@@ -921,7 +994,38 @@
         </w:rPr>
       </w:pPr>
       <w:r>
-        <w:t>市面已有较多编程教育平台，但多数以通关型小任务为主，通关后缺少继续探索的动机；CodeRogue 采用 Roguelite 的模块选择、路线决策和资源继承机制，使同一段代码在不同节点可能需要被重新思考，从而让写代码本身成为每一局的胜负手。</w:t>
+        <w:rPr>
+          <w:lang w:eastAsia="zh-CN"/>
+        </w:rPr>
+        <w:t>市面已有较多编程教育平台，但多数以通关型小任务为主，通关后缺少继续探索的动机；</w:t>
+      </w:r>
+      <w:proofErr w:type="spellStart"/>
+      <w:r>
+        <w:rPr>
+          <w:lang w:eastAsia="zh-CN"/>
+        </w:rPr>
+        <w:t>CodeRogue</w:t>
+      </w:r>
+      <w:proofErr w:type="spellEnd"/>
+      <w:r>
+        <w:rPr>
+          <w:lang w:eastAsia="zh-CN"/>
+        </w:rPr>
+        <w:t xml:space="preserve"> 采用 </w:t>
+      </w:r>
+      <w:proofErr w:type="spellStart"/>
+      <w:r>
+        <w:rPr>
+          <w:lang w:eastAsia="zh-CN"/>
+        </w:rPr>
+        <w:t>Roguelite</w:t>
+      </w:r>
+      <w:proofErr w:type="spellEnd"/>
+      <w:r>
+        <w:rPr>
+          <w:lang w:eastAsia="zh-CN"/>
+        </w:rPr>
+        <w:t xml:space="preserve"> 的模块选择、路线决策和资源继承机制，使同一段代码在不同节点可能需要被重新思考，从而让写代码本身成为每一局的胜负手。</w:t>
       </w:r>
     </w:p>
     <w:p>
@@ -932,6 +1036,9 @@
         </w:rPr>
       </w:pPr>
       <w:r>
+        <w:rPr>
+          <w:lang w:eastAsia="zh-CN"/>
+        </w:rPr>
         <w:t>开发本项目的学习意义在于完整经历一次从语言解释器、实时仿真、调试器到游戏化关卡与资源系统的开发过程。相比只完成功能堆叠，它更强调系统边界、状态一致性和测试回归，对软件工程实践的理解更全面。</w:t>
       </w:r>
     </w:p>
@@ -943,7 +1050,6 @@
           <w:lang w:eastAsia="zh-CN"/>
         </w:rPr>
       </w:pPr>
-      <w:r/>
     </w:p>
     <w:p>
       <w:pPr>
@@ -952,7 +1058,6 @@
           <w:lang w:eastAsia="zh-CN"/>
         </w:rPr>
       </w:pPr>
-      <w:r/>
     </w:p>
     <w:p>
       <w:pPr>
@@ -960,7 +1065,6 @@
           <w:lang w:eastAsia="zh-CN"/>
         </w:rPr>
       </w:pPr>
-      <w:r/>
     </w:p>
     <w:p>
       <w:pPr>
@@ -970,7 +1074,10 @@
         </w:rPr>
       </w:pPr>
       <w:r>
-        <w:t>2.2 项目简介</w:t>
+        <w:t xml:space="preserve">2.2 </w:t>
+      </w:r>
+      <w:r>
+        <w:t>项目简介</w:t>
       </w:r>
     </w:p>
     <w:p>
@@ -990,6 +1097,9 @@
         </w:rPr>
       </w:pPr>
       <w:r>
+        <w:rPr>
+          <w:lang w:eastAsia="zh-CN"/>
+        </w:rPr>
         <w:t>每局远征由“追猎迷宫 → 模块奖励 → 路线选择 → 安保中心 → 模块奖励 → 维护舱 → 火控核心 → 行动完成”组成，玩家依靠 Prepared Firmware 或自行修改固件，在 Debugger、Trace 与资源继承的约束下推进三个连续战斗关卡。其核心价值是让玩家通过调试代码直接改变战斗结果。</w:t>
       </w:r>
     </w:p>
@@ -1008,6 +1118,7 @@
           <w:b w:val="0"/>
           <w:lang w:eastAsia="zh-CN"/>
         </w:rPr>
+        <w:lastRenderedPageBreak/>
         <w:t>三、需求分析</w:t>
       </w:r>
     </w:p>
@@ -1019,7 +1130,16 @@
         </w:rPr>
       </w:pPr>
       <w:r>
-        <w:t>3.1 功能需求</w:t>
+        <w:rPr>
+          <w:lang w:eastAsia="zh-CN"/>
+        </w:rPr>
+        <w:t xml:space="preserve">3.1 </w:t>
+      </w:r>
+      <w:r>
+        <w:rPr>
+          <w:lang w:eastAsia="zh-CN"/>
+        </w:rPr>
+        <w:t>功能需求</w:t>
       </w:r>
     </w:p>
     <w:p>
@@ -1029,6 +1149,9 @@
         </w:rPr>
       </w:pPr>
       <w:r>
+        <w:rPr>
+          <w:lang w:eastAsia="zh-CN"/>
+        </w:rPr>
         <w:t>下表将核心功能拆分为十个可验证模块，输入和输出均来自真实界面与 Simulation。</w:t>
       </w:r>
     </w:p>
@@ -1038,11 +1161,11 @@
         <w:tblLook w:val="04A0" w:firstRow="1" w:lastRow="0" w:firstColumn="1" w:lastColumn="0" w:noHBand="0" w:noVBand="1"/>
       </w:tblPr>
       <w:tblGrid>
-        <w:gridCol w:w="1338"/>
-        <w:gridCol w:w="1644"/>
-        <w:gridCol w:w="2121"/>
-        <w:gridCol w:w="1418"/>
-        <w:gridCol w:w="1701"/>
+        <w:gridCol w:w="612"/>
+        <w:gridCol w:w="1130"/>
+        <w:gridCol w:w="3748"/>
+        <w:gridCol w:w="1130"/>
+        <w:gridCol w:w="1692"/>
       </w:tblGrid>
       <w:tr>
         <w:tc>
@@ -1061,8 +1184,6 @@
             <w:pPr>
               <w:spacing w:before="60" w:after="60" w:line="240" w:lineRule="auto"/>
             </w:pPr>
-            <w:proofErr w:type="spellStart"/>
-            <w:proofErr w:type="spellEnd"/>
             <w:r>
               <w:t>编号</w:t>
             </w:r>
@@ -1084,8 +1205,6 @@
             <w:pPr>
               <w:spacing w:before="60" w:after="60" w:line="240" w:lineRule="auto"/>
             </w:pPr>
-            <w:proofErr w:type="spellStart"/>
-            <w:proofErr w:type="spellEnd"/>
             <w:r>
               <w:t>功能模块</w:t>
             </w:r>
@@ -1107,8 +1226,6 @@
             <w:pPr>
               <w:spacing w:before="60" w:after="60" w:line="240" w:lineRule="auto"/>
             </w:pPr>
-            <w:proofErr w:type="spellStart"/>
-            <w:proofErr w:type="spellEnd"/>
             <w:r>
               <w:t>功能描述</w:t>
             </w:r>
@@ -1130,8 +1247,6 @@
             <w:pPr>
               <w:spacing w:before="60" w:after="60" w:line="240" w:lineRule="auto"/>
             </w:pPr>
-            <w:proofErr w:type="spellStart"/>
-            <w:proofErr w:type="spellEnd"/>
             <w:r>
               <w:t>输入</w:t>
             </w:r>
@@ -1153,8 +1268,6 @@
             <w:pPr>
               <w:spacing w:before="60" w:after="60" w:line="240" w:lineRule="auto"/>
             </w:pPr>
-            <w:proofErr w:type="spellStart"/>
-            <w:proofErr w:type="spellEnd"/>
             <w:r>
               <w:t>输出</w:t>
             </w:r>
@@ -1211,8 +1324,6 @@
             <w:pPr>
               <w:spacing w:before="60" w:after="60" w:line="240" w:lineRule="auto"/>
             </w:pPr>
-            <w:proofErr w:type="spellStart"/>
-            <w:proofErr w:type="spellEnd"/>
             <w:r>
               <w:t>RoboC++ 固件编辑</w:t>
             </w:r>
@@ -1270,10 +1381,6 @@
             <w:pPr>
               <w:spacing w:before="60" w:after="60" w:line="240" w:lineRule="auto"/>
             </w:pPr>
-            <w:proofErr w:type="spellStart"/>
-            <w:proofErr w:type="spellEnd"/>
-            <w:proofErr w:type="spellStart"/>
-            <w:proofErr w:type="spellEnd"/>
             <w:r>
               <w:t>RoboC++ 源码</w:t>
             </w:r>
@@ -1300,10 +1407,14 @@
           <w:p>
             <w:pPr>
               <w:spacing w:before="60" w:after="60" w:line="240" w:lineRule="auto"/>
+              <w:rPr>
+                <w:lang w:eastAsia="zh-CN"/>
+              </w:rPr>
             </w:pPr>
-            <w:proofErr w:type="spellStart"/>
-            <w:proofErr w:type="spellEnd"/>
-            <w:r>
+            <w:r>
+              <w:rPr>
+                <w:lang w:eastAsia="zh-CN"/>
+              </w:rPr>
               <w:t>可编辑代码与行号提示</w:t>
             </w:r>
           </w:p>
@@ -1357,8 +1468,6 @@
             <w:pPr>
               <w:spacing w:before="60" w:after="60" w:line="240" w:lineRule="auto"/>
             </w:pPr>
-            <w:proofErr w:type="spellStart"/>
-            <w:proofErr w:type="spellEnd"/>
             <w:r>
               <w:t>编译 / 运行固件</w:t>
             </w:r>
@@ -1385,8 +1494,6 @@
             <w:pPr>
               <w:spacing w:before="60" w:after="60" w:line="240" w:lineRule="auto"/>
             </w:pPr>
-            <w:proofErr w:type="spellStart"/>
-            <w:proofErr w:type="spellEnd"/>
             <w:r>
               <w:t>语法与约束检查后，在 Simulation 中逐 Tick 执行</w:t>
             </w:r>
@@ -1413,8 +1520,6 @@
             <w:pPr>
               <w:spacing w:before="60" w:after="60" w:line="240" w:lineRule="auto"/>
             </w:pPr>
-            <w:proofErr w:type="spellStart"/>
-            <w:proofErr w:type="spellEnd"/>
             <w:r>
               <w:t>固件源码</w:t>
             </w:r>
@@ -1440,10 +1545,14 @@
           <w:p>
             <w:pPr>
               <w:spacing w:before="60" w:after="60" w:line="240" w:lineRule="auto"/>
+              <w:rPr>
+                <w:lang w:eastAsia="zh-CN"/>
+              </w:rPr>
             </w:pPr>
-            <w:proofErr w:type="spellStart"/>
-            <w:proofErr w:type="spellEnd"/>
-            <w:r>
+            <w:r>
+              <w:rPr>
+                <w:lang w:eastAsia="zh-CN"/>
+              </w:rPr>
               <w:t>构建结果、运行状态与逐帧 Trace</w:t>
             </w:r>
           </w:p>
@@ -1500,8 +1609,6 @@
             <w:pPr>
               <w:spacing w:before="60" w:after="60" w:line="240" w:lineRule="auto"/>
             </w:pPr>
-            <w:proofErr w:type="spellStart"/>
-            <w:proofErr w:type="spellEnd"/>
             <w:r>
               <w:t>机器人位置/朝向/HP/Energy 变化</w:t>
             </w:r>
@@ -1511,7 +1618,7 @@
       <w:tr>
         <w:tc>
           <w:tcPr>
-            <w:tcW w:type="dxa" w:w="1338"/>
+            <w:tcW w:w="1338" w:type="dxa"/>
           </w:tcPr>
           <w:p>
             <w:r>
@@ -1521,7 +1628,7 @@
         </w:tc>
         <w:tc>
           <w:tcPr>
-            <w:tcW w:type="dxa" w:w="1644"/>
+            <w:tcW w:w="1644" w:type="dxa"/>
           </w:tcPr>
           <w:p>
             <w:r>
@@ -1531,7 +1638,7 @@
         </w:tc>
         <w:tc>
           <w:tcPr>
-            <w:tcW w:type="dxa" w:w="2121"/>
+            <w:tcW w:w="2121" w:type="dxa"/>
           </w:tcPr>
           <w:p>
             <w:r>
@@ -1541,7 +1648,7 @@
         </w:tc>
         <w:tc>
           <w:tcPr>
-            <w:tcW w:type="dxa" w:w="1418"/>
+            <w:tcW w:w="1418" w:type="dxa"/>
           </w:tcPr>
           <w:p>
             <w:r>
@@ -1551,10 +1658,18 @@
         </w:tc>
         <w:tc>
           <w:tcPr>
-            <w:tcW w:type="dxa" w:w="1701"/>
+            <w:tcW w:w="1701" w:type="dxa"/>
           </w:tcPr>
           <w:p>
-            <w:r>
+            <w:pPr>
+              <w:rPr>
+                <w:lang w:eastAsia="zh-CN"/>
+              </w:rPr>
+            </w:pPr>
+            <w:r>
+              <w:rPr>
+                <w:lang w:eastAsia="zh-CN"/>
+              </w:rPr>
               <w:t>独立敌人 HP/位置与攻击结果</w:t>
             </w:r>
           </w:p>
@@ -1563,7 +1678,7 @@
       <w:tr>
         <w:tc>
           <w:tcPr>
-            <w:tcW w:type="dxa" w:w="1338"/>
+            <w:tcW w:w="1338" w:type="dxa"/>
           </w:tcPr>
           <w:p>
             <w:r>
@@ -1573,7 +1688,7 @@
         </w:tc>
         <w:tc>
           <w:tcPr>
-            <w:tcW w:type="dxa" w:w="1644"/>
+            <w:tcW w:w="1644" w:type="dxa"/>
           </w:tcPr>
           <w:p>
             <w:r>
@@ -1583,7 +1698,7 @@
         </w:tc>
         <w:tc>
           <w:tcPr>
-            <w:tcW w:type="dxa" w:w="2121"/>
+            <w:tcW w:w="2121" w:type="dxa"/>
           </w:tcPr>
           <w:p>
             <w:r>
@@ -1593,7 +1708,7 @@
         </w:tc>
         <w:tc>
           <w:tcPr>
-            <w:tcW w:type="dxa" w:w="1418"/>
+            <w:tcW w:w="1418" w:type="dxa"/>
           </w:tcPr>
           <w:p>
             <w:r>
@@ -1603,7 +1718,7 @@
         </w:tc>
         <w:tc>
           <w:tcPr>
-            <w:tcW w:type="dxa" w:w="1701"/>
+            <w:tcW w:w="1701" w:type="dxa"/>
           </w:tcPr>
           <w:p>
             <w:r>
@@ -1615,7 +1730,7 @@
       <w:tr>
         <w:tc>
           <w:tcPr>
-            <w:tcW w:type="dxa" w:w="1338"/>
+            <w:tcW w:w="1338" w:type="dxa"/>
           </w:tcPr>
           <w:p>
             <w:r>
@@ -1625,7 +1740,7 @@
         </w:tc>
         <w:tc>
           <w:tcPr>
-            <w:tcW w:type="dxa" w:w="1644"/>
+            <w:tcW w:w="1644" w:type="dxa"/>
           </w:tcPr>
           <w:p>
             <w:r>
@@ -1635,27 +1750,37 @@
         </w:tc>
         <w:tc>
           <w:tcPr>
-            <w:tcW w:type="dxa" w:w="2121"/>
+            <w:tcW w:w="2121" w:type="dxa"/>
           </w:tcPr>
           <w:p>
-            <w:r>
+            <w:pPr>
+              <w:rPr>
+                <w:lang w:eastAsia="zh-CN"/>
+              </w:rPr>
+            </w:pPr>
+            <w:r>
+              <w:rPr>
+                <w:lang w:eastAsia="zh-CN"/>
+              </w:rPr>
               <w:t>战斗后选择声呐/长程炮管/零耗推进器等真实 modifier</w:t>
             </w:r>
           </w:p>
         </w:tc>
         <w:tc>
           <w:tcPr>
-            <w:tcW w:type="dxa" w:w="1418"/>
+            <w:tcW w:w="1418" w:type="dxa"/>
           </w:tcPr>
           <w:p>
+            <w:proofErr w:type="spellStart"/>
             <w:r>
               <w:t>奖励候选模块</w:t>
             </w:r>
+            <w:proofErr w:type="spellEnd"/>
           </w:p>
         </w:tc>
         <w:tc>
           <w:tcPr>
-            <w:tcW w:type="dxa" w:w="1701"/>
+            <w:tcW w:w="1701" w:type="dxa"/>
           </w:tcPr>
           <w:p>
             <w:r>
@@ -1667,7 +1792,7 @@
       <w:tr>
         <w:tc>
           <w:tcPr>
-            <w:tcW w:type="dxa" w:w="1338"/>
+            <w:tcW w:w="1338" w:type="dxa"/>
           </w:tcPr>
           <w:p>
             <w:r>
@@ -1677,7 +1802,7 @@
         </w:tc>
         <w:tc>
           <w:tcPr>
-            <w:tcW w:type="dxa" w:w="1644"/>
+            <w:tcW w:w="1644" w:type="dxa"/>
           </w:tcPr>
           <w:p>
             <w:r>
@@ -1687,7 +1812,7 @@
         </w:tc>
         <w:tc>
           <w:tcPr>
-            <w:tcW w:type="dxa" w:w="2121"/>
+            <w:tcW w:w="2121" w:type="dxa"/>
           </w:tcPr>
           <w:p>
             <w:r>
@@ -1697,7 +1822,7 @@
         </w:tc>
         <w:tc>
           <w:tcPr>
-            <w:tcW w:type="dxa" w:w="1418"/>
+            <w:tcW w:w="1418" w:type="dxa"/>
           </w:tcPr>
           <w:p>
             <w:r>
@@ -1707,7 +1832,7 @@
         </w:tc>
         <w:tc>
           <w:tcPr>
-            <w:tcW w:type="dxa" w:w="1701"/>
+            <w:tcW w:w="1701" w:type="dxa"/>
           </w:tcPr>
           <w:p>
             <w:r>
@@ -1719,7 +1844,7 @@
       <w:tr>
         <w:tc>
           <w:tcPr>
-            <w:tcW w:type="dxa" w:w="1338"/>
+            <w:tcW w:w="1338" w:type="dxa"/>
           </w:tcPr>
           <w:p>
             <w:r>
@@ -1729,7 +1854,7 @@
         </w:tc>
         <w:tc>
           <w:tcPr>
-            <w:tcW w:type="dxa" w:w="1644"/>
+            <w:tcW w:w="1644" w:type="dxa"/>
           </w:tcPr>
           <w:p>
             <w:r>
@@ -1739,27 +1864,40 @@
         </w:tc>
         <w:tc>
           <w:tcPr>
-            <w:tcW w:type="dxa" w:w="2121"/>
+            <w:tcW w:w="2121" w:type="dxa"/>
           </w:tcPr>
           <w:p>
-            <w:r>
+            <w:pPr>
+              <w:rPr>
+                <w:lang w:eastAsia="zh-CN"/>
+              </w:rPr>
+            </w:pPr>
+            <w:r>
+              <w:rPr>
+                <w:lang w:eastAsia="zh-CN"/>
+              </w:rPr>
               <w:t>跨战斗继承 HP/Energy，维护舱与补给负责恢复</w:t>
             </w:r>
           </w:p>
         </w:tc>
         <w:tc>
           <w:tcPr>
-            <w:tcW w:type="dxa" w:w="1418"/>
+            <w:tcW w:w="1418" w:type="dxa"/>
           </w:tcPr>
           <w:p>
-            <w:r>
-              <w:t>战斗结束 HP/Energy</w:t>
+            <w:proofErr w:type="spellStart"/>
+            <w:r>
+              <w:t>战斗结束</w:t>
+            </w:r>
+            <w:proofErr w:type="spellEnd"/>
+            <w:r>
+              <w:t xml:space="preserve"> HP/Energy</w:t>
             </w:r>
           </w:p>
         </w:tc>
         <w:tc>
           <w:tcPr>
-            <w:tcW w:type="dxa" w:w="1701"/>
+            <w:tcW w:w="1701" w:type="dxa"/>
           </w:tcPr>
           <w:p>
             <w:r>
@@ -1771,7 +1909,7 @@
       <w:tr>
         <w:tc>
           <w:tcPr>
-            <w:tcW w:type="dxa" w:w="1338"/>
+            <w:tcW w:w="1338" w:type="dxa"/>
           </w:tcPr>
           <w:p>
             <w:r>
@@ -1781,7 +1919,7 @@
         </w:tc>
         <w:tc>
           <w:tcPr>
-            <w:tcW w:type="dxa" w:w="1644"/>
+            <w:tcW w:w="1644" w:type="dxa"/>
           </w:tcPr>
           <w:p>
             <w:r>
@@ -1791,27 +1929,37 @@
         </w:tc>
         <w:tc>
           <w:tcPr>
-            <w:tcW w:type="dxa" w:w="2121"/>
+            <w:tcW w:w="2121" w:type="dxa"/>
           </w:tcPr>
           <w:p>
-            <w:r>
+            <w:pPr>
+              <w:rPr>
+                <w:lang w:eastAsia="zh-CN"/>
+              </w:rPr>
+            </w:pPr>
+            <w:r>
+              <w:rPr>
+                <w:lang w:eastAsia="zh-CN"/>
+              </w:rPr>
               <w:t>一键载入已验收固件代码，不自动运行</w:t>
             </w:r>
           </w:p>
         </w:tc>
         <w:tc>
           <w:tcPr>
-            <w:tcW w:type="dxa" w:w="1418"/>
+            <w:tcW w:w="1418" w:type="dxa"/>
           </w:tcPr>
           <w:p>
+            <w:proofErr w:type="spellStart"/>
             <w:r>
               <w:t>策略标签</w:t>
             </w:r>
+            <w:proofErr w:type="spellEnd"/>
           </w:p>
         </w:tc>
         <w:tc>
           <w:tcPr>
-            <w:tcW w:type="dxa" w:w="1701"/>
+            <w:tcW w:w="1701" w:type="dxa"/>
           </w:tcPr>
           <w:p>
             <w:r>
@@ -1823,17 +1971,18 @@
       <w:tr>
         <w:tc>
           <w:tcPr>
-            <w:tcW w:type="dxa" w:w="1338"/>
+            <w:tcW w:w="1338" w:type="dxa"/>
           </w:tcPr>
           <w:p>
             <w:r>
+              <w:lastRenderedPageBreak/>
               <w:t>F10</w:t>
             </w:r>
           </w:p>
         </w:tc>
         <w:tc>
           <w:tcPr>
-            <w:tcW w:type="dxa" w:w="1644"/>
+            <w:tcW w:w="1644" w:type="dxa"/>
           </w:tcPr>
           <w:p>
             <w:r>
@@ -1843,43 +1992,79 @@
         </w:tc>
         <w:tc>
           <w:tcPr>
-            <w:tcW w:type="dxa" w:w="2121"/>
+            <w:tcW w:w="2121" w:type="dxa"/>
           </w:tcPr>
           <w:p>
-            <w:r>
+            <w:pPr>
+              <w:rPr>
+                <w:lang w:eastAsia="zh-CN"/>
+              </w:rPr>
+            </w:pPr>
+            <w:r>
+              <w:rPr>
+                <w:lang w:eastAsia="zh-CN"/>
+              </w:rPr>
               <w:t>串联三个冻结 Combat 与完整资源时间线</w:t>
             </w:r>
           </w:p>
         </w:tc>
         <w:tc>
           <w:tcPr>
-            <w:tcW w:type="dxa" w:w="1418"/>
+            <w:tcW w:w="1418" w:type="dxa"/>
           </w:tcPr>
           <w:p>
+            <w:proofErr w:type="spellStart"/>
             <w:r>
               <w:t>RunState</w:t>
             </w:r>
+            <w:proofErr w:type="spellEnd"/>
           </w:p>
         </w:tc>
         <w:tc>
           <w:tcPr>
-            <w:tcW w:type="dxa" w:w="1701"/>
+            <w:tcW w:w="1701" w:type="dxa"/>
           </w:tcPr>
           <w:p>
-            <w:r>
+            <w:pPr>
+              <w:rPr>
+                <w:lang w:eastAsia="zh-CN"/>
+              </w:rPr>
+            </w:pPr>
+            <w:r>
+              <w:rPr>
+                <w:lang w:eastAsia="zh-CN"/>
+              </w:rPr>
               <w:t>9 个敌人、总 Tick、伤害与最终统计</w:t>
             </w:r>
           </w:p>
         </w:tc>
       </w:tr>
     </w:tbl>
-    <w:p/>
+    <w:p>
+      <w:pPr>
+        <w:rPr>
+          <w:lang w:eastAsia="zh-CN"/>
+        </w:rPr>
+      </w:pPr>
+    </w:p>
     <w:p>
       <w:pPr>
         <w:pStyle w:val="31"/>
+        <w:rPr>
+          <w:lang w:eastAsia="zh-CN"/>
+        </w:rPr>
       </w:pPr>
       <w:r>
-        <w:t>3.2 非功能需求</w:t>
+        <w:rPr>
+          <w:lang w:eastAsia="zh-CN"/>
+        </w:rPr>
+        <w:t xml:space="preserve">3.2 </w:t>
+      </w:r>
+      <w:r>
+        <w:rPr>
+          <w:lang w:eastAsia="zh-CN"/>
+        </w:rPr>
+        <w:t>非功能需求</w:t>
       </w:r>
     </w:p>
     <w:p>
@@ -1889,7 +2074,13 @@
         </w:rPr>
       </w:pPr>
       <w:r>
-        <w:t>除功能外，项目还关注性能、易用性、兼容性与可靠性。核心逻辑均通过自动测试与真实 Chrome headless 回归验证。</w:t>
+        <w:rPr>
+          <w:lang w:eastAsia="zh-CN"/>
+        </w:rPr>
+        <w:t>除功能外，项目还关注性能、易用性、兼容性与可靠性。</w:t>
+      </w:r>
+      <w:r>
+        <w:t>核心逻辑均通过自动测试与真实 Chrome headless 回归验证。</w:t>
       </w:r>
     </w:p>
     <w:tbl>
@@ -1898,8 +2089,8 @@
         <w:tblLook w:val="04A0" w:firstRow="1" w:lastRow="0" w:firstColumn="1" w:lastColumn="0" w:noHBand="0" w:noVBand="1"/>
       </w:tblPr>
       <w:tblGrid>
-        <w:gridCol w:w="4142"/>
-        <w:gridCol w:w="4170"/>
+        <w:gridCol w:w="4100"/>
+        <w:gridCol w:w="4212"/>
       </w:tblGrid>
       <w:tr>
         <w:tc>
@@ -1980,8 +2171,6 @@
             <w:pPr>
               <w:spacing w:before="60" w:after="60" w:line="240" w:lineRule="auto"/>
             </w:pPr>
-            <w:proofErr w:type="spellStart"/>
-            <w:proofErr w:type="spellEnd"/>
             <w:r>
               <w:t>性能</w:t>
             </w:r>
@@ -2040,8 +2229,6 @@
             <w:pPr>
               <w:spacing w:before="60" w:after="60" w:line="240" w:lineRule="auto"/>
             </w:pPr>
-            <w:proofErr w:type="spellStart"/>
-            <w:proofErr w:type="spellEnd"/>
             <w:r>
               <w:t>易用性</w:t>
             </w:r>
@@ -2100,8 +2287,6 @@
             <w:pPr>
               <w:spacing w:before="60" w:after="60" w:line="240" w:lineRule="auto"/>
             </w:pPr>
-            <w:proofErr w:type="spellStart"/>
-            <w:proofErr w:type="spellEnd"/>
             <w:r>
               <w:t>兼容性</w:t>
             </w:r>
@@ -2128,12 +2313,14 @@
           <w:p>
             <w:pPr>
               <w:spacing w:before="60" w:after="60" w:line="240" w:lineRule="auto"/>
+              <w:rPr>
+                <w:lang w:eastAsia="zh-CN"/>
+              </w:rPr>
             </w:pPr>
-            <w:proofErr w:type="spellStart"/>
-            <w:proofErr w:type="spellEnd"/>
-            <w:proofErr w:type="spellStart"/>
-            <w:proofErr w:type="spellEnd"/>
-            <w:r>
+            <w:r>
+              <w:rPr>
+                <w:lang w:eastAsia="zh-CN"/>
+              </w:rPr>
               <w:t>支持现代 Chromium 浏览器；针对 1366×768、1600×900、1920×1080 完成地图响应式验证。</w:t>
             </w:r>
           </w:p>
@@ -2162,10 +2349,10 @@
               <w:spacing w:before="60" w:after="60" w:line="240" w:lineRule="auto"/>
             </w:pPr>
             <w:proofErr w:type="spellStart"/>
+            <w:r>
+              <w:t>安全性</w:t>
+            </w:r>
             <w:proofErr w:type="spellEnd"/>
-            <w:r>
-              <w:t>安全性</w:t>
-            </w:r>
           </w:p>
         </w:tc>
         <w:tc>
@@ -2193,7 +2380,24 @@
               </w:rPr>
             </w:pPr>
             <w:r>
-              <w:t>无用户敏感数据持久化；RoboC++ 仅在自定义解释器沙盒中执行，不直接运行原生二进制。</w:t>
+              <w:rPr>
+                <w:lang w:eastAsia="zh-CN"/>
+              </w:rPr>
+              <w:t>无用户敏感数据持久化；</w:t>
+            </w:r>
+            <w:proofErr w:type="spellStart"/>
+            <w:r>
+              <w:rPr>
+                <w:lang w:eastAsia="zh-CN"/>
+              </w:rPr>
+              <w:t>RoboC</w:t>
+            </w:r>
+            <w:proofErr w:type="spellEnd"/>
+            <w:r>
+              <w:rPr>
+                <w:lang w:eastAsia="zh-CN"/>
+              </w:rPr>
+              <w:t>++ 仅在自定义解释器沙盒中执行，不直接运行原生二进制。</w:t>
             </w:r>
           </w:p>
         </w:tc>
@@ -2232,7 +2436,16 @@
         </w:rPr>
       </w:pPr>
       <w:r>
-        <w:t>4.1 整体架构</w:t>
+        <w:rPr>
+          <w:lang w:eastAsia="zh-CN"/>
+        </w:rPr>
+        <w:t xml:space="preserve">4.1 </w:t>
+      </w:r>
+      <w:r>
+        <w:rPr>
+          <w:lang w:eastAsia="zh-CN"/>
+        </w:rPr>
+        <w:t>整体架构</w:t>
       </w:r>
     </w:p>
     <w:p>
@@ -2242,6 +2455,9 @@
         </w:rPr>
       </w:pPr>
       <w:r>
+        <w:rPr>
+          <w:lang w:eastAsia="zh-CN"/>
+        </w:rPr>
         <w:t>系统采用浏览器前端分层结构，不依赖后端服务器：</w:t>
       </w:r>
     </w:p>
@@ -2258,24 +2474,79 @@
       </w:pPr>
       <w:r>
         <w:rPr>
-          <w:rFonts w:ascii="Consolas" w:hAnsi="Consolas" w:eastAsia="等线"/>
+          <w:rFonts w:ascii="Consolas" w:eastAsia="等线" w:hAnsi="Consolas"/>
           <w:sz w:val="18"/>
         </w:rPr>
         <w:t>Vue UI / Game Interface</w:t>
+      </w:r>
+      <w:r>
+        <w:rPr>
+          <w:rFonts w:ascii="Consolas" w:eastAsia="等线" w:hAnsi="Consolas"/>
+          <w:sz w:val="18"/>
+        </w:rPr>
         <w:br/>
         <w:t xml:space="preserve">        ↓</w:t>
+      </w:r>
+      <w:r>
+        <w:rPr>
+          <w:rFonts w:ascii="Consolas" w:eastAsia="等线" w:hAnsi="Consolas"/>
+          <w:sz w:val="18"/>
+        </w:rPr>
         <w:br/>
         <w:t>Final Rogue / Story / Expedition orchestration</w:t>
+      </w:r>
+      <w:r>
+        <w:rPr>
+          <w:rFonts w:ascii="Consolas" w:eastAsia="等线" w:hAnsi="Consolas"/>
+          <w:sz w:val="18"/>
+        </w:rPr>
         <w:br/>
         <w:t xml:space="preserve">        ↓</w:t>
+      </w:r>
+      <w:r>
+        <w:rPr>
+          <w:rFonts w:ascii="Consolas" w:eastAsia="等线" w:hAnsi="Consolas"/>
+          <w:sz w:val="18"/>
+        </w:rPr>
         <w:br/>
         <w:t>RoboC++ Interpreter + Debugger</w:t>
+      </w:r>
+      <w:r>
+        <w:rPr>
+          <w:rFonts w:ascii="Consolas" w:eastAsia="等线" w:hAnsi="Consolas"/>
+          <w:sz w:val="18"/>
+        </w:rPr>
         <w:br/>
         <w:t xml:space="preserve">        ↓</w:t>
+      </w:r>
+      <w:r>
+        <w:rPr>
+          <w:rFonts w:ascii="Consolas" w:eastAsia="等线" w:hAnsi="Consolas"/>
+          <w:sz w:val="18"/>
+        </w:rPr>
         <w:br/>
         <w:t>Simulation Core</w:t>
+      </w:r>
+      <w:r>
+        <w:rPr>
+          <w:rFonts w:ascii="Consolas" w:eastAsia="等线" w:hAnsi="Consolas"/>
+          <w:sz w:val="18"/>
+        </w:rPr>
         <w:br/>
+      </w:r>
+      <w:r>
+        <w:rPr>
+          <w:rFonts w:ascii="Consolas" w:eastAsia="等线" w:hAnsi="Consolas"/>
+          <w:sz w:val="18"/>
+        </w:rPr>
+        <w:lastRenderedPageBreak/>
         <w:t xml:space="preserve">        ↓</w:t>
+      </w:r>
+      <w:r>
+        <w:rPr>
+          <w:rFonts w:ascii="Consolas" w:eastAsia="等线" w:hAnsi="Consolas"/>
+          <w:sz w:val="18"/>
+        </w:rPr>
         <w:br/>
         <w:t>Robot / Enemies / Dungeon / Modules</w:t>
       </w:r>
@@ -2298,7 +2569,10 @@
         </w:rPr>
       </w:pPr>
       <w:r>
-        <w:t>4.2 模块划分</w:t>
+        <w:t xml:space="preserve">4.2 </w:t>
+      </w:r>
+      <w:r>
+        <w:t>模块划分</w:t>
       </w:r>
     </w:p>
     <w:tbl>
@@ -2307,9 +2581,9 @@
         <w:tblLook w:val="04A0" w:firstRow="1" w:lastRow="0" w:firstColumn="1" w:lastColumn="0" w:noHBand="0" w:noVBand="1"/>
       </w:tblPr>
       <w:tblGrid>
-        <w:gridCol w:w="2777"/>
-        <w:gridCol w:w="2764"/>
-        <w:gridCol w:w="2771"/>
+        <w:gridCol w:w="2711"/>
+        <w:gridCol w:w="2822"/>
+        <w:gridCol w:w="2779"/>
       </w:tblGrid>
       <w:tr>
         <w:tc>
@@ -2328,10 +2602,6 @@
             <w:pPr>
               <w:spacing w:before="60" w:after="60" w:line="240" w:lineRule="auto"/>
             </w:pPr>
-            <w:proofErr w:type="spellStart"/>
-            <w:proofErr w:type="spellEnd"/>
-            <w:proofErr w:type="spellStart"/>
-            <w:proofErr w:type="spellEnd"/>
             <w:r>
               <w:t>模块 / 文件</w:t>
             </w:r>
@@ -2353,8 +2623,6 @@
             <w:pPr>
               <w:spacing w:before="60" w:after="60" w:line="240" w:lineRule="auto"/>
             </w:pPr>
-            <w:proofErr w:type="spellStart"/>
-            <w:proofErr w:type="spellEnd"/>
             <w:r>
               <w:t>职责</w:t>
             </w:r>
@@ -2376,10 +2644,6 @@
             <w:pPr>
               <w:spacing w:before="60" w:after="60" w:line="240" w:lineRule="auto"/>
             </w:pPr>
-            <w:proofErr w:type="spellStart"/>
-            <w:proofErr w:type="spellEnd"/>
-            <w:proofErr w:type="spellStart"/>
-            <w:proofErr w:type="spellEnd"/>
             <w:r>
               <w:t>主要接口 / 数据</w:t>
             </w:r>
@@ -2440,6 +2704,9 @@
               </w:rPr>
             </w:pPr>
             <w:r>
+              <w:rPr>
+                <w:lang w:eastAsia="zh-CN"/>
+              </w:rPr>
               <w:t>应用外壳、模式切换、编辑器/Debugger/战斗/决策界面</w:t>
             </w:r>
           </w:p>
@@ -2494,8 +2761,6 @@
             <w:pPr>
               <w:spacing w:before="60" w:after="60" w:line="240" w:lineRule="auto"/>
             </w:pPr>
-            <w:proofErr w:type="spellStart"/>
-            <w:proofErr w:type="spellEnd"/>
             <w:r>
               <w:t>src/core.ts</w:t>
             </w:r>
@@ -2522,8 +2787,6 @@
             <w:pPr>
               <w:spacing w:before="60" w:after="60" w:line="240" w:lineRule="auto"/>
             </w:pPr>
-            <w:proofErr w:type="spellStart"/>
-            <w:proofErr w:type="spellEnd"/>
             <w:r>
               <w:t>RoboC++ 宿主、Simulation、敌人 AI、Snapshot/Rollback/Trace</w:t>
             </w:r>
@@ -2550,8 +2813,6 @@
             <w:pPr>
               <w:spacing w:before="60" w:after="60" w:line="240" w:lineRule="auto"/>
             </w:pPr>
-            <w:proofErr w:type="spellStart"/>
-            <w:proofErr w:type="spellEnd"/>
             <w:r>
               <w:t>Simulation、ExpeditionRun、modifiers</w:t>
             </w:r>
@@ -2561,39 +2822,57 @@
       <w:tr>
         <w:tc>
           <w:tcPr>
-            <w:tcW w:type="dxa" w:w="2777"/>
+            <w:tcW w:w="2777" w:type="dxa"/>
           </w:tcPr>
           <w:p>
             <w:r>
-              <w:t xml:space="preserve">src/language.ts</w:t>
+              <w:t>src/language.ts</w:t>
             </w:r>
           </w:p>
         </w:tc>
         <w:tc>
           <w:tcPr>
-            <w:tcW w:type="dxa" w:w="2764"/>
+            <w:tcW w:w="2764" w:type="dxa"/>
           </w:tcPr>
           <w:p>
-            <w:r>
-              <w:t xml:space="preserve">RoboC++ 词法/语法/解释执行</w:t>
+            <w:pPr>
+              <w:rPr>
+                <w:lang w:eastAsia="zh-CN"/>
+              </w:rPr>
+            </w:pPr>
+            <w:proofErr w:type="spellStart"/>
+            <w:r>
+              <w:rPr>
+                <w:lang w:eastAsia="zh-CN"/>
+              </w:rPr>
+              <w:t>RoboC</w:t>
+            </w:r>
+            <w:proofErr w:type="spellEnd"/>
+            <w:r>
+              <w:rPr>
+                <w:lang w:eastAsia="zh-CN"/>
+              </w:rPr>
+              <w:t>++ 词法/语法/解释执行</w:t>
             </w:r>
           </w:p>
         </w:tc>
         <w:tc>
           <w:tcPr>
-            <w:tcW w:type="dxa" w:w="2771"/>
+            <w:tcW w:w="2771" w:type="dxa"/>
           </w:tcPr>
           <w:p>
-            <w:r>
-              <w:t xml:space="preserve">Parser、Interpreter、RuntimeHost</w:t>
-            </w:r>
+            <w:proofErr w:type="spellStart"/>
+            <w:r>
+              <w:t>Parser、Interpreter、RuntimeHost</w:t>
+            </w:r>
+            <w:proofErr w:type="spellEnd"/>
           </w:p>
         </w:tc>
       </w:tr>
       <w:tr>
         <w:tc>
           <w:tcPr>
-            <w:tcW w:type="dxa" w:w="2777"/>
+            <w:tcW w:w="2777" w:type="dxa"/>
           </w:tcPr>
           <w:p>
             <w:r>
@@ -2603,29 +2882,39 @@
         </w:tc>
         <w:tc>
           <w:tcPr>
-            <w:tcW w:type="dxa" w:w="2764"/>
+            <w:tcW w:w="2764" w:type="dxa"/>
           </w:tcPr>
           <w:p>
-            <w:r>
+            <w:pPr>
+              <w:rPr>
+                <w:lang w:eastAsia="zh-CN"/>
+              </w:rPr>
+            </w:pPr>
+            <w:r>
+              <w:rPr>
+                <w:lang w:eastAsia="zh-CN"/>
+              </w:rPr>
               <w:t>房间/走廊/门与坐标系统</w:t>
             </w:r>
           </w:p>
         </w:tc>
         <w:tc>
           <w:tcPr>
-            <w:tcW w:type="dxa" w:w="2771"/>
+            <w:tcW w:w="2771" w:type="dxa"/>
           </w:tcPr>
           <w:p>
+            <w:proofErr w:type="spellStart"/>
             <w:r>
               <w:t>DungeonLayout、walkableAt</w:t>
             </w:r>
+            <w:proofErr w:type="spellEnd"/>
           </w:p>
         </w:tc>
       </w:tr>
       <w:tr>
         <w:tc>
           <w:tcPr>
-            <w:tcW w:type="dxa" w:w="2777"/>
+            <w:tcW w:w="2777" w:type="dxa"/>
           </w:tcPr>
           <w:p>
             <w:r>
@@ -2635,7 +2924,7 @@
         </w:tc>
         <w:tc>
           <w:tcPr>
-            <w:tcW w:type="dxa" w:w="2764"/>
+            <w:tcW w:w="2764" w:type="dxa"/>
           </w:tcPr>
           <w:p>
             <w:r>
@@ -2645,7 +2934,7 @@
         </w:tc>
         <w:tc>
           <w:tcPr>
-            <w:tcW w:type="dxa" w:w="2771"/>
+            <w:tcW w:w="2771" w:type="dxa"/>
           </w:tcPr>
           <w:p>
             <w:r>
@@ -2657,7 +2946,7 @@
       <w:tr>
         <w:tc>
           <w:tcPr>
-            <w:tcW w:type="dxa" w:w="2777"/>
+            <w:tcW w:w="2777" w:type="dxa"/>
           </w:tcPr>
           <w:p>
             <w:r>
@@ -2667,7 +2956,7 @@
         </w:tc>
         <w:tc>
           <w:tcPr>
-            <w:tcW w:type="dxa" w:w="2764"/>
+            <w:tcW w:w="2764" w:type="dxa"/>
           </w:tcPr>
           <w:p>
             <w:r>
@@ -2677,7 +2966,7 @@
         </w:tc>
         <w:tc>
           <w:tcPr>
-            <w:tcW w:type="dxa" w:w="2771"/>
+            <w:tcW w:w="2771" w:type="dxa"/>
           </w:tcPr>
           <w:p>
             <w:r>
@@ -2689,7 +2978,7 @@
       <w:tr>
         <w:tc>
           <w:tcPr>
-            <w:tcW w:type="dxa" w:w="2777"/>
+            <w:tcW w:w="2777" w:type="dxa"/>
           </w:tcPr>
           <w:p>
             <w:r>
@@ -2699,7 +2988,7 @@
         </w:tc>
         <w:tc>
           <w:tcPr>
-            <w:tcW w:type="dxa" w:w="2764"/>
+            <w:tcW w:w="2764" w:type="dxa"/>
           </w:tcPr>
           <w:p>
             <w:r>
@@ -2709,7 +2998,7 @@
         </w:tc>
         <w:tc>
           <w:tcPr>
-            <w:tcW w:type="dxa" w:w="2771"/>
+            <w:tcW w:w="2771" w:type="dxa"/>
           </w:tcPr>
           <w:p>
             <w:r>
@@ -2721,17 +3010,22 @@
       <w:tr>
         <w:tc>
           <w:tcPr>
-            <w:tcW w:type="dxa" w:w="2777"/>
+            <w:tcW w:w="2777" w:type="dxa"/>
           </w:tcPr>
           <w:p>
-            <w:r>
-              <w:t>package.json / vite.config.ts</w:t>
+            <w:proofErr w:type="gramStart"/>
+            <w:r>
+              <w:t>package.json</w:t>
+            </w:r>
+            <w:proofErr w:type="gramEnd"/>
+            <w:r>
+              <w:t xml:space="preserve"> / vite.config.ts</w:t>
             </w:r>
           </w:p>
         </w:tc>
         <w:tc>
           <w:tcPr>
-            <w:tcW w:type="dxa" w:w="2764"/>
+            <w:tcW w:w="2764" w:type="dxa"/>
           </w:tcPr>
           <w:p>
             <w:r>
@@ -2741,7 +3035,7 @@
         </w:tc>
         <w:tc>
           <w:tcPr>
-            <w:tcW w:type="dxa" w:w="2771"/>
+            <w:tcW w:w="2771" w:type="dxa"/>
           </w:tcPr>
           <w:p>
             <w:r>
@@ -2760,7 +3054,28 @@
         </w:rPr>
       </w:pPr>
       <w:r>
-        <w:t>4.3 数据结构 / 存储设计</w:t>
+        <w:rPr>
+          <w:lang w:eastAsia="zh-CN"/>
+        </w:rPr>
+        <w:t xml:space="preserve">4.3 </w:t>
+      </w:r>
+      <w:r>
+        <w:rPr>
+          <w:lang w:eastAsia="zh-CN"/>
+        </w:rPr>
+        <w:t>数据结构</w:t>
+      </w:r>
+      <w:r>
+        <w:rPr>
+          <w:lang w:eastAsia="zh-CN"/>
+        </w:rPr>
+        <w:t xml:space="preserve"> / </w:t>
+      </w:r>
+      <w:r>
+        <w:rPr>
+          <w:lang w:eastAsia="zh-CN"/>
+        </w:rPr>
+        <w:t>存储设计</w:t>
       </w:r>
     </w:p>
     <w:p>
@@ -2770,7 +3085,26 @@
         </w:rPr>
       </w:pPr>
       <w:r>
-        <w:t>本项目不使用数据库。战斗与决策状态均在 Simulation / RunState 内存对象中保存；Story 进度与 meta 通过浏览器 localStorage 持久化。数据结构按职责分为以下类型：</w:t>
+        <w:rPr>
+          <w:lang w:eastAsia="zh-CN"/>
+        </w:rPr>
+        <w:t>本项目不使用数据库。</w:t>
+      </w:r>
+      <w:proofErr w:type="spellStart"/>
+      <w:r>
+        <w:t>战斗与决策状态均在</w:t>
+      </w:r>
+      <w:proofErr w:type="spellEnd"/>
+      <w:r>
+        <w:t xml:space="preserve"> Simulation / </w:t>
+      </w:r>
+      <w:proofErr w:type="spellStart"/>
+      <w:r>
+        <w:t>RunState</w:t>
+      </w:r>
+      <w:proofErr w:type="spellEnd"/>
+      <w:r>
+        <w:t xml:space="preserve"> 内存对象中保存；Story 进度与 meta 通过浏览器 localStorage 持久化。数据结构按职责分为以下类型：</w:t>
       </w:r>
     </w:p>
     <w:p>
@@ -2784,7 +3118,6 @@
           <w:lang w:eastAsia="zh-CN"/>
         </w:rPr>
       </w:pPr>
-      <w:r/>
     </w:p>
     <w:tbl>
       <w:tblPr>
@@ -2792,10 +3125,10 @@
         <w:tblLook w:val="04A0" w:firstRow="1" w:lastRow="0" w:firstColumn="1" w:lastColumn="0" w:noHBand="0" w:noVBand="1"/>
       </w:tblPr>
       <w:tblGrid>
-        <w:gridCol w:w="2068"/>
-        <w:gridCol w:w="2080"/>
-        <w:gridCol w:w="2094"/>
-        <w:gridCol w:w="2070"/>
+        <w:gridCol w:w="2102"/>
+        <w:gridCol w:w="2462"/>
+        <w:gridCol w:w="1739"/>
+        <w:gridCol w:w="2009"/>
       </w:tblGrid>
       <w:tr>
         <w:tc>
@@ -2814,9 +3147,8 @@
             <w:pPr>
               <w:spacing w:before="60" w:after="60" w:line="240" w:lineRule="auto"/>
             </w:pPr>
-            <w:proofErr w:type="spellStart"/>
-            <w:proofErr w:type="spellEnd"/>
-            <w:r>
+            <w:r>
+              <w:lastRenderedPageBreak/>
               <w:t>数据结构</w:t>
             </w:r>
           </w:p>
@@ -2837,8 +3169,6 @@
             <w:pPr>
               <w:spacing w:before="60" w:after="60" w:line="240" w:lineRule="auto"/>
             </w:pPr>
-            <w:proofErr w:type="spellStart"/>
-            <w:proofErr w:type="spellEnd"/>
             <w:r>
               <w:t>字段 / 成员</w:t>
             </w:r>
@@ -2860,8 +3190,6 @@
             <w:pPr>
               <w:spacing w:before="60" w:after="60" w:line="240" w:lineRule="auto"/>
             </w:pPr>
-            <w:proofErr w:type="spellStart"/>
-            <w:proofErr w:type="spellEnd"/>
             <w:r>
               <w:t>类型 / 约束</w:t>
             </w:r>
@@ -2883,8 +3211,6 @@
             <w:pPr>
               <w:spacing w:before="60" w:after="60" w:line="240" w:lineRule="auto"/>
             </w:pPr>
-            <w:proofErr w:type="spellStart"/>
-            <w:proofErr w:type="spellEnd"/>
             <w:r>
               <w:t>说明</w:t>
             </w:r>
@@ -2915,7 +3241,7 @@
               <w:spacing w:before="60" w:after="60" w:line="240" w:lineRule="auto"/>
             </w:pPr>
             <w:r>
-              <w:t xml:space="preserve">Enemy</w:t>
+              <w:t>Enemy</w:t>
             </w:r>
           </w:p>
         </w:tc>
@@ -2942,7 +3268,7 @@
               <w:spacing w:before="60" w:after="60" w:line="240" w:lineRule="auto"/>
             </w:pPr>
             <w:r>
-              <w:t xml:space="preserve">kind / hp / x / y / damage / moveEvery / attackEvery / range / active</w:t>
+              <w:t>kind / hp / x / y / damage / moveEvery / attackEvery / range / active</w:t>
             </w:r>
           </w:p>
         </w:tc>
@@ -2969,7 +3295,7 @@
               <w:spacing w:before="60" w:after="60" w:line="240" w:lineRule="auto"/>
             </w:pPr>
             <w:r>
-              <w:t xml:space="preserve">slime | runner | swarm | guard | turret | tank</w:t>
+              <w:t>slime | runner | swarm | guard | turret | tank</w:t>
             </w:r>
           </w:p>
         </w:tc>
@@ -2995,12 +3321,8 @@
             <w:pPr>
               <w:spacing w:before="60" w:after="60" w:line="240" w:lineRule="auto"/>
             </w:pPr>
-            <w:proofErr w:type="spellStart"/>
-            <w:proofErr w:type="spellEnd"/>
-            <w:proofErr w:type="spellStart"/>
-            <w:proofErr w:type="spellEnd"/>
-            <w:r>
-              <w:t xml:space="preserve">单个敌人的运行状态与行为参数；damage 为 optional override，未提供时使用全局 incomingDamage</w:t>
+            <w:r>
+              <w:t>单个敌人的运行状态与行为参数；damage 为 optional override，未提供时使用全局 incomingDamage</w:t>
             </w:r>
           </w:p>
         </w:tc>
@@ -3012,7 +3334,7 @@
           </w:tcPr>
           <w:p>
             <w:r>
-              <w:t xml:space="preserve">RogueCombatStats</w:t>
+              <w:t>RogueCombatStats</w:t>
             </w:r>
           </w:p>
         </w:tc>
@@ -3038,7 +3360,7 @@
               <w:spacing w:before="60" w:after="60" w:line="240" w:lineRule="auto"/>
             </w:pPr>
             <w:r>
-              <w:t xml:space="preserve">success / ticks / hp / energy / damageTaken / killOrder / activationTick / maxSimultaneousActive / exposureTicks</w:t>
+              <w:t>success / ticks / hp / energy / damageTaken / killOrder / activationTick / maxSimultaneousActive / exposureTicks</w:t>
             </w:r>
           </w:p>
         </w:tc>
@@ -3064,7 +3386,15 @@
               <w:spacing w:before="60" w:after="60" w:line="240" w:lineRule="auto"/>
             </w:pPr>
             <w:r>
-              <w:t xml:space="preserve">boolean / number / string[]</w:t>
+              <w:t xml:space="preserve">boolean / number / </w:t>
+            </w:r>
+            <w:proofErr w:type="gramStart"/>
+            <w:r>
+              <w:t>string[</w:t>
+            </w:r>
+            <w:proofErr w:type="gramEnd"/>
+            <w:r>
+              <w:t>]</w:t>
             </w:r>
           </w:p>
         </w:tc>
@@ -3079,10 +3409,8 @@
             </w:tcBorders>
           </w:tcPr>
           <w:p>
-            <w:proofErr w:type="spellStart"/>
-            <w:proofErr w:type="spellEnd"/>
-            <w:r>
-              <w:t xml:space="preserve">单场 Combat 的真实 Simulation 统计结果</w:t>
+            <w:r>
+              <w:t>单场 Combat 的真实 Simulation 统计结果</w:t>
             </w:r>
           </w:p>
         </w:tc>
@@ -3094,7 +3422,7 @@
           </w:tcPr>
           <w:p>
             <w:r>
-              <w:t xml:space="preserve">FinalRogueRunState</w:t>
+              <w:t>FinalRogueRunState</w:t>
             </w:r>
           </w:p>
         </w:tc>
@@ -3121,7 +3449,7 @@
               <w:spacing w:before="60" w:after="60" w:line="240" w:lineRule="auto"/>
             </w:pPr>
             <w:r>
-              <w:t xml:space="preserve">phase / hp / energy / modules / branch / restChoice / stats</w:t>
+              <w:t>phase / hp / energy / modules / branch / restChoice / stats</w:t>
             </w:r>
           </w:p>
         </w:tc>
@@ -3148,7 +3476,7 @@
               <w:spacing w:before="60" w:after="60" w:line="240" w:lineRule="auto"/>
             </w:pPr>
             <w:r>
-              <w:t xml:space="preserve">枚举 phase 与数值资源</w:t>
+              <w:t>枚举 phase 与数值资源</w:t>
             </w:r>
           </w:p>
         </w:tc>
@@ -3163,10 +3491,16 @@
             </w:tcBorders>
           </w:tcPr>
           <w:p>
-            <w:proofErr w:type="spellStart"/>
-            <w:proofErr w:type="spellEnd"/>
-            <w:r>
-              <w:t xml:space="preserve">保存 Final Rogue 跨节点状态：HP/Energy、已获得模块、路线选择、维护舱选择与累计统计</w:t>
+            <w:pPr>
+              <w:rPr>
+                <w:lang w:eastAsia="zh-CN"/>
+              </w:rPr>
+            </w:pPr>
+            <w:r>
+              <w:rPr>
+                <w:lang w:eastAsia="zh-CN"/>
+              </w:rPr>
+              <w:t>保存 Final Rogue 跨节点状态：HP/Energy、已获得模块、路线选择、维护舱选择与累计统计</w:t>
             </w:r>
           </w:p>
         </w:tc>
@@ -3174,41 +3508,41 @@
       <w:tr>
         <w:tc>
           <w:tcPr>
-            <w:tcW w:type="dxa" w:w="2068"/>
+            <w:tcW w:w="2068" w:type="dxa"/>
           </w:tcPr>
           <w:p>
             <w:r>
-              <w:t xml:space="preserve">Snapshot</w:t>
+              <w:t>Snapshot</w:t>
             </w:r>
           </w:p>
         </w:tc>
         <w:tc>
           <w:tcPr>
-            <w:tcW w:type="dxa" w:w="2080"/>
+            <w:tcW w:w="2080" w:type="dxa"/>
           </w:tcPr>
           <w:p>
             <w:r>
-              <w:t xml:space="preserve">robot / enemies / frames / tick / status</w:t>
+              <w:t>robot / enemies / frames / tick / status</w:t>
             </w:r>
           </w:p>
         </w:tc>
         <w:tc>
           <w:tcPr>
-            <w:tcW w:type="dxa" w:w="2094"/>
+            <w:tcW w:w="2094" w:type="dxa"/>
           </w:tcPr>
           <w:p>
             <w:r>
-              <w:t xml:space="preserve">完整深拷贝</w:t>
+              <w:t>完整深拷贝</w:t>
             </w:r>
           </w:p>
         </w:tc>
         <w:tc>
           <w:tcPr>
-            <w:tcW w:type="dxa" w:w="2070"/>
+            <w:tcW w:w="2070" w:type="dxa"/>
           </w:tcPr>
           <w:p>
             <w:r>
-              <w:t xml:space="preserve">保存机器人、敌人、位置、HP/Energy、tick、帧与解释器状态，供 Rollback 恢复</w:t>
+              <w:t>保存机器人、敌人、位置、HP/Energy、tick、帧与解释器状态，供 Rollback 恢复</w:t>
             </w:r>
           </w:p>
         </w:tc>
@@ -3216,48 +3550,60 @@
       <w:tr>
         <w:tc>
           <w:tcPr>
-            <w:tcW w:type="dxa" w:w="2068"/>
+            <w:tcW w:w="2068" w:type="dxa"/>
           </w:tcPr>
           <w:p>
             <w:r>
-              <w:t xml:space="preserve">RunRecord / MetaProgress</w:t>
+              <w:t>RunRecord / MetaProgress</w:t>
             </w:r>
           </w:p>
         </w:tc>
         <w:tc>
           <w:tcPr>
-            <w:tcW w:type="dxa" w:w="2080"/>
+            <w:tcW w:w="2080" w:type="dxa"/>
           </w:tcPr>
           <w:p>
             <w:r>
-              <w:t xml:space="preserve">seed / result / nodesCleared / credits / upgrades / lastRuns</w:t>
+              <w:t>seed / result / nodesCleared / credits / upgrades / lastRuns</w:t>
             </w:r>
           </w:p>
         </w:tc>
         <w:tc>
           <w:tcPr>
-            <w:tcW w:type="dxa" w:w="2094"/>
+            <w:tcW w:w="2094" w:type="dxa"/>
           </w:tcPr>
           <w:p>
             <w:r>
-              <w:t xml:space="preserve">JSON / localStorage</w:t>
+              <w:t>JSON / localStorage</w:t>
             </w:r>
           </w:p>
         </w:tc>
         <w:tc>
           <w:tcPr>
-            <w:tcW w:type="dxa" w:w="2070"/>
+            <w:tcW w:w="2070" w:type="dxa"/>
           </w:tcPr>
           <w:p>
-            <w:r>
-              <w:t xml:space="preserve">远征履历与跨局 meta 经济</w:t>
+            <w:pPr>
+              <w:rPr>
+                <w:lang w:eastAsia="zh-CN"/>
+              </w:rPr>
+            </w:pPr>
+            <w:r>
+              <w:rPr>
+                <w:lang w:eastAsia="zh-CN"/>
+              </w:rPr>
+              <w:t>远征履历与跨局 meta 经济</w:t>
             </w:r>
           </w:p>
         </w:tc>
       </w:tr>
     </w:tbl>
     <w:p>
-      <w:r/>
+      <w:pPr>
+        <w:rPr>
+          <w:lang w:eastAsia="zh-CN"/>
+        </w:rPr>
+      </w:pPr>
     </w:p>
     <w:p>
       <w:pPr>
@@ -3271,6 +3617,9 @@
         </w:rPr>
       </w:pPr>
       <w:r>
+        <w:rPr>
+          <w:lang w:eastAsia="zh-CN"/>
+        </w:rPr>
         <w:t>下表列出主要状态对象，类型与约束来自真实 TypeScript 接口。</w:t>
       </w:r>
     </w:p>
@@ -3282,11 +3631,28 @@
         </w:rPr>
       </w:pPr>
       <w:r>
-        <w:t>4.4 界面设计</w:t>
+        <w:rPr>
+          <w:lang w:eastAsia="zh-CN"/>
+        </w:rPr>
+        <w:t xml:space="preserve">4.4 </w:t>
+      </w:r>
+      <w:r>
+        <w:rPr>
+          <w:lang w:eastAsia="zh-CN"/>
+        </w:rPr>
+        <w:t>界面设计</w:t>
       </w:r>
     </w:p>
     <w:p>
-      <w:r>
+      <w:pPr>
+        <w:rPr>
+          <w:lang w:eastAsia="zh-CN"/>
+        </w:rPr>
+      </w:pPr>
+      <w:r>
+        <w:rPr>
+          <w:lang w:eastAsia="zh-CN"/>
+        </w:rPr>
         <w:t>主要界面包含三个：Final Rogue 战斗界面、Rogue 决策界面、行动完成与调试对照界面。下图分别展示战斗、模块奖励、路线选择与调试对照。</w:t>
       </w:r>
     </w:p>
@@ -3296,9 +3662,9 @@
         <w:tblLook w:val="04A0" w:firstRow="1" w:lastRow="0" w:firstColumn="1" w:lastColumn="0" w:noHBand="0" w:noVBand="1"/>
       </w:tblPr>
       <w:tblGrid>
-        <w:gridCol w:w="2760"/>
-        <w:gridCol w:w="2770"/>
-        <w:gridCol w:w="2782"/>
+        <w:gridCol w:w="2707"/>
+        <w:gridCol w:w="2763"/>
+        <w:gridCol w:w="2842"/>
       </w:tblGrid>
       <w:tr>
         <w:tc>
@@ -3318,10 +3684,11 @@
               <w:spacing w:before="60" w:after="60" w:line="240" w:lineRule="auto"/>
             </w:pPr>
             <w:proofErr w:type="spellStart"/>
+            <w:r>
+              <w:lastRenderedPageBreak/>
+              <w:t>界面名称</w:t>
+            </w:r>
             <w:proofErr w:type="spellEnd"/>
-            <w:r>
-              <w:t>界面名称</w:t>
-            </w:r>
           </w:p>
         </w:tc>
         <w:tc>
@@ -3340,8 +3707,6 @@
             <w:pPr>
               <w:spacing w:before="60" w:after="60" w:line="240" w:lineRule="auto"/>
             </w:pPr>
-            <w:proofErr w:type="spellStart"/>
-            <w:proofErr w:type="spellEnd"/>
             <w:r>
               <w:t>主要元素</w:t>
             </w:r>
@@ -3363,8 +3728,6 @@
             <w:pPr>
               <w:spacing w:before="60" w:after="60" w:line="240" w:lineRule="auto"/>
             </w:pPr>
-            <w:proofErr w:type="spellStart"/>
-            <w:proofErr w:type="spellEnd"/>
             <w:r>
               <w:t>核心交互</w:t>
             </w:r>
@@ -3394,8 +3757,6 @@
             <w:pPr>
               <w:spacing w:before="60" w:after="60" w:line="240" w:lineRule="auto"/>
             </w:pPr>
-            <w:proofErr w:type="spellStart"/>
-            <w:proofErr w:type="spellEnd"/>
             <w:r>
               <w:t>Final Rogue 战斗界面</w:t>
             </w:r>
@@ -3456,8 +3817,6 @@
                 <w:lang w:eastAsia="zh-CN"/>
               </w:rPr>
             </w:pPr>
-            <w:proofErr w:type="spellStart"/>
-            <w:proofErr w:type="spellEnd"/>
             <w:r>
               <w:t>载入固件 → 构建 → 运行 → 观察 Trace，可在火控核心使用 Snapshot/Rollback/Hot Reload</w:t>
             </w:r>
@@ -3486,8 +3845,6 @@
             <w:pPr>
               <w:spacing w:before="60" w:after="60" w:line="240" w:lineRule="auto"/>
             </w:pPr>
-            <w:proofErr w:type="spellStart"/>
-            <w:proofErr w:type="spellEnd"/>
             <w:r>
               <w:t>Rogue 决策界面</w:t>
             </w:r>
@@ -3514,8 +3871,6 @@
             <w:pPr>
               <w:spacing w:before="60" w:after="60" w:line="240" w:lineRule="auto"/>
             </w:pPr>
-            <w:proofErr w:type="spellStart"/>
-            <w:proofErr w:type="spellEnd"/>
             <w:r>
               <w:t>Reward 模块卡片、Safe/Risk 路线卡、维护舱选项</w:t>
             </w:r>
@@ -3541,43 +3896,94 @@
           <w:p>
             <w:pPr>
               <w:spacing w:before="60" w:after="60" w:line="240" w:lineRule="auto"/>
+              <w:rPr>
+                <w:lang w:eastAsia="zh-CN"/>
+              </w:rPr>
             </w:pPr>
+            <w:r>
+              <w:rPr>
+                <w:lang w:eastAsia="zh-CN"/>
+              </w:rPr>
+              <w:t xml:space="preserve">选择模块与路线，点击后真实写入 </w:t>
+            </w:r>
             <w:proofErr w:type="spellStart"/>
+            <w:r>
+              <w:rPr>
+                <w:lang w:eastAsia="zh-CN"/>
+              </w:rPr>
+              <w:t>RunState</w:t>
+            </w:r>
             <w:proofErr w:type="spellEnd"/>
-            <w:r>
-              <w:t>选择模块与路线，点击后真实写入 RunState</w:t>
-            </w:r>
           </w:p>
         </w:tc>
       </w:tr>
       <w:tr>
         <w:tc>
           <w:tcPr>
-            <w:tcW w:type="dxa" w:w="2760"/>
+            <w:tcW w:w="2760" w:type="dxa"/>
           </w:tcPr>
           <w:p>
-            <w:r>
-              <w:t>行动完成 / 调试对照</w:t>
-            </w:r>
+            <w:proofErr w:type="spellStart"/>
+            <w:r>
+              <w:t>行动完成</w:t>
+            </w:r>
+            <w:proofErr w:type="spellEnd"/>
+            <w:r>
+              <w:t xml:space="preserve"> / </w:t>
+            </w:r>
+            <w:proofErr w:type="spellStart"/>
+            <w:r>
+              <w:t>调试对照</w:t>
+            </w:r>
+            <w:proofErr w:type="spellEnd"/>
           </w:p>
         </w:tc>
         <w:tc>
           <w:tcPr>
-            <w:tcW w:type="dxa" w:w="2770"/>
+            <w:tcW w:w="2770" w:type="dxa"/>
           </w:tcPr>
           <w:p>
-            <w:r>
+            <w:pPr>
+              <w:rPr>
+                <w:lang w:eastAsia="zh-CN"/>
+              </w:rPr>
+            </w:pPr>
+            <w:r>
+              <w:rPr>
+                <w:lang w:eastAsia="zh-CN"/>
+              </w:rPr>
               <w:t>最终统计、模块、HP/Energy、调试前后对照</w:t>
             </w:r>
           </w:p>
         </w:tc>
         <w:tc>
           <w:tcPr>
-            <w:tcW w:type="dxa" w:w="2782"/>
+            <w:tcW w:w="2782" w:type="dxa"/>
           </w:tcPr>
           <w:p>
-            <w:r>
-              <w:t>查看 9 击杀/总 Tick/承伤与 Final HP/Energy</w:t>
+            <w:proofErr w:type="spellStart"/>
+            <w:r>
+              <w:t>查看</w:t>
+            </w:r>
+            <w:proofErr w:type="spellEnd"/>
+            <w:r>
+              <w:t xml:space="preserve"> 9 </w:t>
+            </w:r>
+            <w:proofErr w:type="spellStart"/>
+            <w:r>
+              <w:t>击杀</w:t>
+            </w:r>
+            <w:proofErr w:type="spellEnd"/>
+            <w:r>
+              <w:t>/总 Tick/</w:t>
+            </w:r>
+            <w:proofErr w:type="spellStart"/>
+            <w:r>
+              <w:t>承伤与</w:t>
+            </w:r>
+            <w:proofErr w:type="spellEnd"/>
+            <w:r>
+              <w:t xml:space="preserve"> Final HP/Energy</w:t>
             </w:r>
           </w:p>
         </w:tc>
@@ -3599,18 +4005,131 @@
         <w:jc w:val="center"/>
       </w:pPr>
       <w:r>
+        <w:rPr>
+          <w:noProof/>
+        </w:rPr>
         <w:drawing>
-          <wp:inline xmlns:a="http://schemas.openxmlformats.org/drawingml/2006/main" xmlns:pic="http://schemas.openxmlformats.org/drawingml/2006/picture">
+          <wp:inline distT="0" distB="0" distL="0" distR="0" wp14:anchorId="53A346FC" wp14:editId="39E70744">
             <wp:extent cx="5303520" cy="3031543"/>
+            <wp:effectExtent l="0" t="0" r="0" b="0"/>
             <wp:docPr id="1" name="Picture 1"/>
             <wp:cNvGraphicFramePr>
-              <a:graphicFrameLocks noChangeAspect="1"/>
+              <a:graphicFrameLocks xmlns:a="http://schemas.openxmlformats.org/drawingml/2006/main" noChangeAspect="1"/>
             </wp:cNvGraphicFramePr>
-            <a:graphic>
+            <a:graphic xmlns:a="http://schemas.openxmlformats.org/drawingml/2006/main">
               <a:graphicData uri="http://schemas.openxmlformats.org/drawingml/2006/picture">
-                <pic:pic>
+                <pic:pic xmlns:pic="http://schemas.openxmlformats.org/drawingml/2006/picture">
                   <pic:nvPicPr>
                     <pic:cNvPr id="0" name="docs-final-rogue-polish-01-combat1.png"/>
+                    <pic:cNvPicPr/>
+                  </pic:nvPicPr>
+                  <pic:blipFill>
+                    <a:blip r:embed="rId6"/>
+                    <a:stretch>
+                      <a:fillRect/>
+                    </a:stretch>
+                  </pic:blipFill>
+                  <pic:spPr>
+                    <a:xfrm>
+                      <a:off x="0" y="0"/>
+                      <a:ext cx="5303520" cy="3031543"/>
+                    </a:xfrm>
+                    <a:prstGeom prst="rect">
+                      <a:avLst/>
+                    </a:prstGeom>
+                  </pic:spPr>
+                </pic:pic>
+              </a:graphicData>
+            </a:graphic>
+          </wp:inline>
+        </w:drawing>
+      </w:r>
+    </w:p>
+    <w:p>
+      <w:pPr>
+        <w:pStyle w:val="af7"/>
+        <w:jc w:val="center"/>
+      </w:pPr>
+      <w:r>
+        <w:t>图 4-1 Final Rogue 战斗界面</w:t>
+      </w:r>
+    </w:p>
+    <w:p>
+      <w:pPr>
+        <w:jc w:val="center"/>
+      </w:pPr>
+      <w:r>
+        <w:rPr>
+          <w:noProof/>
+        </w:rPr>
+        <w:lastRenderedPageBreak/>
+        <w:drawing>
+          <wp:inline distT="0" distB="0" distL="0" distR="0" wp14:anchorId="6F0E8DBF" wp14:editId="1C60D49F">
+            <wp:extent cx="5303520" cy="3031543"/>
+            <wp:effectExtent l="0" t="0" r="0" b="0"/>
+            <wp:docPr id="2" name="Picture 2"/>
+            <wp:cNvGraphicFramePr>
+              <a:graphicFrameLocks xmlns:a="http://schemas.openxmlformats.org/drawingml/2006/main" noChangeAspect="1"/>
+            </wp:cNvGraphicFramePr>
+            <a:graphic xmlns:a="http://schemas.openxmlformats.org/drawingml/2006/main">
+              <a:graphicData uri="http://schemas.openxmlformats.org/drawingml/2006/picture">
+                <pic:pic xmlns:pic="http://schemas.openxmlformats.org/drawingml/2006/picture">
+                  <pic:nvPicPr>
+                    <pic:cNvPr id="0" name="docs-final-rogue-polish-02-reward1.png"/>
+                    <pic:cNvPicPr/>
+                  </pic:nvPicPr>
+                  <pic:blipFill>
+                    <a:blip r:embed="rId7"/>
+                    <a:stretch>
+                      <a:fillRect/>
+                    </a:stretch>
+                  </pic:blipFill>
+                  <pic:spPr>
+                    <a:xfrm>
+                      <a:off x="0" y="0"/>
+                      <a:ext cx="5303520" cy="3031543"/>
+                    </a:xfrm>
+                    <a:prstGeom prst="rect">
+                      <a:avLst/>
+                    </a:prstGeom>
+                  </pic:spPr>
+                </pic:pic>
+              </a:graphicData>
+            </a:graphic>
+          </wp:inline>
+        </w:drawing>
+      </w:r>
+    </w:p>
+    <w:p>
+      <w:pPr>
+        <w:pStyle w:val="af7"/>
+        <w:jc w:val="center"/>
+      </w:pPr>
+      <w:r>
+        <w:t>图 4-2 模块奖励卡片</w:t>
+      </w:r>
+    </w:p>
+    <w:p>
+      <w:pPr>
+        <w:jc w:val="center"/>
+      </w:pPr>
+      <w:r>
+        <w:rPr>
+          <w:noProof/>
+        </w:rPr>
+        <w:drawing>
+          <wp:inline distT="0" distB="0" distL="0" distR="0" wp14:anchorId="49C99188" wp14:editId="54E0E9F8">
+            <wp:extent cx="5303520" cy="3031543"/>
+            <wp:effectExtent l="0" t="0" r="0" b="0"/>
+            <wp:docPr id="3" name="Picture 3"/>
+            <wp:cNvGraphicFramePr>
+              <a:graphicFrameLocks xmlns:a="http://schemas.openxmlformats.org/drawingml/2006/main" noChangeAspect="1"/>
+            </wp:cNvGraphicFramePr>
+            <a:graphic xmlns:a="http://schemas.openxmlformats.org/drawingml/2006/main">
+              <a:graphicData uri="http://schemas.openxmlformats.org/drawingml/2006/picture">
+                <pic:pic xmlns:pic="http://schemas.openxmlformats.org/drawingml/2006/picture">
+                  <pic:nvPicPr>
+                    <pic:cNvPr id="0" name="docs-final-rogue-polish-03-branch.png"/>
                     <pic:cNvPicPr/>
                   </pic:nvPicPr>
                   <pic:blipFill>
@@ -3624,7 +4143,9 @@
                       <a:off x="0" y="0"/>
                       <a:ext cx="5303520" cy="3031543"/>
                     </a:xfrm>
-                    <a:prstGeom prst="rect"/>
+                    <a:prstGeom prst="rect">
+                      <a:avLst/>
+                    </a:prstGeom>
                   </pic:spPr>
                 </pic:pic>
               </a:graphicData>
@@ -3639,7 +4160,7 @@
         <w:jc w:val="center"/>
       </w:pPr>
       <w:r>
-        <w:t>图 4-1 Final Rogue 战斗界面</w:t>
+        <w:t>图 4-3 路线选择界面</w:t>
       </w:r>
     </w:p>
     <w:p>
@@ -3647,18 +4168,23 @@
         <w:jc w:val="center"/>
       </w:pPr>
       <w:r>
+        <w:rPr>
+          <w:noProof/>
+        </w:rPr>
+        <w:lastRenderedPageBreak/>
         <w:drawing>
-          <wp:inline xmlns:a="http://schemas.openxmlformats.org/drawingml/2006/main" xmlns:pic="http://schemas.openxmlformats.org/drawingml/2006/picture">
-            <wp:extent cx="5303520" cy="3031543"/>
-            <wp:docPr id="2" name="Picture 2"/>
+          <wp:inline distT="0" distB="0" distL="0" distR="0" wp14:anchorId="537CA795" wp14:editId="7035ECD2">
+            <wp:extent cx="5303520" cy="2695452"/>
+            <wp:effectExtent l="0" t="0" r="0" b="0"/>
+            <wp:docPr id="4" name="Picture 4"/>
             <wp:cNvGraphicFramePr>
-              <a:graphicFrameLocks noChangeAspect="1"/>
+              <a:graphicFrameLocks xmlns:a="http://schemas.openxmlformats.org/drawingml/2006/main" noChangeAspect="1"/>
             </wp:cNvGraphicFramePr>
-            <a:graphic>
+            <a:graphic xmlns:a="http://schemas.openxmlformats.org/drawingml/2006/main">
               <a:graphicData uri="http://schemas.openxmlformats.org/drawingml/2006/picture">
-                <pic:pic>
+                <pic:pic xmlns:pic="http://schemas.openxmlformats.org/drawingml/2006/picture">
                   <pic:nvPicPr>
-                    <pic:cNvPr id="0" name="docs-final-rogue-polish-02-reward1.png"/>
+                    <pic:cNvPr id="0" name="docs-debugcmp-adaptive-success-card.png"/>
                     <pic:cNvPicPr/>
                   </pic:nvPicPr>
                   <pic:blipFill>
@@ -3670,9 +4196,11 @@
                   <pic:spPr>
                     <a:xfrm>
                       <a:off x="0" y="0"/>
-                      <a:ext cx="5303520" cy="3031543"/>
+                      <a:ext cx="5303520" cy="2695452"/>
                     </a:xfrm>
-                    <a:prstGeom prst="rect"/>
+                    <a:prstGeom prst="rect">
+                      <a:avLst/>
+                    </a:prstGeom>
                   </pic:spPr>
                 </pic:pic>
               </a:graphicData>
@@ -3685,104 +4213,14 @@
       <w:pPr>
         <w:pStyle w:val="af7"/>
         <w:jc w:val="center"/>
+        <w:rPr>
+          <w:lang w:eastAsia="zh-CN"/>
+        </w:rPr>
       </w:pPr>
       <w:r>
-        <w:t>图 4-2 模块奖励卡片</w:t>
-      </w:r>
-    </w:p>
-    <w:p>
-      <w:pPr>
-        <w:jc w:val="center"/>
-      </w:pPr>
-      <w:r>
-        <w:drawing>
-          <wp:inline xmlns:a="http://schemas.openxmlformats.org/drawingml/2006/main" xmlns:pic="http://schemas.openxmlformats.org/drawingml/2006/picture">
-            <wp:extent cx="5303520" cy="3031543"/>
-            <wp:docPr id="3" name="Picture 3"/>
-            <wp:cNvGraphicFramePr>
-              <a:graphicFrameLocks noChangeAspect="1"/>
-            </wp:cNvGraphicFramePr>
-            <a:graphic>
-              <a:graphicData uri="http://schemas.openxmlformats.org/drawingml/2006/picture">
-                <pic:pic>
-                  <pic:nvPicPr>
-                    <pic:cNvPr id="0" name="docs-final-rogue-polish-03-branch.png"/>
-                    <pic:cNvPicPr/>
-                  </pic:nvPicPr>
-                  <pic:blipFill>
-                    <a:blip r:embed="rId10"/>
-                    <a:stretch>
-                      <a:fillRect/>
-                    </a:stretch>
-                  </pic:blipFill>
-                  <pic:spPr>
-                    <a:xfrm>
-                      <a:off x="0" y="0"/>
-                      <a:ext cx="5303520" cy="3031543"/>
-                    </a:xfrm>
-                    <a:prstGeom prst="rect"/>
-                  </pic:spPr>
-                </pic:pic>
-              </a:graphicData>
-            </a:graphic>
-          </wp:inline>
-        </w:drawing>
-      </w:r>
-    </w:p>
-    <w:p>
-      <w:pPr>
-        <w:pStyle w:val="af7"/>
-        <w:jc w:val="center"/>
-      </w:pPr>
-      <w:r>
-        <w:t>图 4-3 路线选择界面</w:t>
-      </w:r>
-    </w:p>
-    <w:p>
-      <w:pPr>
-        <w:jc w:val="center"/>
-      </w:pPr>
-      <w:r>
-        <w:drawing>
-          <wp:inline xmlns:a="http://schemas.openxmlformats.org/drawingml/2006/main" xmlns:pic="http://schemas.openxmlformats.org/drawingml/2006/picture">
-            <wp:extent cx="5303520" cy="2695452"/>
-            <wp:docPr id="4" name="Picture 4"/>
-            <wp:cNvGraphicFramePr>
-              <a:graphicFrameLocks noChangeAspect="1"/>
-            </wp:cNvGraphicFramePr>
-            <a:graphic>
-              <a:graphicData uri="http://schemas.openxmlformats.org/drawingml/2006/picture">
-                <pic:pic>
-                  <pic:nvPicPr>
-                    <pic:cNvPr id="0" name="docs-debugcmp-adaptive-success-card.png"/>
-                    <pic:cNvPicPr/>
-                  </pic:nvPicPr>
-                  <pic:blipFill>
-                    <a:blip r:embed="rId11"/>
-                    <a:stretch>
-                      <a:fillRect/>
-                    </a:stretch>
-                  </pic:blipFill>
-                  <pic:spPr>
-                    <a:xfrm>
-                      <a:off x="0" y="0"/>
-                      <a:ext cx="5303520" cy="2695452"/>
-                    </a:xfrm>
-                    <a:prstGeom prst="rect"/>
-                  </pic:spPr>
-                </pic:pic>
-              </a:graphicData>
-            </a:graphic>
-          </wp:inline>
-        </w:drawing>
-      </w:r>
-    </w:p>
-    <w:p>
-      <w:pPr>
-        <w:pStyle w:val="af7"/>
-        <w:jc w:val="center"/>
-      </w:pPr>
-      <w:r>
+        <w:rPr>
+          <w:lang w:eastAsia="zh-CN"/>
+        </w:rPr>
         <w:t>图 4-4 调试对照与行动完成</w:t>
       </w:r>
     </w:p>
@@ -3812,7 +4250,10 @@
         </w:rPr>
       </w:pPr>
       <w:r>
-        <w:t>5.1 关键技术点列表</w:t>
+        <w:t xml:space="preserve">5.1 </w:t>
+      </w:r>
+      <w:r>
+        <w:t>关键技术点列表</w:t>
       </w:r>
     </w:p>
     <w:p>
@@ -3821,7 +4262,6 @@
           <w:lang w:eastAsia="zh-CN"/>
         </w:rPr>
       </w:pPr>
-      <w:r/>
     </w:p>
     <w:p>
       <w:pPr>
@@ -3831,9 +4271,23 @@
           <w:numId w:val="11"/>
         </w:numPr>
         <w:spacing w:before="60" w:after="60"/>
+        <w:rPr>
+          <w:lang w:eastAsia="zh-CN"/>
+        </w:rPr>
       </w:pPr>
-      <w:r>
-        <w:t>RoboC++ 解释执行与机器人固件系统</w:t>
+      <w:proofErr w:type="spellStart"/>
+      <w:r>
+        <w:rPr>
+          <w:lang w:eastAsia="zh-CN"/>
+        </w:rPr>
+        <w:t>RoboC</w:t>
+      </w:r>
+      <w:proofErr w:type="spellEnd"/>
+      <w:r>
+        <w:rPr>
+          <w:lang w:eastAsia="zh-CN"/>
+        </w:rPr>
+        <w:t>++ 解释执行与机器人固件系统</w:t>
       </w:r>
     </w:p>
     <w:p>
@@ -3849,7 +4303,15 @@
         </w:rPr>
       </w:pPr>
       <w:r>
-        <w:t>Multi-enemy Simulation 与敌人 AI</w:t>
+        <w:t xml:space="preserve">Multi-enemy Simulation </w:t>
+      </w:r>
+      <w:proofErr w:type="spellStart"/>
+      <w:r>
+        <w:t>与敌人</w:t>
+      </w:r>
+      <w:proofErr w:type="spellEnd"/>
+      <w:r>
+        <w:t xml:space="preserve"> AI</w:t>
       </w:r>
     </w:p>
     <w:p>
@@ -3884,7 +4346,10 @@
         </w:rPr>
       </w:pPr>
       <w:r>
-        <w:t>5.2 技术点详解</w:t>
+        <w:t xml:space="preserve">5.2 </w:t>
+      </w:r>
+      <w:r>
+        <w:t>技术点详解</w:t>
       </w:r>
     </w:p>
     <w:p>
@@ -3895,7 +4360,42 @@
         </w:rPr>
       </w:pPr>
       <w:r>
-        <w:t>技术点 ①：RoboC++ 解释执行与机器人固件系统</w:t>
+        <w:rPr>
+          <w:lang w:eastAsia="zh-CN"/>
+        </w:rPr>
+        <w:t>技术点</w:t>
+      </w:r>
+      <w:r>
+        <w:rPr>
+          <w:lang w:eastAsia="zh-CN"/>
+        </w:rPr>
+        <w:t xml:space="preserve"> ①</w:t>
+      </w:r>
+      <w:r>
+        <w:rPr>
+          <w:lang w:eastAsia="zh-CN"/>
+        </w:rPr>
+        <w:t>：</w:t>
+      </w:r>
+      <w:proofErr w:type="spellStart"/>
+      <w:r>
+        <w:rPr>
+          <w:lang w:eastAsia="zh-CN"/>
+        </w:rPr>
+        <w:t>RoboC</w:t>
+      </w:r>
+      <w:proofErr w:type="spellEnd"/>
+      <w:r>
+        <w:rPr>
+          <w:lang w:eastAsia="zh-CN"/>
+        </w:rPr>
+        <w:t xml:space="preserve">++ </w:t>
+      </w:r>
+      <w:r>
+        <w:rPr>
+          <w:lang w:eastAsia="zh-CN"/>
+        </w:rPr>
+        <w:t>解释执行与机器人固件系统</w:t>
       </w:r>
     </w:p>
     <w:p>
@@ -3905,6 +4405,9 @@
         </w:rPr>
       </w:pPr>
       <w:r>
+        <w:rPr>
+          <w:lang w:eastAsia="zh-CN"/>
+        </w:rPr>
         <w:t>问题背景：机器人必须由玩家固件驱动，传感器和动作都要有真实语义。项目不能依赖浏览器 eval 或原生 C++ 编译，需要一个受限但可调试的解释执行层。</w:t>
       </w:r>
     </w:p>
@@ -3915,7 +4418,21 @@
         </w:rPr>
       </w:pPr>
       <w:r>
-        <w:t>算法思路：先对源码做词法分析生成 Token，再由 Parser 构造语法树；Interpreter 每一 Tick 从 update 入口执行，遇到传感器调用宿主 sense，遇到动作调用宿主 action。每次 update 最多提交一个世界动作，其余调用只产生传感器记录，从而保证 Trace 与回放一致。</w:t>
+        <w:t xml:space="preserve">算法思路：先对源码做词法分析生成 Token，再由 Parser 构造语法树；Interpreter 每一 Tick 从 update 入口执行，遇到传感器调用宿主 </w:t>
+      </w:r>
+      <w:proofErr w:type="spellStart"/>
+      <w:r>
+        <w:t>sense，遇到动作调用宿主</w:t>
+      </w:r>
+      <w:proofErr w:type="spellEnd"/>
+      <w:r>
+        <w:t xml:space="preserve"> action。</w:t>
+      </w:r>
+      <w:r>
+        <w:rPr>
+          <w:lang w:eastAsia="zh-CN"/>
+        </w:rPr>
+        <w:t>每次 update 最多提交一个世界动作，其余调用只产生传感器记录，从而保证 Trace 与回放一致。</w:t>
       </w:r>
     </w:p>
     <w:p>
@@ -3944,21 +4461,160 @@
       </w:pPr>
       <w:r>
         <w:rPr>
-          <w:rFonts w:ascii="Consolas" w:hAnsi="Consolas" w:eastAsia="等线"/>
+          <w:rFonts w:ascii="Consolas" w:eastAsia="等线" w:hAnsi="Consolas"/>
           <w:sz w:val="18"/>
         </w:rPr>
-        <w:t>输入：RoboC++ 源码与仿真状态</w:t>
+        <w:lastRenderedPageBreak/>
+        <w:t>输入：</w:t>
+      </w:r>
+      <w:r>
+        <w:rPr>
+          <w:rFonts w:ascii="Consolas" w:eastAsia="等线" w:hAnsi="Consolas"/>
+          <w:sz w:val="18"/>
+        </w:rPr>
+        <w:t xml:space="preserve">RoboC++ </w:t>
+      </w:r>
+      <w:r>
+        <w:rPr>
+          <w:rFonts w:ascii="Consolas" w:eastAsia="等线" w:hAnsi="Consolas"/>
+          <w:sz w:val="18"/>
+        </w:rPr>
+        <w:t>源码与仿真状态</w:t>
+      </w:r>
+      <w:r>
+        <w:rPr>
+          <w:rFonts w:ascii="Consolas" w:eastAsia="等线" w:hAnsi="Consolas"/>
+          <w:sz w:val="18"/>
+        </w:rPr>
         <w:br/>
+      </w:r>
+      <w:r>
+        <w:rPr>
+          <w:rFonts w:ascii="Consolas" w:eastAsia="等线" w:hAnsi="Consolas"/>
+          <w:sz w:val="18"/>
+        </w:rPr>
         <w:t>处理：</w:t>
+      </w:r>
+      <w:r>
+        <w:rPr>
+          <w:rFonts w:ascii="Consolas" w:eastAsia="等线" w:hAnsi="Consolas"/>
+          <w:sz w:val="18"/>
+        </w:rPr>
         <w:br/>
-        <w:t>1. lex(code) -&gt; token[]</w:t>
+        <w:t xml:space="preserve">1. lex(code) -&gt; </w:t>
+      </w:r>
+      <w:proofErr w:type="gramStart"/>
+      <w:r>
+        <w:rPr>
+          <w:rFonts w:ascii="Consolas" w:eastAsia="等线" w:hAnsi="Consolas"/>
+          <w:sz w:val="18"/>
+        </w:rPr>
+        <w:t>token[</w:t>
+      </w:r>
+      <w:proofErr w:type="gramEnd"/>
+      <w:r>
+        <w:rPr>
+          <w:rFonts w:ascii="Consolas" w:eastAsia="等线" w:hAnsi="Consolas"/>
+          <w:sz w:val="18"/>
+        </w:rPr>
+        <w:t>]</w:t>
+      </w:r>
+      <w:r>
+        <w:rPr>
+          <w:rFonts w:ascii="Consolas" w:eastAsia="等线" w:hAnsi="Consolas"/>
+          <w:sz w:val="18"/>
+        </w:rPr>
         <w:br/>
-        <w:t>2. parse(token[]) -&gt; AST</w:t>
+        <w:t>2. parse(</w:t>
+      </w:r>
+      <w:proofErr w:type="gramStart"/>
+      <w:r>
+        <w:rPr>
+          <w:rFonts w:ascii="Consolas" w:eastAsia="等线" w:hAnsi="Consolas"/>
+          <w:sz w:val="18"/>
+        </w:rPr>
+        <w:t>token[</w:t>
+      </w:r>
+      <w:proofErr w:type="gramEnd"/>
+      <w:r>
+        <w:rPr>
+          <w:rFonts w:ascii="Consolas" w:eastAsia="等线" w:hAnsi="Consolas"/>
+          <w:sz w:val="18"/>
+        </w:rPr>
+        <w:t>]) -&gt; AST</w:t>
+      </w:r>
+      <w:r>
+        <w:rPr>
+          <w:rFonts w:ascii="Consolas" w:eastAsia="等线" w:hAnsi="Consolas"/>
+          <w:sz w:val="18"/>
+        </w:rPr>
         <w:br/>
-        <w:t>3. interpreter.runTick() 执行 update</w:t>
+        <w:t xml:space="preserve">3. </w:t>
+      </w:r>
+      <w:proofErr w:type="gramStart"/>
+      <w:r>
+        <w:rPr>
+          <w:rFonts w:ascii="Consolas" w:eastAsia="等线" w:hAnsi="Consolas"/>
+          <w:sz w:val="18"/>
+        </w:rPr>
+        <w:t>interpreter.runTick</w:t>
+      </w:r>
+      <w:proofErr w:type="gramEnd"/>
+      <w:r>
+        <w:rPr>
+          <w:rFonts w:ascii="Consolas" w:eastAsia="等线" w:hAnsi="Consolas"/>
+          <w:sz w:val="18"/>
+        </w:rPr>
+        <w:t xml:space="preserve">() </w:t>
+      </w:r>
+      <w:r>
+        <w:rPr>
+          <w:rFonts w:ascii="Consolas" w:eastAsia="等线" w:hAnsi="Consolas"/>
+          <w:sz w:val="18"/>
+        </w:rPr>
+        <w:t>执行</w:t>
+      </w:r>
+      <w:r>
+        <w:rPr>
+          <w:rFonts w:ascii="Consolas" w:eastAsia="等线" w:hAnsi="Consolas"/>
+          <w:sz w:val="18"/>
+        </w:rPr>
+        <w:t xml:space="preserve"> update</w:t>
+      </w:r>
+      <w:r>
+        <w:rPr>
+          <w:rFonts w:ascii="Consolas" w:eastAsia="等线" w:hAnsi="Consolas"/>
+          <w:sz w:val="18"/>
+        </w:rPr>
         <w:br/>
-        <w:t>4. sense(name) / action(name) 交给 Simulation host</w:t>
+        <w:t xml:space="preserve">4. sense(name) / action(name) </w:t>
+      </w:r>
+      <w:r>
+        <w:rPr>
+          <w:rFonts w:ascii="Consolas" w:eastAsia="等线" w:hAnsi="Consolas"/>
+          <w:sz w:val="18"/>
+        </w:rPr>
+        <w:t>交给</w:t>
+      </w:r>
+      <w:r>
+        <w:rPr>
+          <w:rFonts w:ascii="Consolas" w:eastAsia="等线" w:hAnsi="Consolas"/>
+          <w:sz w:val="18"/>
+        </w:rPr>
+        <w:t xml:space="preserve"> Simulation host</w:t>
+      </w:r>
+      <w:r>
+        <w:rPr>
+          <w:rFonts w:ascii="Consolas" w:eastAsia="等线" w:hAnsi="Consolas"/>
+          <w:sz w:val="18"/>
+        </w:rPr>
         <w:br/>
+      </w:r>
+      <w:r>
+        <w:rPr>
+          <w:rFonts w:ascii="Consolas" w:eastAsia="等线" w:hAnsi="Consolas"/>
+          <w:sz w:val="18"/>
+        </w:rPr>
         <w:t>输出：动作、传感器值、变量、帧与运行状态</w:t>
       </w:r>
     </w:p>
@@ -3986,23 +4642,134 @@
       </w:pPr>
       <w:r>
         <w:rPr>
-          <w:rFonts w:ascii="Consolas" w:hAnsi="Consolas" w:eastAsia="等线"/>
+          <w:rFonts w:ascii="Consolas" w:eastAsia="等线" w:hAnsi="Consolas"/>
           <w:sz w:val="18"/>
         </w:rPr>
-        <w:t>// core.ts 中动作与传感器统一由 host 分派（真实实现节选）</w:t>
+        <w:t xml:space="preserve">// core.ts </w:t>
+      </w:r>
+      <w:r>
+        <w:rPr>
+          <w:rFonts w:ascii="Consolas" w:eastAsia="等线" w:hAnsi="Consolas"/>
+          <w:sz w:val="18"/>
+        </w:rPr>
+        <w:t>中动作与传感器统一由</w:t>
+      </w:r>
+      <w:r>
+        <w:rPr>
+          <w:rFonts w:ascii="Consolas" w:eastAsia="等线" w:hAnsi="Consolas"/>
+          <w:sz w:val="18"/>
+        </w:rPr>
+        <w:t xml:space="preserve"> host </w:t>
+      </w:r>
+      <w:r>
+        <w:rPr>
+          <w:rFonts w:ascii="Consolas" w:eastAsia="等线" w:hAnsi="Consolas"/>
+          <w:sz w:val="18"/>
+        </w:rPr>
+        <w:t>分派（真实实现节选）</w:t>
+      </w:r>
+      <w:r>
+        <w:rPr>
+          <w:rFonts w:ascii="Consolas" w:eastAsia="等线" w:hAnsi="Consolas"/>
+          <w:sz w:val="18"/>
+        </w:rPr>
         <w:br/>
         <w:t>action: (n) =&gt; {</w:t>
+      </w:r>
+      <w:r>
+        <w:rPr>
+          <w:rFonts w:ascii="Consolas" w:eastAsia="等线" w:hAnsi="Consolas"/>
+          <w:sz w:val="18"/>
+        </w:rPr>
         <w:br/>
-        <w:t xml:space="preserve">  if (n === 'move_forward') { ... move robot ... }</w:t>
+        <w:t xml:space="preserve">  if (n === 'move_forward') </w:t>
+      </w:r>
+      <w:proofErr w:type="gramStart"/>
+      <w:r>
+        <w:rPr>
+          <w:rFonts w:ascii="Consolas" w:eastAsia="等线" w:hAnsi="Consolas"/>
+          <w:sz w:val="18"/>
+        </w:rPr>
+        <w:t>{ ...</w:t>
+      </w:r>
+      <w:proofErr w:type="gramEnd"/>
+      <w:r>
+        <w:rPr>
+          <w:rFonts w:ascii="Consolas" w:eastAsia="等线" w:hAnsi="Consolas"/>
+          <w:sz w:val="18"/>
+        </w:rPr>
+        <w:t xml:space="preserve"> move robot </w:t>
+      </w:r>
+      <w:proofErr w:type="gramStart"/>
+      <w:r>
+        <w:rPr>
+          <w:rFonts w:ascii="Consolas" w:eastAsia="等线" w:hAnsi="Consolas"/>
+          <w:sz w:val="18"/>
+        </w:rPr>
+        <w:t>... }</w:t>
+      </w:r>
+      <w:proofErr w:type="gramEnd"/>
+      <w:r>
+        <w:rPr>
+          <w:rFonts w:ascii="Consolas" w:eastAsia="等线" w:hAnsi="Consolas"/>
+          <w:sz w:val="18"/>
+        </w:rPr>
         <w:br/>
         <w:t xml:space="preserve">  else if (n === 'ranged_attack') {</w:t>
+      </w:r>
+      <w:r>
+        <w:rPr>
+          <w:rFonts w:ascii="Consolas" w:eastAsia="等线" w:hAnsi="Consolas"/>
+          <w:sz w:val="18"/>
+        </w:rPr>
         <w:br/>
         <w:t xml:space="preserve">    const target = nearestEnemyInRange(rangedRange);</w:t>
+      </w:r>
+      <w:r>
+        <w:rPr>
+          <w:rFonts w:ascii="Consolas" w:eastAsia="等线" w:hAnsi="Consolas"/>
+          <w:sz w:val="18"/>
+        </w:rPr>
         <w:br/>
-        <w:t xml:space="preserve">    target.hp -= rangedPower; ...</w:t>
+        <w:t xml:space="preserve">    </w:t>
+      </w:r>
+      <w:proofErr w:type="gramStart"/>
+      <w:r>
+        <w:rPr>
+          <w:rFonts w:ascii="Consolas" w:eastAsia="等线" w:hAnsi="Consolas"/>
+          <w:sz w:val="18"/>
+        </w:rPr>
+        <w:t>target.hp</w:t>
+      </w:r>
+      <w:proofErr w:type="gramEnd"/>
+      <w:r>
+        <w:rPr>
+          <w:rFonts w:ascii="Consolas" w:eastAsia="等线" w:hAnsi="Consolas"/>
+          <w:sz w:val="18"/>
+        </w:rPr>
+        <w:t xml:space="preserve"> -= rangedPower; ...</w:t>
+      </w:r>
+      <w:r>
+        <w:rPr>
+          <w:rFonts w:ascii="Consolas" w:eastAsia="等线" w:hAnsi="Consolas"/>
+          <w:sz w:val="18"/>
+        </w:rPr>
         <w:br/>
         <w:t xml:space="preserve">  }</w:t>
+      </w:r>
+      <w:r>
+        <w:rPr>
+          <w:rFonts w:ascii="Consolas" w:eastAsia="等线" w:hAnsi="Consolas"/>
+          <w:sz w:val="18"/>
+        </w:rPr>
         <w:br/>
+      </w:r>
+      <w:r>
+        <w:rPr>
+          <w:rFonts w:ascii="Consolas" w:eastAsia="等线" w:hAnsi="Consolas"/>
+          <w:sz w:val="18"/>
+          <w:lang w:eastAsia="zh-CN"/>
+        </w:rPr>
         <w:t>}</w:t>
       </w:r>
     </w:p>
@@ -4013,7 +4780,24 @@
         </w:rPr>
       </w:pPr>
       <w:r>
-        <w:t>效果：传感器调用与动作调用均可被 Trace 记录，支持断点、单步与源码行定位。局限是 RoboC++ 刻意不支持完整 C++ 标准库，所有能力都集中在游戏所需子集。</w:t>
+        <w:rPr>
+          <w:lang w:eastAsia="zh-CN"/>
+        </w:rPr>
+        <w:t xml:space="preserve">效果：传感器调用与动作调用均可被 Trace 记录，支持断点、单步与源码行定位。局限是 </w:t>
+      </w:r>
+      <w:proofErr w:type="spellStart"/>
+      <w:r>
+        <w:rPr>
+          <w:lang w:eastAsia="zh-CN"/>
+        </w:rPr>
+        <w:t>RoboC</w:t>
+      </w:r>
+      <w:proofErr w:type="spellEnd"/>
+      <w:r>
+        <w:rPr>
+          <w:lang w:eastAsia="zh-CN"/>
+        </w:rPr>
+        <w:t>++ 刻意不支持完整 C++ 标准库，所有能力都集中在游戏所需子集。</w:t>
       </w:r>
     </w:p>
     <w:p>
@@ -4024,7 +4808,22 @@
         </w:rPr>
       </w:pPr>
       <w:r>
-        <w:t>技术点 ②：Multi-enemy Simulation 与敌人 AI</w:t>
+        <w:t>技术点</w:t>
+      </w:r>
+      <w:r>
+        <w:t xml:space="preserve"> ②</w:t>
+      </w:r>
+      <w:r>
+        <w:t>：</w:t>
+      </w:r>
+      <w:r>
+        <w:t xml:space="preserve">Multi-enemy Simulation </w:t>
+      </w:r>
+      <w:r>
+        <w:t>与敌人</w:t>
+      </w:r>
+      <w:r>
+        <w:t xml:space="preserve"> AI</w:t>
       </w:r>
     </w:p>
     <w:p>
@@ -4034,41 +4833,391 @@
         </w:rPr>
       </w:pPr>
       <w:r>
-        <w:t>问题背景：早期系统只有单 enemy，所有传感器、动作、Snapshot、Trace 都围绕 this.enemy 实现。加入第二个或第三个敌人后，最近目标、碰撞与回滚都会出错。算法思路：新增 enemies[]，保留 enemy 作为 legacy alias；所有目标选择收敛到 nearestEnemy/nearestEnemyInRange；每个敌人拥有独立 runtime（maxHp、attackCount、jitter）；每个 Tick 循环执行各敌人的攻击与移动。</w:t>
+        <w:t xml:space="preserve">问题背景：早期系统只有单 enemy，所有传感器、动作、Snapshot、Trace 都围绕 </w:t>
+      </w:r>
+      <w:proofErr w:type="gramStart"/>
+      <w:r>
+        <w:t>this.enemy</w:t>
+      </w:r>
+      <w:proofErr w:type="gramEnd"/>
+      <w:r>
+        <w:t xml:space="preserve"> </w:t>
+      </w:r>
+      <w:proofErr w:type="spellStart"/>
+      <w:r>
+        <w:t>实现</w:t>
+      </w:r>
+      <w:proofErr w:type="spellEnd"/>
+      <w:r>
+        <w:t>。</w:t>
+      </w:r>
+      <w:r>
+        <w:rPr>
+          <w:lang w:eastAsia="zh-CN"/>
+        </w:rPr>
+        <w:t xml:space="preserve">加入第二个或第三个敌人后，最近目标、碰撞与回滚都会出错。算法思路：新增 </w:t>
+      </w:r>
+      <w:proofErr w:type="gramStart"/>
+      <w:r>
+        <w:rPr>
+          <w:lang w:eastAsia="zh-CN"/>
+        </w:rPr>
+        <w:t>enemies[</w:t>
+      </w:r>
+      <w:proofErr w:type="gramEnd"/>
+      <w:r>
+        <w:rPr>
+          <w:lang w:eastAsia="zh-CN"/>
+        </w:rPr>
+        <w:t xml:space="preserve">]，保留 enemy 作为 legacy alias；所有目标选择收敛到 </w:t>
+      </w:r>
+      <w:proofErr w:type="spellStart"/>
+      <w:r>
+        <w:rPr>
+          <w:lang w:eastAsia="zh-CN"/>
+        </w:rPr>
+        <w:t>nearestEnemy</w:t>
+      </w:r>
+      <w:proofErr w:type="spellEnd"/>
+      <w:r>
+        <w:rPr>
+          <w:lang w:eastAsia="zh-CN"/>
+        </w:rPr>
+        <w:t>/</w:t>
+      </w:r>
+      <w:proofErr w:type="spellStart"/>
+      <w:r>
+        <w:rPr>
+          <w:lang w:eastAsia="zh-CN"/>
+        </w:rPr>
+        <w:t>nearestEnemyInRange</w:t>
+      </w:r>
+      <w:proofErr w:type="spellEnd"/>
+      <w:r>
+        <w:rPr>
+          <w:lang w:eastAsia="zh-CN"/>
+        </w:rPr>
+        <w:t>；每个敌人拥有独立 runtime（</w:t>
+      </w:r>
+      <w:proofErr w:type="spellStart"/>
+      <w:r>
+        <w:rPr>
+          <w:lang w:eastAsia="zh-CN"/>
+        </w:rPr>
+        <w:t>maxHp</w:t>
+      </w:r>
+      <w:proofErr w:type="spellEnd"/>
+      <w:r>
+        <w:rPr>
+          <w:lang w:eastAsia="zh-CN"/>
+        </w:rPr>
+        <w:t>、</w:t>
+      </w:r>
+      <w:proofErr w:type="spellStart"/>
+      <w:r>
+        <w:rPr>
+          <w:lang w:eastAsia="zh-CN"/>
+        </w:rPr>
+        <w:t>attackCount</w:t>
+      </w:r>
+      <w:proofErr w:type="spellEnd"/>
+      <w:r>
+        <w:rPr>
+          <w:lang w:eastAsia="zh-CN"/>
+        </w:rPr>
+        <w:t>、jitter）；每个 Tick 循环执行各敌人的攻击与移动。</w:t>
       </w:r>
     </w:p>
     <w:p>
-      <w:pPr/>
-      <w:r>
-        <w:rPr>
-          <w:rFonts w:ascii="Consolas" w:hAnsi="Consolas" w:eastAsia="等线"/>
+      <w:r>
+        <w:rPr>
+          <w:rFonts w:ascii="Consolas" w:eastAsia="等线" w:hAnsi="Consolas"/>
           <w:sz w:val="18"/>
         </w:rPr>
-        <w:t>// core.ts resolveEnemies 中敌人按独立 runtime 结算（真实节选）</w:t>
+        <w:t xml:space="preserve">// core.ts resolveEnemies </w:t>
+      </w:r>
+      <w:r>
+        <w:rPr>
+          <w:rFonts w:ascii="Consolas" w:eastAsia="等线" w:hAnsi="Consolas"/>
+          <w:sz w:val="18"/>
+        </w:rPr>
+        <w:t>中敌人按独立</w:t>
+      </w:r>
+      <w:r>
+        <w:rPr>
+          <w:rFonts w:ascii="Consolas" w:eastAsia="等线" w:hAnsi="Consolas"/>
+          <w:sz w:val="18"/>
+        </w:rPr>
+        <w:t xml:space="preserve"> runtime </w:t>
+      </w:r>
+      <w:r>
+        <w:rPr>
+          <w:rFonts w:ascii="Consolas" w:eastAsia="等线" w:hAnsi="Consolas"/>
+          <w:sz w:val="18"/>
+        </w:rPr>
+        <w:t>结算（真实节选）</w:t>
+      </w:r>
+      <w:r>
+        <w:rPr>
+          <w:rFonts w:ascii="Consolas" w:eastAsia="等线" w:hAnsi="Consolas"/>
+          <w:sz w:val="18"/>
+        </w:rPr>
         <w:br/>
-        <w:t>for (let idx = 0; idx &lt; this.enemies.length; idx++) {</w:t>
+        <w:t xml:space="preserve">for (let idx = 0; idx &lt; </w:t>
+      </w:r>
+      <w:proofErr w:type="gramStart"/>
+      <w:r>
+        <w:rPr>
+          <w:rFonts w:ascii="Consolas" w:eastAsia="等线" w:hAnsi="Consolas"/>
+          <w:sz w:val="18"/>
+        </w:rPr>
+        <w:t>this.enemies</w:t>
+      </w:r>
+      <w:proofErr w:type="gramEnd"/>
+      <w:r>
+        <w:rPr>
+          <w:rFonts w:ascii="Consolas" w:eastAsia="等线" w:hAnsi="Consolas"/>
+          <w:sz w:val="18"/>
+        </w:rPr>
+        <w:t>.length; idx++) {</w:t>
+      </w:r>
+      <w:r>
+        <w:rPr>
+          <w:rFonts w:ascii="Consolas" w:eastAsia="等线" w:hAnsi="Consolas"/>
+          <w:sz w:val="18"/>
+        </w:rPr>
         <w:br/>
-        <w:t xml:space="preserve">  const enemy = this.enemies[idx];</w:t>
+        <w:t xml:space="preserve">  const enemy = </w:t>
+      </w:r>
+      <w:proofErr w:type="gramStart"/>
+      <w:r>
+        <w:rPr>
+          <w:rFonts w:ascii="Consolas" w:eastAsia="等线" w:hAnsi="Consolas"/>
+          <w:sz w:val="18"/>
+        </w:rPr>
+        <w:t>this.enemies</w:t>
+      </w:r>
+      <w:proofErr w:type="gramEnd"/>
+      <w:r>
+        <w:rPr>
+          <w:rFonts w:ascii="Consolas" w:eastAsia="等线" w:hAnsi="Consolas"/>
+          <w:sz w:val="18"/>
+        </w:rPr>
+        <w:t>[idx];</w:t>
+      </w:r>
+      <w:r>
+        <w:rPr>
+          <w:rFonts w:ascii="Consolas" w:eastAsia="等线" w:hAnsi="Consolas"/>
+          <w:sz w:val="18"/>
+        </w:rPr>
         <w:br/>
-        <w:t xml:space="preserve">  const rt = this.enemyRuntimes[idx] ?? ...;</w:t>
+        <w:t xml:space="preserve">  const rt = </w:t>
+      </w:r>
+      <w:proofErr w:type="gramStart"/>
+      <w:r>
+        <w:rPr>
+          <w:rFonts w:ascii="Consolas" w:eastAsia="等线" w:hAnsi="Consolas"/>
+          <w:sz w:val="18"/>
+        </w:rPr>
+        <w:t>this.enemyRuntimes</w:t>
+      </w:r>
+      <w:proofErr w:type="gramEnd"/>
+      <w:r>
+        <w:rPr>
+          <w:rFonts w:ascii="Consolas" w:eastAsia="等线" w:hAnsi="Consolas"/>
+          <w:sz w:val="18"/>
+        </w:rPr>
+        <w:t>[idx</w:t>
+      </w:r>
+      <w:proofErr w:type="gramStart"/>
+      <w:r>
+        <w:rPr>
+          <w:rFonts w:ascii="Consolas" w:eastAsia="等线" w:hAnsi="Consolas"/>
+          <w:sz w:val="18"/>
+        </w:rPr>
+        <w:t>] ??</w:t>
+      </w:r>
+      <w:proofErr w:type="gramEnd"/>
+      <w:r>
+        <w:rPr>
+          <w:rFonts w:ascii="Consolas" w:eastAsia="等线" w:hAnsi="Consolas"/>
+          <w:sz w:val="18"/>
+        </w:rPr>
+        <w:t xml:space="preserve"> ...;</w:t>
+      </w:r>
+      <w:r>
+        <w:rPr>
+          <w:rFonts w:ascii="Consolas" w:eastAsia="等线" w:hAnsi="Consolas"/>
+          <w:sz w:val="18"/>
+        </w:rPr>
         <w:br/>
-        <w:t xml:space="preserve">  if (inRange &amp;&amp; this.tick % attackEvery === 0) { ... }</w:t>
+        <w:t xml:space="preserve">  if (inRange &amp;&amp; </w:t>
+      </w:r>
+      <w:proofErr w:type="gramStart"/>
+      <w:r>
+        <w:rPr>
+          <w:rFonts w:ascii="Consolas" w:eastAsia="等线" w:hAnsi="Consolas"/>
+          <w:sz w:val="18"/>
+        </w:rPr>
+        <w:t>this.tick</w:t>
+      </w:r>
+      <w:proofErr w:type="gramEnd"/>
+      <w:r>
+        <w:rPr>
+          <w:rFonts w:ascii="Consolas" w:eastAsia="等线" w:hAnsi="Consolas"/>
+          <w:sz w:val="18"/>
+        </w:rPr>
+        <w:t xml:space="preserve"> % attackEvery === 0) </w:t>
+      </w:r>
+      <w:proofErr w:type="gramStart"/>
+      <w:r>
+        <w:rPr>
+          <w:rFonts w:ascii="Consolas" w:eastAsia="等线" w:hAnsi="Consolas"/>
+          <w:sz w:val="18"/>
+        </w:rPr>
+        <w:t>{ ...</w:t>
+      </w:r>
+      <w:proofErr w:type="gramEnd"/>
+      <w:r>
+        <w:rPr>
+          <w:rFonts w:ascii="Consolas" w:eastAsia="等线" w:hAnsi="Consolas"/>
+          <w:sz w:val="18"/>
+        </w:rPr>
+        <w:t xml:space="preserve"> }</w:t>
+      </w:r>
+      <w:r>
+        <w:rPr>
+          <w:rFonts w:ascii="Consolas" w:eastAsia="等线" w:hAnsi="Consolas"/>
+          <w:sz w:val="18"/>
+        </w:rPr>
         <w:br/>
-        <w:t xml:space="preserve">  if (kind !== 'turret' &amp;&amp; this.tick % moveEvery === 0) {</w:t>
+        <w:t xml:space="preserve">  if (</w:t>
+      </w:r>
+      <w:proofErr w:type="gramStart"/>
+      <w:r>
+        <w:rPr>
+          <w:rFonts w:ascii="Consolas" w:eastAsia="等线" w:hAnsi="Consolas"/>
+          <w:sz w:val="18"/>
+        </w:rPr>
+        <w:t>kind !</w:t>
+      </w:r>
+      <w:proofErr w:type="gramEnd"/>
+      <w:r>
+        <w:rPr>
+          <w:rFonts w:ascii="Consolas" w:eastAsia="等线" w:hAnsi="Consolas"/>
+          <w:sz w:val="18"/>
+        </w:rPr>
+        <w:t xml:space="preserve">== 'turret' &amp;&amp; </w:t>
+      </w:r>
+      <w:proofErr w:type="gramStart"/>
+      <w:r>
+        <w:rPr>
+          <w:rFonts w:ascii="Consolas" w:eastAsia="等线" w:hAnsi="Consolas"/>
+          <w:sz w:val="18"/>
+        </w:rPr>
+        <w:t>this.tick</w:t>
+      </w:r>
+      <w:proofErr w:type="gramEnd"/>
+      <w:r>
+        <w:rPr>
+          <w:rFonts w:ascii="Consolas" w:eastAsia="等线" w:hAnsi="Consolas"/>
+          <w:sz w:val="18"/>
+        </w:rPr>
+        <w:t xml:space="preserve"> % moveEvery === 0) {</w:t>
+      </w:r>
+      <w:r>
+        <w:rPr>
+          <w:rFonts w:ascii="Consolas" w:eastAsia="等线" w:hAnsi="Consolas"/>
+          <w:sz w:val="18"/>
+        </w:rPr>
         <w:br/>
-        <w:t xml:space="preserve">    const step = this.nextEnemyStep(idx);</w:t>
+        <w:t xml:space="preserve">    const step = </w:t>
+      </w:r>
+      <w:proofErr w:type="gramStart"/>
+      <w:r>
+        <w:rPr>
+          <w:rFonts w:ascii="Consolas" w:eastAsia="等线" w:hAnsi="Consolas"/>
+          <w:sz w:val="18"/>
+        </w:rPr>
+        <w:t>this.nextEnemyStep</w:t>
+      </w:r>
+      <w:proofErr w:type="gramEnd"/>
+      <w:r>
+        <w:rPr>
+          <w:rFonts w:ascii="Consolas" w:eastAsia="等线" w:hAnsi="Consolas"/>
+          <w:sz w:val="18"/>
+        </w:rPr>
+        <w:t>(idx);</w:t>
+      </w:r>
+      <w:r>
+        <w:rPr>
+          <w:rFonts w:ascii="Consolas" w:eastAsia="等线" w:hAnsi="Consolas"/>
+          <w:sz w:val="18"/>
+        </w:rPr>
         <w:br/>
-        <w:t xml:space="preserve">    if (step) enemy.x = step.x; enemy.y = step.y;</w:t>
+        <w:t xml:space="preserve">    if (step) enemy.x = step.x; </w:t>
+      </w:r>
+      <w:proofErr w:type="gramStart"/>
+      <w:r>
+        <w:rPr>
+          <w:rFonts w:ascii="Consolas" w:eastAsia="等线" w:hAnsi="Consolas"/>
+          <w:sz w:val="18"/>
+        </w:rPr>
+        <w:t>enemy.y</w:t>
+      </w:r>
+      <w:proofErr w:type="gramEnd"/>
+      <w:r>
+        <w:rPr>
+          <w:rFonts w:ascii="Consolas" w:eastAsia="等线" w:hAnsi="Consolas"/>
+          <w:sz w:val="18"/>
+        </w:rPr>
+        <w:t xml:space="preserve"> = </w:t>
+      </w:r>
+      <w:proofErr w:type="gramStart"/>
+      <w:r>
+        <w:rPr>
+          <w:rFonts w:ascii="Consolas" w:eastAsia="等线" w:hAnsi="Consolas"/>
+          <w:sz w:val="18"/>
+        </w:rPr>
+        <w:t>step.y</w:t>
+      </w:r>
+      <w:proofErr w:type="gramEnd"/>
+      <w:r>
+        <w:rPr>
+          <w:rFonts w:ascii="Consolas" w:eastAsia="等线" w:hAnsi="Consolas"/>
+          <w:sz w:val="18"/>
+        </w:rPr>
+        <w:t>;</w:t>
+      </w:r>
+      <w:r>
+        <w:rPr>
+          <w:rFonts w:ascii="Consolas" w:eastAsia="等线" w:hAnsi="Consolas"/>
+          <w:sz w:val="18"/>
+        </w:rPr>
         <w:br/>
         <w:t xml:space="preserve">  }</w:t>
+      </w:r>
+      <w:r>
+        <w:rPr>
+          <w:rFonts w:ascii="Consolas" w:eastAsia="等线" w:hAnsi="Consolas"/>
+          <w:sz w:val="18"/>
+        </w:rPr>
         <w:br/>
         <w:t>}</w:t>
       </w:r>
     </w:p>
     <w:p>
-      <w:pPr/>
-      <w:r>
-        <w:t>效果：三张 Final Rogue Combat 均能在同一 Tick 同时运行 3 个敌人；Snapshot/Rollback/Frame/CoreDump 都包含完整 enemies[]。局限是敌人仍为简单 BFS 追击与固定节奏，缺少复杂团队协作。</w:t>
+      <w:r>
+        <w:lastRenderedPageBreak/>
+        <w:t xml:space="preserve">效果：三张 Final Rogue Combat 均能在同一 Tick 同时运行 3 个敌人；Snapshot/Rollback/Frame/CoreDump 都包含完整 </w:t>
+      </w:r>
+      <w:proofErr w:type="gramStart"/>
+      <w:r>
+        <w:t>enemies[</w:t>
+      </w:r>
+      <w:proofErr w:type="gramEnd"/>
+      <w:r>
+        <w:t>]。局限是敌人仍为简单 BFS 追击与固定节奏，缺少复杂团队协作。</w:t>
       </w:r>
     </w:p>
     <w:p>
@@ -4076,11 +5225,19 @@
         <w:pStyle w:val="4"/>
       </w:pPr>
       <w:r>
-        <w:t>技术点 ③：Snapshot / Rollback / Hot Reload Debugger</w:t>
+        <w:t>技术点</w:t>
+      </w:r>
+      <w:r>
+        <w:t xml:space="preserve"> ③</w:t>
+      </w:r>
+      <w:r>
+        <w:t>：</w:t>
+      </w:r>
+      <w:r>
+        <w:t>Snapshot / Rollback / Hot Reload Debugger</w:t>
       </w:r>
     </w:p>
     <w:p>
-      <w:pPr/>
       <w:r>
         <w:t>Snapshot 对 Simulation 世界状态与解释器状态做深拷贝；Rollback 恢复机器人、敌人、HP/Energy、位置、tick 与帧；Hot Reload 在暂停状态重建解释器并保留当前世界状态。真实验证中，火控核心使用标准策略失败（HP 0，Damage 5，Ticks 30），经 Snapshot → Rollback → Hot Reload 切换自适应策略后成功（HP 1，Damage 4，Ticks 44）。</w:t>
       </w:r>
@@ -4090,13 +5247,32 @@
         <w:pStyle w:val="4"/>
       </w:pPr>
       <w:r>
-        <w:t>技术点 ④：Roguelite RunState、模块与资源编排</w:t>
+        <w:t>技术点</w:t>
+      </w:r>
+      <w:r>
+        <w:t xml:space="preserve"> ④</w:t>
+      </w:r>
+      <w:r>
+        <w:t>：</w:t>
+      </w:r>
+      <w:r>
+        <w:t>Roguelite RunState</w:t>
+      </w:r>
+      <w:r>
+        <w:t>、模块与资源编排</w:t>
       </w:r>
     </w:p>
     <w:p>
-      <w:pPr/>
-      <w:r>
-        <w:t>FinalRogueRun 以 phase/hp/energy/modules/branch/restChoice/stats 构成单局状态；进入每张战斗地图时把 RunState 的 HP/Energy 与模块 modifier 注入 Simulation，战斗结束写回真实结果。Reward、Branch、Rest 均调用同一类方法，不复制一套状态。canonical 路线结果为 modules=[sonar,dash]、kills=9、totalTicks=180、damageTaken=9。</w:t>
+      <w:r>
+        <w:t>FinalRogueRun 以 phase/hp/energy/modules/branch/restChoice/stats 构成单局状态；进入每张战斗地图时把 RunState 的 HP/Energy 与模块 modifier 注入 Simulation，战斗结束写回真实结果。Reward、Branch、Rest 均调用同一类方法，不复制一套状态。canonical 路线结果为 modules=[</w:t>
+      </w:r>
+      <w:proofErr w:type="gramStart"/>
+      <w:r>
+        <w:t>sonar,dash</w:t>
+      </w:r>
+      <w:proofErr w:type="gramEnd"/>
+      <w:r>
+        <w:t>]、kills=9、totalTicks=180、damageTaken=9。</w:t>
       </w:r>
     </w:p>
     <w:p>
@@ -4107,7 +5283,16 @@
         </w:rPr>
       </w:pPr>
       <w:r>
-        <w:t>5.3 技术难点与解决方案</w:t>
+        <w:rPr>
+          <w:lang w:eastAsia="zh-CN"/>
+        </w:rPr>
+        <w:t xml:space="preserve">5.3 </w:t>
+      </w:r>
+      <w:r>
+        <w:rPr>
+          <w:lang w:eastAsia="zh-CN"/>
+        </w:rPr>
+        <w:t>技术难点与解决方案</w:t>
       </w:r>
     </w:p>
     <w:p>
@@ -4117,6 +5302,9 @@
         </w:rPr>
       </w:pPr>
       <w:r>
+        <w:rPr>
+          <w:lang w:eastAsia="zh-CN"/>
+        </w:rPr>
         <w:t>开发过程中出现的主要难点及其解决方式如下表所示。</w:t>
       </w:r>
     </w:p>
@@ -4126,9 +5314,9 @@
         <w:tblLook w:val="04A0" w:firstRow="1" w:lastRow="0" w:firstColumn="1" w:lastColumn="0" w:noHBand="0" w:noVBand="1"/>
       </w:tblPr>
       <w:tblGrid>
-        <w:gridCol w:w="2758"/>
-        <w:gridCol w:w="2777"/>
-        <w:gridCol w:w="2777"/>
+        <w:gridCol w:w="2621"/>
+        <w:gridCol w:w="2671"/>
+        <w:gridCol w:w="3020"/>
       </w:tblGrid>
       <w:tr>
         <w:tc>
@@ -4295,7 +5483,15 @@
               </w:rPr>
             </w:pPr>
             <w:r>
-              <w:t>新增 enemies[]，保留 enemy legacy alias；集中实现目标选择 helper；为每个敌人维护独立 runtime；同步扩展 Snapshot/Trace/CoreDump，并保持旧关卡兼容。</w:t>
+              <w:t xml:space="preserve">新增 </w:t>
+            </w:r>
+            <w:proofErr w:type="gramStart"/>
+            <w:r>
+              <w:t>enemies[</w:t>
+            </w:r>
+            <w:proofErr w:type="gramEnd"/>
+            <w:r>
+              <w:t>]，保留 enemy legacy alias；集中实现目标选择 helper；为每个敌人维护独立 runtime；同步扩展 Snapshot/Trace/CoreDump，并保持旧关卡兼容。</w:t>
             </w:r>
           </w:p>
         </w:tc>
@@ -4347,10 +5543,14 @@
           <w:p>
             <w:pPr>
               <w:spacing w:before="60" w:after="60" w:line="240" w:lineRule="auto"/>
+              <w:rPr>
+                <w:lang w:eastAsia="zh-CN"/>
+              </w:rPr>
             </w:pPr>
-            <w:proofErr w:type="spellStart"/>
-            <w:proofErr w:type="spellEnd"/>
-            <w:r>
+            <w:r>
+              <w:rPr>
+                <w:lang w:eastAsia="zh-CN"/>
+              </w:rPr>
               <w:t>dash 可能穿过第二/第三个敌人</w:t>
             </w:r>
           </w:p>
@@ -4376,10 +5576,26 @@
             <w:pPr>
               <w:spacing w:before="60" w:after="60" w:line="240" w:lineRule="auto"/>
             </w:pPr>
+            <w:r>
+              <w:t xml:space="preserve">将 dash </w:t>
+            </w:r>
             <w:proofErr w:type="spellStart"/>
+            <w:r>
+              <w:t>碰撞检查从</w:t>
+            </w:r>
             <w:proofErr w:type="spellEnd"/>
             <w:r>
-              <w:t>将 dash 碰撞检查从 this.enemy 改为任意 active+alive enemy cell，并增加多敌冲刺回归测试。</w:t>
+              <w:t xml:space="preserve"> </w:t>
+            </w:r>
+            <w:proofErr w:type="spellStart"/>
+            <w:proofErr w:type="gramStart"/>
+            <w:r>
+              <w:t>this.enemy</w:t>
+            </w:r>
+            <w:proofErr w:type="spellEnd"/>
+            <w:proofErr w:type="gramEnd"/>
+            <w:r>
+              <w:t xml:space="preserve"> 改为任意 active+alive enemy cell，并增加多敌冲刺回归测试。</w:t>
             </w:r>
           </w:p>
         </w:tc>
@@ -4387,7 +5603,7 @@
       <w:tr>
         <w:tc>
           <w:tcPr>
-            <w:tcW w:type="dxa" w:w="2758"/>
+            <w:tcW w:w="2758" w:type="dxa"/>
           </w:tcPr>
           <w:p>
             <w:r>
@@ -4397,7 +5613,7 @@
         </w:tc>
         <w:tc>
           <w:tcPr>
-            <w:tcW w:type="dxa" w:w="2777"/>
+            <w:tcW w:w="2777" w:type="dxa"/>
           </w:tcPr>
           <w:p>
             <w:r>
@@ -4407,11 +5623,27 @@
         </w:tc>
         <w:tc>
           <w:tcPr>
-            <w:tcW w:type="dxa" w:w="2777"/>
+            <w:tcW w:w="2777" w:type="dxa"/>
           </w:tcPr>
           <w:p>
             <w:r>
-              <w:t>为 Enemy 增加可选 damage 字段，采用 enemy.damage ?? modifiers.incomingDamage，使 Guard=5、Turret=1、Slime=1 可独立配置。</w:t>
+              <w:t xml:space="preserve">为 Enemy 增加可选 damage 字段，采用 </w:t>
+            </w:r>
+            <w:proofErr w:type="gramStart"/>
+            <w:r>
+              <w:t>enemy.damage</w:t>
+            </w:r>
+            <w:proofErr w:type="gramEnd"/>
+            <w:r>
+              <w:t xml:space="preserve"> ?? </w:t>
+            </w:r>
+            <w:proofErr w:type="gramStart"/>
+            <w:r>
+              <w:t>modifiers.incomingDamage</w:t>
+            </w:r>
+            <w:proofErr w:type="gramEnd"/>
+            <w:r>
+              <w:t>，使 Guard=5、Turret=1、Slime=1 可独立配置。</w:t>
             </w:r>
           </w:p>
         </w:tc>
@@ -4419,46 +5651,99 @@
       <w:tr>
         <w:tc>
           <w:tcPr>
-            <w:tcW w:type="dxa" w:w="2758"/>
+            <w:tcW w:w="2758" w:type="dxa"/>
           </w:tcPr>
           <w:p>
             <w:r>
+              <w:lastRenderedPageBreak/>
               <w:t>4</w:t>
             </w:r>
           </w:p>
         </w:tc>
         <w:tc>
           <w:tcPr>
-            <w:tcW w:type="dxa" w:w="2777"/>
+            <w:tcW w:w="2777" w:type="dxa"/>
           </w:tcPr>
           <w:p>
-            <w:r>
+            <w:pPr>
+              <w:rPr>
+                <w:lang w:eastAsia="zh-CN"/>
+              </w:rPr>
+            </w:pPr>
+            <w:r>
+              <w:rPr>
+                <w:lang w:eastAsia="zh-CN"/>
+              </w:rPr>
               <w:t>ASCII 地图行长度不一致导致右边界锯齿</w:t>
             </w:r>
           </w:p>
         </w:tc>
         <w:tc>
           <w:tcPr>
-            <w:tcW w:type="dxa" w:w="2777"/>
+            <w:tcW w:w="2777" w:type="dxa"/>
           </w:tcPr>
           <w:p>
             <w:r>
-              <w:t>按 enc.width 在行末 padEnd(width,'#')，新增每行 row.length===width 的矩形 invariant 测试。</w:t>
+              <w:t xml:space="preserve">按 </w:t>
+            </w:r>
+            <w:proofErr w:type="spellStart"/>
+            <w:proofErr w:type="gramStart"/>
+            <w:r>
+              <w:t>enc.width</w:t>
+            </w:r>
+            <w:proofErr w:type="spellEnd"/>
+            <w:proofErr w:type="gramEnd"/>
+            <w:r>
+              <w:t xml:space="preserve"> </w:t>
+            </w:r>
+            <w:proofErr w:type="spellStart"/>
+            <w:r>
+              <w:t>在行末</w:t>
+            </w:r>
+            <w:proofErr w:type="spellEnd"/>
+            <w:r>
+              <w:t xml:space="preserve"> </w:t>
+            </w:r>
+            <w:proofErr w:type="spellStart"/>
+            <w:r>
+              <w:t>padEnd</w:t>
+            </w:r>
+            <w:proofErr w:type="spellEnd"/>
+            <w:r>
+              <w:t>(width,'#</w:t>
+            </w:r>
+            <w:proofErr w:type="gramStart"/>
+            <w:r>
+              <w:t>')，</w:t>
+            </w:r>
+            <w:proofErr w:type="spellStart"/>
+            <w:proofErr w:type="gramEnd"/>
+            <w:r>
+              <w:t>新增每行</w:t>
+            </w:r>
+            <w:proofErr w:type="spellEnd"/>
+            <w:r>
+              <w:t xml:space="preserve"> </w:t>
+            </w:r>
+            <w:proofErr w:type="gramStart"/>
+            <w:r>
+              <w:t>row.length</w:t>
+            </w:r>
+            <w:proofErr w:type="gramEnd"/>
+            <w:r>
+              <w:t>===width 的矩形 invariant 测试。</w:t>
             </w:r>
           </w:p>
         </w:tc>
       </w:tr>
     </w:tbl>
-    <w:p>
-      <w:r/>
-    </w:p>
+    <w:p/>
     <w:p>
       <w:pPr>
         <w:pBdr>
           <w:bottom w:val="single" w:sz="6" w:space="1" w:color="auto"/>
         </w:pBdr>
       </w:pPr>
-      <w:r/>
     </w:p>
     <w:p>
       <w:pPr>
@@ -4474,7 +5759,6 @@
       </w:pPr>
       <w:bookmarkStart w:id="5" w:name="s6"/>
       <w:bookmarkEnd w:id="5"/>
-      <w:r/>
     </w:p>
     <w:p>
       <w:pPr>
@@ -4485,13 +5769,11 @@
       </w:r>
     </w:p>
     <w:p>
-      <w:pPr/>
       <w:r>
         <w:t>项目使用 Vitest 进行自动化测试，并配合真实 Chrome headless 验证浏览器流程。当前测试状态：npm test 19 个测试文件、154 个测试全部通过；npm run build 通过。测试覆盖 RoboC++ 解释器、多敌 Simulation、Combat 01/02/03 验收、Final Rogue RunState/Economy、地图矩形 invariant，以及 Final Combat 调试对照。</w:t>
       </w:r>
     </w:p>
     <w:p>
-      <w:pPr/>
       <w:r>
         <w:t>Final Rogue canonical 路径已使用真实 Chrome headless 从追猎迷宫依次推进到火控核心与行动完成，资源时间线稳定。</w:t>
       </w:r>
@@ -4514,7 +5796,10 @@
         <w:pStyle w:val="31"/>
       </w:pPr>
       <w:r>
-        <w:t>7.1 环境要求</w:t>
+        <w:t xml:space="preserve">7.1 </w:t>
+      </w:r>
+      <w:r>
+        <w:t>环境要求</w:t>
       </w:r>
     </w:p>
     <w:tbl>
@@ -4523,8 +5808,8 @@
         <w:tblLook w:val="04A0" w:firstRow="1" w:lastRow="0" w:firstColumn="1" w:lastColumn="0" w:noHBand="0" w:noVBand="1"/>
       </w:tblPr>
       <w:tblGrid>
-        <w:gridCol w:w="4122"/>
-        <w:gridCol w:w="4190"/>
+        <w:gridCol w:w="4132"/>
+        <w:gridCol w:w="4180"/>
       </w:tblGrid>
       <w:tr>
         <w:tc>
@@ -4605,8 +5890,6 @@
             <w:pPr>
               <w:spacing w:before="60" w:after="60" w:line="240" w:lineRule="auto"/>
             </w:pPr>
-            <w:proofErr w:type="spellStart"/>
-            <w:proofErr w:type="spellEnd"/>
             <w:r>
               <w:t>操作系统</w:t>
             </w:r>
@@ -4634,8 +5917,6 @@
             <w:pPr>
               <w:spacing w:before="60" w:after="60" w:line="240" w:lineRule="auto"/>
             </w:pPr>
-            <w:proofErr w:type="spellStart"/>
-            <w:proofErr w:type="spellEnd"/>
             <w:r>
               <w:t>Windows 10 / 11 等桌面系统</w:t>
             </w:r>
@@ -4664,8 +5945,6 @@
             <w:pPr>
               <w:spacing w:before="60" w:after="60" w:line="240" w:lineRule="auto"/>
             </w:pPr>
-            <w:proofErr w:type="spellStart"/>
-            <w:proofErr w:type="spellEnd"/>
             <w:r>
               <w:t>运行时</w:t>
             </w:r>
@@ -4692,10 +5971,6 @@
             <w:pPr>
               <w:spacing w:before="60" w:after="60" w:line="240" w:lineRule="auto"/>
             </w:pPr>
-            <w:proofErr w:type="spellStart"/>
-            <w:proofErr w:type="spellEnd"/>
-            <w:proofErr w:type="spellStart"/>
-            <w:proofErr w:type="spellEnd"/>
             <w:r>
               <w:t>Node.js（满足当前 Vite 构建要求即可，npm 随 Node 安装）</w:t>
             </w:r>
@@ -4725,8 +6000,6 @@
             <w:pPr>
               <w:spacing w:before="60" w:after="60" w:line="240" w:lineRule="auto"/>
             </w:pPr>
-            <w:proofErr w:type="spellStart"/>
-            <w:proofErr w:type="spellEnd"/>
             <w:r>
               <w:t>依赖库</w:t>
             </w:r>
@@ -4754,8 +6027,6 @@
             <w:pPr>
               <w:spacing w:before="60" w:after="60" w:line="240" w:lineRule="auto"/>
             </w:pPr>
-            <w:proofErr w:type="spellStart"/>
-            <w:proofErr w:type="spellEnd"/>
             <w:r>
               <w:t>Vue 3、TypeScript、Vite、Vitest；无数据库或 AI API 依赖</w:t>
             </w:r>
@@ -4784,8 +6055,6 @@
             <w:pPr>
               <w:spacing w:before="60" w:after="60" w:line="240" w:lineRule="auto"/>
             </w:pPr>
-            <w:proofErr w:type="spellStart"/>
-            <w:proofErr w:type="spellEnd"/>
             <w:r>
               <w:t>其他</w:t>
             </w:r>
@@ -4816,6 +6085,9 @@
               </w:rPr>
             </w:pPr>
             <w:r>
+              <w:rPr>
+                <w:lang w:eastAsia="zh-CN"/>
+              </w:rPr>
               <w:t>运行需要现代 Chromium 内核浏览器；无需联网或额外服务</w:t>
             </w:r>
           </w:p>
@@ -4837,7 +6109,17 @@
         </w:rPr>
       </w:pPr>
       <w:r>
-        <w:t>7.2 安装与部署步骤</w:t>
+        <w:rPr>
+          <w:lang w:eastAsia="zh-CN"/>
+        </w:rPr>
+        <w:lastRenderedPageBreak/>
+        <w:t xml:space="preserve">7.2 </w:t>
+      </w:r>
+      <w:r>
+        <w:rPr>
+          <w:lang w:eastAsia="zh-CN"/>
+        </w:rPr>
+        <w:t>安装与部署步骤</w:t>
       </w:r>
     </w:p>
     <w:p>
@@ -4847,6 +6129,9 @@
         </w:rPr>
       </w:pPr>
       <w:r>
+        <w:rPr>
+          <w:lang w:eastAsia="zh-CN"/>
+        </w:rPr>
         <w:t>从零开始部署的步骤：</w:t>
       </w:r>
     </w:p>
@@ -4854,34 +6139,191 @@
       <w:pPr>
         <w:spacing w:line="384" w:lineRule="auto"/>
       </w:pPr>
-      <w:proofErr w:type="spellStart"/>
-      <w:proofErr w:type="spellEnd"/>
-      <w:proofErr w:type="spellStart"/>
-      <w:proofErr w:type="spellEnd"/>
-      <w:proofErr w:type="spellStart"/>
-      <w:proofErr w:type="spellEnd"/>
-      <w:proofErr w:type="spellStart"/>
-      <w:proofErr w:type="spellEnd"/>
-      <w:proofErr w:type="spellStart"/>
-      <w:proofErr w:type="spellEnd"/>
-      <w:r>
-        <w:rPr>
-          <w:rFonts w:ascii="Consolas" w:hAnsi="Consolas" w:eastAsia="等线"/>
+      <w:r>
+        <w:rPr>
+          <w:rFonts w:ascii="Consolas" w:eastAsia="等线" w:hAnsi="Consolas"/>
           <w:sz w:val="18"/>
         </w:rPr>
-        <w:t>1. 安装 Node.js 与 npm（官网安装包）</w:t>
+        <w:t xml:space="preserve">1. </w:t>
+      </w:r>
+      <w:r>
+        <w:rPr>
+          <w:rFonts w:ascii="Consolas" w:eastAsia="等线" w:hAnsi="Consolas"/>
+          <w:sz w:val="18"/>
+        </w:rPr>
+        <w:t>安装</w:t>
+      </w:r>
+      <w:r>
+        <w:rPr>
+          <w:rFonts w:ascii="Consolas" w:eastAsia="等线" w:hAnsi="Consolas"/>
+          <w:sz w:val="18"/>
+        </w:rPr>
+        <w:t xml:space="preserve"> Node.js </w:t>
+      </w:r>
+      <w:r>
+        <w:rPr>
+          <w:rFonts w:ascii="Consolas" w:eastAsia="等线" w:hAnsi="Consolas"/>
+          <w:sz w:val="18"/>
+        </w:rPr>
+        <w:t>与</w:t>
+      </w:r>
+      <w:r>
+        <w:rPr>
+          <w:rFonts w:ascii="Consolas" w:eastAsia="等线" w:hAnsi="Consolas"/>
+          <w:sz w:val="18"/>
+        </w:rPr>
+        <w:t xml:space="preserve"> npm</w:t>
+      </w:r>
+      <w:r>
+        <w:rPr>
+          <w:rFonts w:ascii="Consolas" w:eastAsia="等线" w:hAnsi="Consolas"/>
+          <w:sz w:val="18"/>
+        </w:rPr>
+        <w:t>（官网安装包）</w:t>
+      </w:r>
+      <w:r>
+        <w:rPr>
+          <w:rFonts w:ascii="Consolas" w:eastAsia="等线" w:hAnsi="Consolas"/>
+          <w:sz w:val="18"/>
+        </w:rPr>
         <w:br/>
-        <w:t>2. 获取项目源码并进入项目目录</w:t>
+        <w:t xml:space="preserve">2. </w:t>
+      </w:r>
+      <w:r>
+        <w:rPr>
+          <w:rFonts w:ascii="Consolas" w:eastAsia="等线" w:hAnsi="Consolas"/>
+          <w:sz w:val="18"/>
+        </w:rPr>
+        <w:t>获取项目源码并进入项目目录</w:t>
+      </w:r>
+      <w:r>
+        <w:rPr>
+          <w:rFonts w:ascii="Consolas" w:eastAsia="等线" w:hAnsi="Consolas"/>
+          <w:sz w:val="18"/>
+        </w:rPr>
         <w:br/>
-        <w:t>3. 安装依赖：npm install</w:t>
+        <w:t xml:space="preserve">3. </w:t>
+      </w:r>
+      <w:r>
+        <w:rPr>
+          <w:rFonts w:ascii="Consolas" w:eastAsia="等线" w:hAnsi="Consolas"/>
+          <w:sz w:val="18"/>
+        </w:rPr>
+        <w:t>安装依赖：</w:t>
+      </w:r>
+      <w:r>
+        <w:rPr>
+          <w:rFonts w:ascii="Consolas" w:eastAsia="等线" w:hAnsi="Consolas"/>
+          <w:sz w:val="18"/>
+        </w:rPr>
+        <w:t>npm install</w:t>
+      </w:r>
+      <w:r>
+        <w:rPr>
+          <w:rFonts w:ascii="Consolas" w:eastAsia="等线" w:hAnsi="Consolas"/>
+          <w:sz w:val="18"/>
+        </w:rPr>
         <w:br/>
-        <w:t>4. 启动开发服务器：npm run dev</w:t>
+        <w:t xml:space="preserve">4. </w:t>
+      </w:r>
+      <w:r>
+        <w:rPr>
+          <w:rFonts w:ascii="Consolas" w:eastAsia="等线" w:hAnsi="Consolas"/>
+          <w:sz w:val="18"/>
+        </w:rPr>
+        <w:t>启动开发服务器：</w:t>
+      </w:r>
+      <w:r>
+        <w:rPr>
+          <w:rFonts w:ascii="Consolas" w:eastAsia="等线" w:hAnsi="Consolas"/>
+          <w:sz w:val="18"/>
+        </w:rPr>
+        <w:t>npm run dev</w:t>
+      </w:r>
+      <w:r>
+        <w:rPr>
+          <w:rFonts w:ascii="Consolas" w:eastAsia="等线" w:hAnsi="Consolas"/>
+          <w:sz w:val="18"/>
+        </w:rPr>
         <w:br/>
-        <w:t>5. 浏览器打开 Vite 输出的本地地址（通常为 http://localhost:5173）</w:t>
+        <w:t xml:space="preserve">5. </w:t>
+      </w:r>
+      <w:r>
+        <w:rPr>
+          <w:rFonts w:ascii="Consolas" w:eastAsia="等线" w:hAnsi="Consolas"/>
+          <w:sz w:val="18"/>
+        </w:rPr>
+        <w:t>浏览器打开</w:t>
+      </w:r>
+      <w:r>
+        <w:rPr>
+          <w:rFonts w:ascii="Consolas" w:eastAsia="等线" w:hAnsi="Consolas"/>
+          <w:sz w:val="18"/>
+        </w:rPr>
+        <w:t xml:space="preserve"> Vite </w:t>
+      </w:r>
+      <w:r>
+        <w:rPr>
+          <w:rFonts w:ascii="Consolas" w:eastAsia="等线" w:hAnsi="Consolas"/>
+          <w:sz w:val="18"/>
+        </w:rPr>
+        <w:t>输出的本地地址（通常为</w:t>
+      </w:r>
+      <w:r>
+        <w:rPr>
+          <w:rFonts w:ascii="Consolas" w:eastAsia="等线" w:hAnsi="Consolas"/>
+          <w:sz w:val="18"/>
+        </w:rPr>
+        <w:t xml:space="preserve"> http://localhost:5173</w:t>
+      </w:r>
+      <w:r>
+        <w:rPr>
+          <w:rFonts w:ascii="Consolas" w:eastAsia="等线" w:hAnsi="Consolas"/>
+          <w:sz w:val="18"/>
+        </w:rPr>
+        <w:t>）</w:t>
+      </w:r>
+      <w:r>
+        <w:rPr>
+          <w:rFonts w:ascii="Consolas" w:eastAsia="等线" w:hAnsi="Consolas"/>
+          <w:sz w:val="18"/>
+        </w:rPr>
         <w:br/>
-        <w:t>生产构建：npm run build</w:t>
+      </w:r>
+      <w:r>
+        <w:rPr>
+          <w:rFonts w:ascii="Consolas" w:eastAsia="等线" w:hAnsi="Consolas"/>
+          <w:sz w:val="18"/>
+        </w:rPr>
+        <w:t>生产构建：</w:t>
+      </w:r>
+      <w:r>
+        <w:rPr>
+          <w:rFonts w:ascii="Consolas" w:eastAsia="等线" w:hAnsi="Consolas"/>
+          <w:sz w:val="18"/>
+        </w:rPr>
+        <w:t>npm run build</w:t>
+      </w:r>
+      <w:r>
+        <w:rPr>
+          <w:rFonts w:ascii="Consolas" w:eastAsia="等线" w:hAnsi="Consolas"/>
+          <w:sz w:val="18"/>
+        </w:rPr>
         <w:br/>
-        <w:t>自动化测试：npm test</w:t>
+      </w:r>
+      <w:r>
+        <w:rPr>
+          <w:rFonts w:ascii="Consolas" w:eastAsia="等线" w:hAnsi="Consolas"/>
+          <w:sz w:val="18"/>
+        </w:rPr>
+        <w:t>自动化测试：</w:t>
+      </w:r>
+      <w:r>
+        <w:rPr>
+          <w:rFonts w:ascii="Consolas" w:eastAsia="等线" w:hAnsi="Consolas"/>
+          <w:sz w:val="18"/>
+        </w:rPr>
+        <w:t>npm test</w:t>
       </w:r>
     </w:p>
     <w:p>
@@ -4890,7 +6332,6 @@
           <w:lang w:eastAsia="zh-CN"/>
         </w:rPr>
       </w:pPr>
-      <w:r/>
     </w:p>
     <w:p>
       <w:pPr>
@@ -4900,7 +6341,10 @@
         </w:rPr>
       </w:pPr>
       <w:r>
-        <w:t>7.3 使用说明</w:t>
+        <w:t xml:space="preserve">7.3 </w:t>
+      </w:r>
+      <w:r>
+        <w:t>使用说明</w:t>
       </w:r>
     </w:p>
     <w:p>
@@ -4909,13 +6353,11 @@
           <w:lang w:eastAsia="zh-CN"/>
         </w:rPr>
       </w:pPr>
-      <w:r/>
     </w:p>
     <w:p>
       <w:pPr>
         <w:spacing w:before="30" w:after="120"/>
       </w:pPr>
-      <w:r/>
     </w:p>
     <w:p>
       <w:pPr>
@@ -4930,6 +6372,9 @@
         </w:rPr>
       </w:pPr>
       <w:r>
+        <w:rPr>
+          <w:lang w:eastAsia="zh-CN"/>
+        </w:rPr>
         <w:t>选择“教学”进入分章节练习，或选择“Final Rogue”开始三场连续战斗。</w:t>
       </w:r>
     </w:p>
@@ -4962,6 +6407,9 @@
         </w:rPr>
       </w:pPr>
       <w:r>
+        <w:rPr>
+          <w:lang w:eastAsia="zh-CN"/>
+        </w:rPr>
         <w:t>根据战况选择模块、路线和维护舱选项；模块与 HP/Energy 会真实继承到后续战斗。</w:t>
       </w:r>
     </w:p>
@@ -4988,6 +6436,9 @@
         </w:rPr>
       </w:pPr>
       <w:r>
+        <w:rPr>
+          <w:lang w:eastAsia="zh-CN"/>
+        </w:rPr>
         <w:t>也可进入“远征”与“更多”中的战术房、地牢演示等已有模式。</w:t>
       </w:r>
     </w:p>
@@ -4999,7 +6450,10 @@
         </w:rPr>
       </w:pPr>
       <w:r>
-        <w:t>7.4 项目目录结构</w:t>
+        <w:t xml:space="preserve">7.4 </w:t>
+      </w:r>
+      <w:r>
+        <w:t>项目目录结构</w:t>
       </w:r>
     </w:p>
     <w:p>
@@ -5008,46 +6462,302 @@
           <w:lang w:eastAsia="zh-CN"/>
         </w:rPr>
       </w:pPr>
-      <w:r/>
     </w:p>
     <w:p>
       <w:pPr>
         <w:spacing w:line="384" w:lineRule="auto"/>
       </w:pPr>
-      <w:proofErr w:type="spellStart"/>
-      <w:proofErr w:type="spellEnd"/>
-      <w:proofErr w:type="spellStart"/>
-      <w:proofErr w:type="spellEnd"/>
-      <w:proofErr w:type="spellStart"/>
-      <w:proofErr w:type="spellEnd"/>
-      <w:r>
-        <w:rPr>
-          <w:rFonts w:ascii="Consolas" w:hAnsi="Consolas" w:eastAsia="等线"/>
+      <w:r>
+        <w:rPr>
+          <w:rFonts w:ascii="Consolas" w:eastAsia="等线" w:hAnsi="Consolas"/>
           <w:sz w:val="18"/>
         </w:rPr>
         <w:t>CodeRogue/</w:t>
+      </w:r>
+      <w:r>
+        <w:rPr>
+          <w:rFonts w:ascii="Consolas" w:eastAsia="等线" w:hAnsi="Consolas"/>
+          <w:sz w:val="18"/>
+        </w:rPr>
         <w:br/>
         <w:t>├── src/</w:t>
+      </w:r>
+      <w:r>
+        <w:rPr>
+          <w:rFonts w:ascii="Consolas" w:eastAsia="等线" w:hAnsi="Consolas"/>
+          <w:sz w:val="18"/>
+        </w:rPr>
         <w:br/>
-        <w:t>│   ├── App.vue            # 界面与模式编排</w:t>
+        <w:t xml:space="preserve">│   ├── App.vue            # </w:t>
+      </w:r>
+      <w:r>
+        <w:rPr>
+          <w:rFonts w:ascii="Consolas" w:eastAsia="等线" w:hAnsi="Consolas"/>
+          <w:sz w:val="18"/>
+        </w:rPr>
+        <w:t>界面与模式编排</w:t>
+      </w:r>
+      <w:r>
+        <w:rPr>
+          <w:rFonts w:ascii="Consolas" w:eastAsia="等线" w:hAnsi="Consolas"/>
+          <w:sz w:val="18"/>
+        </w:rPr>
         <w:br/>
-        <w:t>│   ├── core.ts            # Simulation、敌人 AI、Debugger 基础</w:t>
+        <w:t>│   ├── core.ts            # Simulation</w:t>
+      </w:r>
+      <w:r>
+        <w:rPr>
+          <w:rFonts w:ascii="Consolas" w:eastAsia="等线" w:hAnsi="Consolas"/>
+          <w:sz w:val="18"/>
+        </w:rPr>
+        <w:t>、敌人</w:t>
+      </w:r>
+      <w:r>
+        <w:rPr>
+          <w:rFonts w:ascii="Consolas" w:eastAsia="等线" w:hAnsi="Consolas"/>
+          <w:sz w:val="18"/>
+        </w:rPr>
+        <w:t xml:space="preserve"> AI</w:t>
+      </w:r>
+      <w:r>
+        <w:rPr>
+          <w:rFonts w:ascii="Consolas" w:eastAsia="等线" w:hAnsi="Consolas"/>
+          <w:sz w:val="18"/>
+        </w:rPr>
+        <w:t>、</w:t>
+      </w:r>
+      <w:r>
+        <w:rPr>
+          <w:rFonts w:ascii="Consolas" w:eastAsia="等线" w:hAnsi="Consolas"/>
+          <w:sz w:val="18"/>
+        </w:rPr>
+        <w:t xml:space="preserve">Debugger </w:t>
+      </w:r>
+      <w:r>
+        <w:rPr>
+          <w:rFonts w:ascii="Consolas" w:eastAsia="等线" w:hAnsi="Consolas"/>
+          <w:sz w:val="18"/>
+        </w:rPr>
+        <w:t>基础</w:t>
+      </w:r>
+      <w:r>
+        <w:rPr>
+          <w:rFonts w:ascii="Consolas" w:eastAsia="等线" w:hAnsi="Consolas"/>
+          <w:sz w:val="18"/>
+        </w:rPr>
         <w:br/>
-        <w:t>│   ├── language.ts        # RoboC++ 解释执行</w:t>
+        <w:t xml:space="preserve">│   ├── language.ts        # RoboC++ </w:t>
+      </w:r>
+      <w:r>
+        <w:rPr>
+          <w:rFonts w:ascii="Consolas" w:eastAsia="等线" w:hAnsi="Consolas"/>
+          <w:sz w:val="18"/>
+        </w:rPr>
+        <w:t>解释执行</w:t>
+      </w:r>
+      <w:r>
+        <w:rPr>
+          <w:rFonts w:ascii="Consolas" w:eastAsia="等线" w:hAnsi="Consolas"/>
+          <w:sz w:val="18"/>
+        </w:rPr>
         <w:br/>
-        <w:t>│   ├── dungeon.ts         # 房间/走廊/门数据模型</w:t>
+        <w:t xml:space="preserve">│   ├── dungeon.ts         # </w:t>
+      </w:r>
+      <w:r>
+        <w:rPr>
+          <w:rFonts w:ascii="Consolas" w:eastAsia="等线" w:hAnsi="Consolas"/>
+          <w:sz w:val="18"/>
+        </w:rPr>
+        <w:t>房间</w:t>
+      </w:r>
+      <w:r>
+        <w:rPr>
+          <w:rFonts w:ascii="Consolas" w:eastAsia="等线" w:hAnsi="Consolas"/>
+          <w:sz w:val="18"/>
+        </w:rPr>
+        <w:t>/</w:t>
+      </w:r>
+      <w:r>
+        <w:rPr>
+          <w:rFonts w:ascii="Consolas" w:eastAsia="等线" w:hAnsi="Consolas"/>
+          <w:sz w:val="18"/>
+        </w:rPr>
+        <w:t>走廊</w:t>
+      </w:r>
+      <w:r>
+        <w:rPr>
+          <w:rFonts w:ascii="Consolas" w:eastAsia="等线" w:hAnsi="Consolas"/>
+          <w:sz w:val="18"/>
+        </w:rPr>
+        <w:t>/</w:t>
+      </w:r>
+      <w:r>
+        <w:rPr>
+          <w:rFonts w:ascii="Consolas" w:eastAsia="等线" w:hAnsi="Consolas"/>
+          <w:sz w:val="18"/>
+        </w:rPr>
+        <w:t>门数据模型</w:t>
+      </w:r>
+      <w:r>
+        <w:rPr>
+          <w:rFonts w:ascii="Consolas" w:eastAsia="等线" w:hAnsi="Consolas"/>
+          <w:sz w:val="18"/>
+        </w:rPr>
         <w:br/>
-        <w:t>│   ├── finalRogueRun.ts   # Final Rogue 场景与 RunState</w:t>
+        <w:t xml:space="preserve">│   ├── finalRogueRun.ts   # Final Rogue </w:t>
+      </w:r>
+      <w:r>
+        <w:rPr>
+          <w:rFonts w:ascii="Consolas" w:eastAsia="等线" w:hAnsi="Consolas"/>
+          <w:sz w:val="18"/>
+        </w:rPr>
+        <w:t>场景与</w:t>
+      </w:r>
+      <w:r>
+        <w:rPr>
+          <w:rFonts w:ascii="Consolas" w:eastAsia="等线" w:hAnsi="Consolas"/>
+          <w:sz w:val="18"/>
+        </w:rPr>
+        <w:t xml:space="preserve"> RunState</w:t>
+      </w:r>
+      <w:r>
+        <w:rPr>
+          <w:rFonts w:ascii="Consolas" w:eastAsia="等线" w:hAnsi="Consolas"/>
+          <w:sz w:val="18"/>
+        </w:rPr>
         <w:br/>
-        <w:t>│   ├── tactical*.ts       # 战术与原型演示</w:t>
+        <w:t xml:space="preserve">│   ├── tactical*.ts       # </w:t>
+      </w:r>
+      <w:r>
+        <w:rPr>
+          <w:rFonts w:ascii="Consolas" w:eastAsia="等线" w:hAnsi="Consolas"/>
+          <w:sz w:val="18"/>
+        </w:rPr>
+        <w:t>战术与原型演示</w:t>
+      </w:r>
+      <w:r>
+        <w:rPr>
+          <w:rFonts w:ascii="Consolas" w:eastAsia="等线" w:hAnsi="Consolas"/>
+          <w:sz w:val="18"/>
+        </w:rPr>
         <w:br/>
-        <w:t>│   ├── assets/            # 敌人/机器人/出口 SVG</w:t>
+        <w:t xml:space="preserve">│   ├── assets/            # </w:t>
+      </w:r>
+      <w:r>
+        <w:rPr>
+          <w:rFonts w:ascii="Consolas" w:eastAsia="等线" w:hAnsi="Consolas"/>
+          <w:sz w:val="18"/>
+        </w:rPr>
+        <w:t>敌人</w:t>
+      </w:r>
+      <w:r>
+        <w:rPr>
+          <w:rFonts w:ascii="Consolas" w:eastAsia="等线" w:hAnsi="Consolas"/>
+          <w:sz w:val="18"/>
+        </w:rPr>
+        <w:t>/</w:t>
+      </w:r>
+      <w:r>
+        <w:rPr>
+          <w:rFonts w:ascii="Consolas" w:eastAsia="等线" w:hAnsi="Consolas"/>
+          <w:sz w:val="18"/>
+        </w:rPr>
+        <w:t>机器人</w:t>
+      </w:r>
+      <w:r>
+        <w:rPr>
+          <w:rFonts w:ascii="Consolas" w:eastAsia="等线" w:hAnsi="Consolas"/>
+          <w:sz w:val="18"/>
+        </w:rPr>
+        <w:t>/</w:t>
+      </w:r>
+      <w:r>
+        <w:rPr>
+          <w:rFonts w:ascii="Consolas" w:eastAsia="等线" w:hAnsi="Consolas"/>
+          <w:sz w:val="18"/>
+        </w:rPr>
+        <w:t>出口</w:t>
+      </w:r>
+      <w:r>
+        <w:rPr>
+          <w:rFonts w:ascii="Consolas" w:eastAsia="等线" w:hAnsi="Consolas"/>
+          <w:sz w:val="18"/>
+        </w:rPr>
+        <w:t xml:space="preserve"> SVG</w:t>
+      </w:r>
+      <w:r>
+        <w:rPr>
+          <w:rFonts w:ascii="Consolas" w:eastAsia="等线" w:hAnsi="Consolas"/>
+          <w:sz w:val="18"/>
+        </w:rPr>
         <w:br/>
-        <w:t>│   └── style.css          # 全局与 Final Rogue scoped 样式</w:t>
+      </w:r>
+      <w:r>
+        <w:rPr>
+          <w:rFonts w:ascii="Consolas" w:eastAsia="等线" w:hAnsi="Consolas"/>
+          <w:sz w:val="18"/>
+        </w:rPr>
+        <w:lastRenderedPageBreak/>
+        <w:t xml:space="preserve">│   └── style.css          # </w:t>
+      </w:r>
+      <w:r>
+        <w:rPr>
+          <w:rFonts w:ascii="Consolas" w:eastAsia="等线" w:hAnsi="Consolas"/>
+          <w:sz w:val="18"/>
+        </w:rPr>
+        <w:t>全局与</w:t>
+      </w:r>
+      <w:r>
+        <w:rPr>
+          <w:rFonts w:ascii="Consolas" w:eastAsia="等线" w:hAnsi="Consolas"/>
+          <w:sz w:val="18"/>
+        </w:rPr>
+        <w:t xml:space="preserve"> Final Rogue scoped </w:t>
+      </w:r>
+      <w:r>
+        <w:rPr>
+          <w:rFonts w:ascii="Consolas" w:eastAsia="等线" w:hAnsi="Consolas"/>
+          <w:sz w:val="18"/>
+        </w:rPr>
+        <w:t>样式</w:t>
+      </w:r>
+      <w:r>
+        <w:rPr>
+          <w:rFonts w:ascii="Consolas" w:eastAsia="等线" w:hAnsi="Consolas"/>
+          <w:sz w:val="18"/>
+        </w:rPr>
         <w:br/>
-        <w:t>├── tests/                 # Vitest 自动测试</w:t>
+        <w:t xml:space="preserve">├── tests/                 # Vitest </w:t>
+      </w:r>
+      <w:r>
+        <w:rPr>
+          <w:rFonts w:ascii="Consolas" w:eastAsia="等线" w:hAnsi="Consolas"/>
+          <w:sz w:val="18"/>
+        </w:rPr>
+        <w:t>自动测试</w:t>
+      </w:r>
+      <w:r>
+        <w:rPr>
+          <w:rFonts w:ascii="Consolas" w:eastAsia="等线" w:hAnsi="Consolas"/>
+          <w:sz w:val="18"/>
+        </w:rPr>
         <w:br/>
-        <w:t>├── package.json</w:t>
+        <w:t xml:space="preserve">├── </w:t>
+      </w:r>
+      <w:proofErr w:type="gramStart"/>
+      <w:r>
+        <w:rPr>
+          <w:rFonts w:ascii="Consolas" w:eastAsia="等线" w:hAnsi="Consolas"/>
+          <w:sz w:val="18"/>
+        </w:rPr>
+        <w:t>package.json</w:t>
+      </w:r>
+      <w:proofErr w:type="gramEnd"/>
+      <w:r>
+        <w:rPr>
+          <w:rFonts w:ascii="Consolas" w:eastAsia="等线" w:hAnsi="Consolas"/>
+          <w:sz w:val="18"/>
+        </w:rPr>
         <w:br/>
         <w:t>└── vite.config.ts</w:t>
       </w:r>
@@ -5058,7 +6768,6 @@
           <w:lang w:eastAsia="zh-CN"/>
         </w:rPr>
       </w:pPr>
-      <w:r/>
     </w:p>
     <w:p>
       <w:pPr>
@@ -5070,6 +6779,9 @@
       <w:bookmarkStart w:id="7" w:name="s8"/>
       <w:bookmarkEnd w:id="7"/>
       <w:r>
+        <w:rPr>
+          <w:lang w:eastAsia="zh-CN"/>
+        </w:rPr>
         <w:t>八、项目总结</w:t>
       </w:r>
     </w:p>
@@ -5081,7 +6793,16 @@
         </w:rPr>
       </w:pPr>
       <w:r>
-        <w:t>8.1 收获与反思</w:t>
+        <w:rPr>
+          <w:lang w:eastAsia="zh-CN"/>
+        </w:rPr>
+        <w:t xml:space="preserve">8.1 </w:t>
+      </w:r>
+      <w:r>
+        <w:rPr>
+          <w:lang w:eastAsia="zh-CN"/>
+        </w:rPr>
+        <w:t>收获与反思</w:t>
       </w:r>
     </w:p>
     <w:p>
@@ -5091,6 +6812,9 @@
         </w:rPr>
       </w:pPr>
       <w:r>
+        <w:rPr>
+          <w:lang w:eastAsia="zh-CN"/>
+        </w:rPr>
         <w:t>收获主要包括四个层面：第一次较完整地把“代码即玩法”作为核心闭环来设计；从功能堆叠逐渐认识到关卡设计、策略差异和资源经济的重要性；Multi-enemy 重构让我理解向后兼容与回归测试的价值；Debugger 的 Snapshot/Rollback 则帮助我重新理解程序运行状态与恢复边界。</w:t>
       </w:r>
     </w:p>
@@ -5101,7 +6825,21 @@
         </w:rPr>
       </w:pPr>
       <w:r>
-        <w:t>工程上，本项目的 Simulation、Interpreter、Rogue orchestration 和 UI 分层明确，几乎所有核心改动都有 Vitest 回归，最后通过 git checkpoint 与真实 Chrome E2E 降低修改风险。不足包括关卡数量仍有限、Prepared Firmware 目前较依赖预设策略、敌人 AI 行为简单、地图仍为导演式而非程序化生成，以及新手教学仍有优化空间。</w:t>
+        <w:t xml:space="preserve">工程上，本项目的 Simulation、Interpreter、Rogue orchestration 和 UI 分层明确，几乎所有核心改动都有 Vitest 回归，最后通过 git checkpoint 与真实 Chrome E2E </w:t>
+      </w:r>
+      <w:proofErr w:type="spellStart"/>
+      <w:r>
+        <w:t>降低修改风险</w:t>
+      </w:r>
+      <w:proofErr w:type="spellEnd"/>
+      <w:r>
+        <w:t>。</w:t>
+      </w:r>
+      <w:r>
+        <w:rPr>
+          <w:lang w:eastAsia="zh-CN"/>
+        </w:rPr>
+        <w:t>不足包括关卡数量仍有限、Prepared Firmware 目前较依赖预设策略、敌人 AI 行为简单、地图仍为导演式而非程序化生成，以及新手教学仍有优化空间。</w:t>
       </w:r>
     </w:p>
     <w:p>
@@ -5112,7 +6850,10 @@
         </w:rPr>
       </w:pPr>
       <w:r>
-        <w:t>8.2 未来改进方向</w:t>
+        <w:t xml:space="preserve">8.2 </w:t>
+      </w:r>
+      <w:r>
+        <w:t>未来改进方向</w:t>
       </w:r>
     </w:p>
     <w:p>
@@ -5121,14 +6862,19 @@
           <w:lang w:eastAsia="zh-CN"/>
         </w:rPr>
       </w:pPr>
-      <w:r/>
     </w:p>
     <w:p>
       <w:pPr>
         <w:pStyle w:val="a0"/>
         <w:spacing w:before="60" w:after="60"/>
+        <w:rPr>
+          <w:lang w:eastAsia="zh-CN"/>
+        </w:rPr>
       </w:pPr>
       <w:r>
+        <w:rPr>
+          <w:lang w:eastAsia="zh-CN"/>
+        </w:rPr>
         <w:t>增加更多敌人组合与半程序化地图，减少固定路线带来的熟悉感。</w:t>
       </w:r>
     </w:p>
@@ -5141,6 +6887,9 @@
         </w:rPr>
       </w:pPr>
       <w:r>
+        <w:rPr>
+          <w:lang w:eastAsia="zh-CN"/>
+        </w:rPr>
         <w:t>引入代码评分与策略分析，为 Debugger 玩法提供更多可比较的反馈。</w:t>
       </w:r>
     </w:p>
@@ -5155,9 +6904,29 @@
     <w:p>
       <w:pPr>
         <w:pStyle w:val="a0"/>
+        <w:rPr>
+          <w:lang w:eastAsia="zh-CN"/>
+        </w:rPr>
       </w:pPr>
       <w:r>
-        <w:t>完善新手教学与错误提示，降低首次进入 RoboC++ 的认知负担</w:t>
+        <w:rPr>
+          <w:lang w:eastAsia="zh-CN"/>
+        </w:rPr>
+        <w:t xml:space="preserve">完善新手教学与错误提示，降低首次进入 </w:t>
+      </w:r>
+      <w:proofErr w:type="spellStart"/>
+      <w:r>
+        <w:rPr>
+          <w:lang w:eastAsia="zh-CN"/>
+        </w:rPr>
+        <w:t>RoboC</w:t>
+      </w:r>
+      <w:proofErr w:type="spellEnd"/>
+      <w:r>
+        <w:rPr>
+          <w:lang w:eastAsia="zh-CN"/>
+        </w:rPr>
+        <w:t>++ 的认知负担</w:t>
       </w:r>
     </w:p>
     <w:sectPr>

</xml_diff>